<commit_message>
feat(EX-15): saisies avancées dans l'IHM : réglages de simulation, frottement, pas d'hélicoïdale, couplages et rendement (lot 14)
- étape Simulation et menu : durée, nombre de pas, période d'écriture (EX-40)
- panneau de liaison : frottement de Coulomb f, r, v_ε (EX-15) ; pas de l'hélicoïdale (EX-10)
- rubrique Couplages : engrenage, pignon-crémaillère, vis-écrou, rendement η (EX-14, EX-16)
- Engrenage : dents z1, z2 optionnelles ; Liaison : regler_frottement, definir_pas
- guide : § 5.1, 5.3, 5.8, chapitre 11, annexe B ; dette du lot 13 (couleur des erreurs)

Co-Authored-By: Claude Opus 5.5 <noreply@anthropic.com>
</commit_message>
<xml_diff>
--- a/docs/guide/Meca3D_Guide_utilisateur.docx
+++ b/docs/guide/Meca3D_Guide_utilisateur.docx
@@ -48,7 +48,7 @@
                 <w:noProof/>
               </w:rPr>
               <w:drawing>
-                <wp:inline distT="0" distB="0" distL="0" distR="0" wp14:anchorId="33F8C371" wp14:editId="696EA548">
+                <wp:inline distT="0" distB="0" distL="0" distR="0" wp14:anchorId="57FD72AC" wp14:editId="31251ACF">
                   <wp:extent cx="3240000" cy="925714"/>
                   <wp:effectExtent l="0" t="0" r="0" b="0"/>
                   <wp:docPr id="1" name="Picture 1"/>
@@ -200,7 +200,7 @@
       <w:pPr>
         <w:pStyle w:val="Titre1"/>
       </w:pPr>
-      <w:bookmarkStart w:id="0" w:name="_Toc243969219"/>
+      <w:bookmarkStart w:id="0" w:name="_Toc243989702"/>
       <w:r>
         <w:t>Table des matières</w:t>
       </w:r>
@@ -225,7 +225,7 @@
       <w:r>
         <w:fldChar w:fldCharType="separate"/>
       </w:r>
-      <w:hyperlink w:anchor="_Toc243969219" w:history="1">
+      <w:hyperlink w:anchor="_Toc243989702" w:history="1">
         <w:r>
           <w:rPr>
             <w:rStyle w:val="Lienhypertexte"/>
@@ -252,7 +252,7 @@
             <w:noProof/>
             <w:webHidden/>
           </w:rPr>
-          <w:instrText xml:space="preserve"> PAGEREF _Toc243969219 \h </w:instrText>
+          <w:instrText xml:space="preserve"> PAGEREF _Toc243989702 \h </w:instrText>
         </w:r>
         <w:r>
           <w:rPr>
@@ -293,7 +293,7 @@
           <w:noProof/>
         </w:rPr>
       </w:pPr>
-      <w:hyperlink w:anchor="_Toc243969220" w:history="1">
+      <w:hyperlink w:anchor="_Toc243989703" w:history="1">
         <w:r>
           <w:rPr>
             <w:rStyle w:val="Lienhypertexte"/>
@@ -320,7 +320,7 @@
             <w:noProof/>
             <w:webHidden/>
           </w:rPr>
-          <w:instrText xml:space="preserve"> PAGEREF _Toc243969220 \h </w:instrText>
+          <w:instrText xml:space="preserve"> PAGEREF _Toc243989703 \h </w:instrText>
         </w:r>
         <w:r>
           <w:rPr>
@@ -361,7 +361,7 @@
           <w:noProof/>
         </w:rPr>
       </w:pPr>
-      <w:hyperlink w:anchor="_Toc243969221" w:history="1">
+      <w:hyperlink w:anchor="_Toc243989704" w:history="1">
         <w:r>
           <w:rPr>
             <w:rStyle w:val="Lienhypertexte"/>
@@ -388,7 +388,7 @@
             <w:noProof/>
             <w:webHidden/>
           </w:rPr>
-          <w:instrText xml:space="preserve"> PAGEREF _Toc243969221 \h </w:instrText>
+          <w:instrText xml:space="preserve"> PAGEREF _Toc243989704 \h </w:instrText>
         </w:r>
         <w:r>
           <w:rPr>
@@ -429,7 +429,7 @@
           <w:noProof/>
         </w:rPr>
       </w:pPr>
-      <w:hyperlink w:anchor="_Toc243969222" w:history="1">
+      <w:hyperlink w:anchor="_Toc243989705" w:history="1">
         <w:r>
           <w:rPr>
             <w:rStyle w:val="Lienhypertexte"/>
@@ -456,7 +456,7 @@
             <w:noProof/>
             <w:webHidden/>
           </w:rPr>
-          <w:instrText xml:space="preserve"> PAGEREF _Toc243969222 \h </w:instrText>
+          <w:instrText xml:space="preserve"> PAGEREF _Toc243989705 \h </w:instrText>
         </w:r>
         <w:r>
           <w:rPr>
@@ -497,7 +497,7 @@
           <w:noProof/>
         </w:rPr>
       </w:pPr>
-      <w:hyperlink w:anchor="_Toc243969223" w:history="1">
+      <w:hyperlink w:anchor="_Toc243989706" w:history="1">
         <w:r>
           <w:rPr>
             <w:rStyle w:val="Lienhypertexte"/>
@@ -524,7 +524,7 @@
             <w:noProof/>
             <w:webHidden/>
           </w:rPr>
-          <w:instrText xml:space="preserve"> PAGEREF _Toc243969223 \h </w:instrText>
+          <w:instrText xml:space="preserve"> PAGEREF _Toc243989706 \h </w:instrText>
         </w:r>
         <w:r>
           <w:rPr>
@@ -565,7 +565,7 @@
           <w:noProof/>
         </w:rPr>
       </w:pPr>
-      <w:hyperlink w:anchor="_Toc243969224" w:history="1">
+      <w:hyperlink w:anchor="_Toc243989707" w:history="1">
         <w:r>
           <w:rPr>
             <w:rStyle w:val="Lienhypertexte"/>
@@ -592,7 +592,7 @@
             <w:noProof/>
             <w:webHidden/>
           </w:rPr>
-          <w:instrText xml:space="preserve"> PAGEREF _Toc243969224 \h </w:instrText>
+          <w:instrText xml:space="preserve"> PAGEREF _Toc243989707 \h </w:instrText>
         </w:r>
         <w:r>
           <w:rPr>
@@ -633,7 +633,7 @@
           <w:noProof/>
         </w:rPr>
       </w:pPr>
-      <w:hyperlink w:anchor="_Toc243969225" w:history="1">
+      <w:hyperlink w:anchor="_Toc243989708" w:history="1">
         <w:r>
           <w:rPr>
             <w:rStyle w:val="Lienhypertexte"/>
@@ -660,7 +660,7 @@
             <w:noProof/>
             <w:webHidden/>
           </w:rPr>
-          <w:instrText xml:space="preserve"> PAGEREF _Toc243969225 \h </w:instrText>
+          <w:instrText xml:space="preserve"> PAGEREF _Toc243989708 \h </w:instrText>
         </w:r>
         <w:r>
           <w:rPr>
@@ -701,7 +701,7 @@
           <w:noProof/>
         </w:rPr>
       </w:pPr>
-      <w:hyperlink w:anchor="_Toc243969226" w:history="1">
+      <w:hyperlink w:anchor="_Toc243989709" w:history="1">
         <w:r>
           <w:rPr>
             <w:rStyle w:val="Lienhypertexte"/>
@@ -728,7 +728,7 @@
             <w:noProof/>
             <w:webHidden/>
           </w:rPr>
-          <w:instrText xml:space="preserve"> PAGEREF _Toc243969226 \h </w:instrText>
+          <w:instrText xml:space="preserve"> PAGEREF _Toc243989709 \h </w:instrText>
         </w:r>
         <w:r>
           <w:rPr>
@@ -769,7 +769,7 @@
           <w:noProof/>
         </w:rPr>
       </w:pPr>
-      <w:hyperlink w:anchor="_Toc243969227" w:history="1">
+      <w:hyperlink w:anchor="_Toc243989710" w:history="1">
         <w:r>
           <w:rPr>
             <w:rStyle w:val="Lienhypertexte"/>
@@ -796,7 +796,7 @@
             <w:noProof/>
             <w:webHidden/>
           </w:rPr>
-          <w:instrText xml:space="preserve"> PAGEREF _Toc243969227 \h </w:instrText>
+          <w:instrText xml:space="preserve"> PAGEREF _Toc243989710 \h </w:instrText>
         </w:r>
         <w:r>
           <w:rPr>
@@ -837,7 +837,7 @@
           <w:noProof/>
         </w:rPr>
       </w:pPr>
-      <w:hyperlink w:anchor="_Toc243969228" w:history="1">
+      <w:hyperlink w:anchor="_Toc243989711" w:history="1">
         <w:r>
           <w:rPr>
             <w:rStyle w:val="Lienhypertexte"/>
@@ -864,7 +864,7 @@
             <w:noProof/>
             <w:webHidden/>
           </w:rPr>
-          <w:instrText xml:space="preserve"> PAGEREF _Toc243969228 \h </w:instrText>
+          <w:instrText xml:space="preserve"> PAGEREF _Toc243989711 \h </w:instrText>
         </w:r>
         <w:r>
           <w:rPr>
@@ -905,7 +905,7 @@
           <w:noProof/>
         </w:rPr>
       </w:pPr>
-      <w:hyperlink w:anchor="_Toc243969229" w:history="1">
+      <w:hyperlink w:anchor="_Toc243989712" w:history="1">
         <w:r>
           <w:rPr>
             <w:rStyle w:val="Lienhypertexte"/>
@@ -932,7 +932,7 @@
             <w:noProof/>
             <w:webHidden/>
           </w:rPr>
-          <w:instrText xml:space="preserve"> PAGEREF _Toc243969229 \h </w:instrText>
+          <w:instrText xml:space="preserve"> PAGEREF _Toc243989712 \h </w:instrText>
         </w:r>
         <w:r>
           <w:rPr>
@@ -973,7 +973,7 @@
           <w:noProof/>
         </w:rPr>
       </w:pPr>
-      <w:hyperlink w:anchor="_Toc243969230" w:history="1">
+      <w:hyperlink w:anchor="_Toc243989713" w:history="1">
         <w:r>
           <w:rPr>
             <w:rStyle w:val="Lienhypertexte"/>
@@ -1000,7 +1000,7 @@
             <w:noProof/>
             <w:webHidden/>
           </w:rPr>
-          <w:instrText xml:space="preserve"> PAGEREF _Toc243969230 \h </w:instrText>
+          <w:instrText xml:space="preserve"> PAGEREF _Toc243989713 \h </w:instrText>
         </w:r>
         <w:r>
           <w:rPr>
@@ -1041,7 +1041,7 @@
           <w:noProof/>
         </w:rPr>
       </w:pPr>
-      <w:hyperlink w:anchor="_Toc243969231" w:history="1">
+      <w:hyperlink w:anchor="_Toc243989714" w:history="1">
         <w:r>
           <w:rPr>
             <w:rStyle w:val="Lienhypertexte"/>
@@ -1068,7 +1068,7 @@
             <w:noProof/>
             <w:webHidden/>
           </w:rPr>
-          <w:instrText xml:space="preserve"> PAGEREF _Toc243969231 \h </w:instrText>
+          <w:instrText xml:space="preserve"> PAGEREF _Toc243989714 \h </w:instrText>
         </w:r>
         <w:r>
           <w:rPr>
@@ -1109,7 +1109,7 @@
           <w:noProof/>
         </w:rPr>
       </w:pPr>
-      <w:hyperlink w:anchor="_Toc243969232" w:history="1">
+      <w:hyperlink w:anchor="_Toc243989715" w:history="1">
         <w:r>
           <w:rPr>
             <w:rStyle w:val="Lienhypertexte"/>
@@ -1136,7 +1136,7 @@
             <w:noProof/>
             <w:webHidden/>
           </w:rPr>
-          <w:instrText xml:space="preserve"> PAGEREF _Toc243969232 \h </w:instrText>
+          <w:instrText xml:space="preserve"> PAGEREF _Toc243989715 \h </w:instrText>
         </w:r>
         <w:r>
           <w:rPr>
@@ -1177,7 +1177,7 @@
           <w:noProof/>
         </w:rPr>
       </w:pPr>
-      <w:hyperlink w:anchor="_Toc243969233" w:history="1">
+      <w:hyperlink w:anchor="_Toc243989716" w:history="1">
         <w:r>
           <w:rPr>
             <w:rStyle w:val="Lienhypertexte"/>
@@ -1204,7 +1204,7 @@
             <w:noProof/>
             <w:webHidden/>
           </w:rPr>
-          <w:instrText xml:space="preserve"> PAGEREF _Toc243969233 \h </w:instrText>
+          <w:instrText xml:space="preserve"> PAGEREF _Toc243989716 \h </w:instrText>
         </w:r>
         <w:r>
           <w:rPr>
@@ -1245,7 +1245,7 @@
           <w:noProof/>
         </w:rPr>
       </w:pPr>
-      <w:hyperlink w:anchor="_Toc243969234" w:history="1">
+      <w:hyperlink w:anchor="_Toc243989717" w:history="1">
         <w:r>
           <w:rPr>
             <w:rStyle w:val="Lienhypertexte"/>
@@ -1272,7 +1272,7 @@
             <w:noProof/>
             <w:webHidden/>
           </w:rPr>
-          <w:instrText xml:space="preserve"> PAGEREF _Toc243969234 \h </w:instrText>
+          <w:instrText xml:space="preserve"> PAGEREF _Toc243989717 \h </w:instrText>
         </w:r>
         <w:r>
           <w:rPr>
@@ -1313,7 +1313,7 @@
           <w:noProof/>
         </w:rPr>
       </w:pPr>
-      <w:hyperlink w:anchor="_Toc243969235" w:history="1">
+      <w:hyperlink w:anchor="_Toc243989718" w:history="1">
         <w:r>
           <w:rPr>
             <w:rStyle w:val="Lienhypertexte"/>
@@ -1340,7 +1340,7 @@
             <w:noProof/>
             <w:webHidden/>
           </w:rPr>
-          <w:instrText xml:space="preserve"> PAGEREF _Toc243969235 \h </w:instrText>
+          <w:instrText xml:space="preserve"> PAGEREF _Toc243989718 \h </w:instrText>
         </w:r>
         <w:r>
           <w:rPr>
@@ -1381,7 +1381,7 @@
           <w:noProof/>
         </w:rPr>
       </w:pPr>
-      <w:hyperlink w:anchor="_Toc243969236" w:history="1">
+      <w:hyperlink w:anchor="_Toc243989719" w:history="1">
         <w:r>
           <w:rPr>
             <w:rStyle w:val="Lienhypertexte"/>
@@ -1408,7 +1408,7 @@
             <w:noProof/>
             <w:webHidden/>
           </w:rPr>
-          <w:instrText xml:space="preserve"> PAGEREF _Toc243969236 \h </w:instrText>
+          <w:instrText xml:space="preserve"> PAGEREF _Toc243989719 \h </w:instrText>
         </w:r>
         <w:r>
           <w:rPr>
@@ -1449,7 +1449,7 @@
           <w:noProof/>
         </w:rPr>
       </w:pPr>
-      <w:hyperlink w:anchor="_Toc243969237" w:history="1">
+      <w:hyperlink w:anchor="_Toc243989720" w:history="1">
         <w:r>
           <w:rPr>
             <w:rStyle w:val="Lienhypertexte"/>
@@ -1476,7 +1476,7 @@
             <w:noProof/>
             <w:webHidden/>
           </w:rPr>
-          <w:instrText xml:space="preserve"> PAGEREF _Toc243969237 \h </w:instrText>
+          <w:instrText xml:space="preserve"> PAGEREF _Toc243989720 \h </w:instrText>
         </w:r>
         <w:r>
           <w:rPr>
@@ -1517,7 +1517,7 @@
           <w:noProof/>
         </w:rPr>
       </w:pPr>
-      <w:hyperlink w:anchor="_Toc243969238" w:history="1">
+      <w:hyperlink w:anchor="_Toc243989721" w:history="1">
         <w:r>
           <w:rPr>
             <w:rStyle w:val="Lienhypertexte"/>
@@ -1544,7 +1544,7 @@
             <w:noProof/>
             <w:webHidden/>
           </w:rPr>
-          <w:instrText xml:space="preserve"> PAGEREF _Toc243969238 \h </w:instrText>
+          <w:instrText xml:space="preserve"> PAGEREF _Toc243989721 \h </w:instrText>
         </w:r>
         <w:r>
           <w:rPr>
@@ -1585,7 +1585,7 @@
           <w:noProof/>
         </w:rPr>
       </w:pPr>
-      <w:hyperlink w:anchor="_Toc243969239" w:history="1">
+      <w:hyperlink w:anchor="_Toc243989722" w:history="1">
         <w:r>
           <w:rPr>
             <w:rStyle w:val="Lienhypertexte"/>
@@ -1612,7 +1612,7 @@
             <w:noProof/>
             <w:webHidden/>
           </w:rPr>
-          <w:instrText xml:space="preserve"> PAGEREF _Toc243969239 \h </w:instrText>
+          <w:instrText xml:space="preserve"> PAGEREF _Toc243989722 \h </w:instrText>
         </w:r>
         <w:r>
           <w:rPr>
@@ -1653,7 +1653,7 @@
           <w:noProof/>
         </w:rPr>
       </w:pPr>
-      <w:hyperlink w:anchor="_Toc243969240" w:history="1">
+      <w:hyperlink w:anchor="_Toc243989723" w:history="1">
         <w:r>
           <w:rPr>
             <w:rStyle w:val="Lienhypertexte"/>
@@ -1680,7 +1680,7 @@
             <w:noProof/>
             <w:webHidden/>
           </w:rPr>
-          <w:instrText xml:space="preserve"> PAGEREF _Toc243969240 \h </w:instrText>
+          <w:instrText xml:space="preserve"> PAGEREF _Toc243989723 \h </w:instrText>
         </w:r>
         <w:r>
           <w:rPr>
@@ -1721,7 +1721,7 @@
           <w:noProof/>
         </w:rPr>
       </w:pPr>
-      <w:hyperlink w:anchor="_Toc243969241" w:history="1">
+      <w:hyperlink w:anchor="_Toc243989724" w:history="1">
         <w:r>
           <w:rPr>
             <w:rStyle w:val="Lienhypertexte"/>
@@ -1748,7 +1748,7 @@
             <w:noProof/>
             <w:webHidden/>
           </w:rPr>
-          <w:instrText xml:space="preserve"> PAGEREF _Toc243969241 \h </w:instrText>
+          <w:instrText xml:space="preserve"> PAGEREF _Toc243989724 \h </w:instrText>
         </w:r>
         <w:r>
           <w:rPr>
@@ -1768,7 +1768,7 @@
             <w:noProof/>
             <w:webHidden/>
           </w:rPr>
-          <w:t>15</w:t>
+          <w:t>16</w:t>
         </w:r>
         <w:r>
           <w:rPr>
@@ -1789,7 +1789,7 @@
           <w:noProof/>
         </w:rPr>
       </w:pPr>
-      <w:hyperlink w:anchor="_Toc243969242" w:history="1">
+      <w:hyperlink w:anchor="_Toc243989725" w:history="1">
         <w:r>
           <w:rPr>
             <w:rStyle w:val="Lienhypertexte"/>
@@ -1816,7 +1816,7 @@
             <w:noProof/>
             <w:webHidden/>
           </w:rPr>
-          <w:instrText xml:space="preserve"> PAGEREF _Toc243969242 \h </w:instrText>
+          <w:instrText xml:space="preserve"> PAGEREF _Toc243989725 \h </w:instrText>
         </w:r>
         <w:r>
           <w:rPr>
@@ -1857,7 +1857,7 @@
           <w:noProof/>
         </w:rPr>
       </w:pPr>
-      <w:hyperlink w:anchor="_Toc243969243" w:history="1">
+      <w:hyperlink w:anchor="_Toc243989726" w:history="1">
         <w:r>
           <w:rPr>
             <w:rStyle w:val="Lienhypertexte"/>
@@ -1884,7 +1884,7 @@
             <w:noProof/>
             <w:webHidden/>
           </w:rPr>
-          <w:instrText xml:space="preserve"> PAGEREF _Toc243969243 \h </w:instrText>
+          <w:instrText xml:space="preserve"> PAGEREF _Toc243989726 \h </w:instrText>
         </w:r>
         <w:r>
           <w:rPr>
@@ -1925,7 +1925,7 @@
           <w:noProof/>
         </w:rPr>
       </w:pPr>
-      <w:hyperlink w:anchor="_Toc243969244" w:history="1">
+      <w:hyperlink w:anchor="_Toc243989727" w:history="1">
         <w:r>
           <w:rPr>
             <w:rStyle w:val="Lienhypertexte"/>
@@ -1952,7 +1952,7 @@
             <w:noProof/>
             <w:webHidden/>
           </w:rPr>
-          <w:instrText xml:space="preserve"> PAGEREF _Toc243969244 \h </w:instrText>
+          <w:instrText xml:space="preserve"> PAGEREF _Toc243989727 \h </w:instrText>
         </w:r>
         <w:r>
           <w:rPr>
@@ -1993,7 +1993,7 @@
           <w:noProof/>
         </w:rPr>
       </w:pPr>
-      <w:hyperlink w:anchor="_Toc243969245" w:history="1">
+      <w:hyperlink w:anchor="_Toc243989728" w:history="1">
         <w:r>
           <w:rPr>
             <w:rStyle w:val="Lienhypertexte"/>
@@ -2020,7 +2020,7 @@
             <w:noProof/>
             <w:webHidden/>
           </w:rPr>
-          <w:instrText xml:space="preserve"> PAGEREF _Toc243969245 \h </w:instrText>
+          <w:instrText xml:space="preserve"> PAGEREF _Toc243989728 \h </w:instrText>
         </w:r>
         <w:r>
           <w:rPr>
@@ -2061,7 +2061,7 @@
           <w:noProof/>
         </w:rPr>
       </w:pPr>
-      <w:hyperlink w:anchor="_Toc243969246" w:history="1">
+      <w:hyperlink w:anchor="_Toc243989729" w:history="1">
         <w:r>
           <w:rPr>
             <w:rStyle w:val="Lienhypertexte"/>
@@ -2088,7 +2088,7 @@
             <w:noProof/>
             <w:webHidden/>
           </w:rPr>
-          <w:instrText xml:space="preserve"> PAGEREF _Toc243969246 \h </w:instrText>
+          <w:instrText xml:space="preserve"> PAGEREF _Toc243989729 \h </w:instrText>
         </w:r>
         <w:r>
           <w:rPr>
@@ -2129,7 +2129,7 @@
           <w:noProof/>
         </w:rPr>
       </w:pPr>
-      <w:hyperlink w:anchor="_Toc243969247" w:history="1">
+      <w:hyperlink w:anchor="_Toc243989730" w:history="1">
         <w:r>
           <w:rPr>
             <w:rStyle w:val="Lienhypertexte"/>
@@ -2156,7 +2156,7 @@
             <w:noProof/>
             <w:webHidden/>
           </w:rPr>
-          <w:instrText xml:space="preserve"> PAGEREF _Toc243969247 \h </w:instrText>
+          <w:instrText xml:space="preserve"> PAGEREF _Toc243989730 \h </w:instrText>
         </w:r>
         <w:r>
           <w:rPr>
@@ -2197,7 +2197,7 @@
           <w:noProof/>
         </w:rPr>
       </w:pPr>
-      <w:hyperlink w:anchor="_Toc243969248" w:history="1">
+      <w:hyperlink w:anchor="_Toc243989731" w:history="1">
         <w:r>
           <w:rPr>
             <w:rStyle w:val="Lienhypertexte"/>
@@ -2224,7 +2224,7 @@
             <w:noProof/>
             <w:webHidden/>
           </w:rPr>
-          <w:instrText xml:space="preserve"> PAGEREF _Toc243969248 \h </w:instrText>
+          <w:instrText xml:space="preserve"> PAGEREF _Toc243989731 \h </w:instrText>
         </w:r>
         <w:r>
           <w:rPr>
@@ -2265,7 +2265,7 @@
           <w:noProof/>
         </w:rPr>
       </w:pPr>
-      <w:hyperlink w:anchor="_Toc243969249" w:history="1">
+      <w:hyperlink w:anchor="_Toc243989732" w:history="1">
         <w:r>
           <w:rPr>
             <w:rStyle w:val="Lienhypertexte"/>
@@ -2292,7 +2292,7 @@
             <w:noProof/>
             <w:webHidden/>
           </w:rPr>
-          <w:instrText xml:space="preserve"> PAGEREF _Toc243969249 \h </w:instrText>
+          <w:instrText xml:space="preserve"> PAGEREF _Toc243989732 \h </w:instrText>
         </w:r>
         <w:r>
           <w:rPr>
@@ -2333,7 +2333,7 @@
           <w:noProof/>
         </w:rPr>
       </w:pPr>
-      <w:hyperlink w:anchor="_Toc243969250" w:history="1">
+      <w:hyperlink w:anchor="_Toc243989733" w:history="1">
         <w:r>
           <w:rPr>
             <w:rStyle w:val="Lienhypertexte"/>
@@ -2360,7 +2360,7 @@
             <w:noProof/>
             <w:webHidden/>
           </w:rPr>
-          <w:instrText xml:space="preserve"> PAGEREF _Toc243969250 \h </w:instrText>
+          <w:instrText xml:space="preserve"> PAGEREF _Toc243989733 \h </w:instrText>
         </w:r>
         <w:r>
           <w:rPr>
@@ -2401,7 +2401,7 @@
           <w:noProof/>
         </w:rPr>
       </w:pPr>
-      <w:hyperlink w:anchor="_Toc243969251" w:history="1">
+      <w:hyperlink w:anchor="_Toc243989734" w:history="1">
         <w:r>
           <w:rPr>
             <w:rStyle w:val="Lienhypertexte"/>
@@ -2428,7 +2428,7 @@
             <w:noProof/>
             <w:webHidden/>
           </w:rPr>
-          <w:instrText xml:space="preserve"> PAGEREF _Toc243969251 \h </w:instrText>
+          <w:instrText xml:space="preserve"> PAGEREF _Toc243989734 \h </w:instrText>
         </w:r>
         <w:r>
           <w:rPr>
@@ -2469,7 +2469,7 @@
           <w:noProof/>
         </w:rPr>
       </w:pPr>
-      <w:hyperlink w:anchor="_Toc243969252" w:history="1">
+      <w:hyperlink w:anchor="_Toc243989735" w:history="1">
         <w:r>
           <w:rPr>
             <w:rStyle w:val="Lienhypertexte"/>
@@ -2496,7 +2496,7 @@
             <w:noProof/>
             <w:webHidden/>
           </w:rPr>
-          <w:instrText xml:space="preserve"> PAGEREF _Toc243969252 \h </w:instrText>
+          <w:instrText xml:space="preserve"> PAGEREF _Toc243989735 \h </w:instrText>
         </w:r>
         <w:r>
           <w:rPr>
@@ -2537,7 +2537,7 @@
           <w:noProof/>
         </w:rPr>
       </w:pPr>
-      <w:hyperlink w:anchor="_Toc243969253" w:history="1">
+      <w:hyperlink w:anchor="_Toc243989736" w:history="1">
         <w:r>
           <w:rPr>
             <w:rStyle w:val="Lienhypertexte"/>
@@ -2564,7 +2564,7 @@
             <w:noProof/>
             <w:webHidden/>
           </w:rPr>
-          <w:instrText xml:space="preserve"> PAGEREF _Toc243969253 \h </w:instrText>
+          <w:instrText xml:space="preserve"> PAGEREF _Toc243989736 \h </w:instrText>
         </w:r>
         <w:r>
           <w:rPr>
@@ -2605,7 +2605,7 @@
           <w:noProof/>
         </w:rPr>
       </w:pPr>
-      <w:hyperlink w:anchor="_Toc243969254" w:history="1">
+      <w:hyperlink w:anchor="_Toc243989737" w:history="1">
         <w:r>
           <w:rPr>
             <w:rStyle w:val="Lienhypertexte"/>
@@ -2632,7 +2632,7 @@
             <w:noProof/>
             <w:webHidden/>
           </w:rPr>
-          <w:instrText xml:space="preserve"> PAGEREF _Toc243969254 \h </w:instrText>
+          <w:instrText xml:space="preserve"> PAGEREF _Toc243989737 \h </w:instrText>
         </w:r>
         <w:r>
           <w:rPr>
@@ -2673,7 +2673,7 @@
           <w:noProof/>
         </w:rPr>
       </w:pPr>
-      <w:hyperlink w:anchor="_Toc243969255" w:history="1">
+      <w:hyperlink w:anchor="_Toc243989738" w:history="1">
         <w:r>
           <w:rPr>
             <w:rStyle w:val="Lienhypertexte"/>
@@ -2700,7 +2700,7 @@
             <w:noProof/>
             <w:webHidden/>
           </w:rPr>
-          <w:instrText xml:space="preserve"> PAGEREF _Toc243969255 \h </w:instrText>
+          <w:instrText xml:space="preserve"> PAGEREF _Toc243989738 \h </w:instrText>
         </w:r>
         <w:r>
           <w:rPr>
@@ -2741,7 +2741,7 @@
           <w:noProof/>
         </w:rPr>
       </w:pPr>
-      <w:hyperlink w:anchor="_Toc243969256" w:history="1">
+      <w:hyperlink w:anchor="_Toc243989739" w:history="1">
         <w:r>
           <w:rPr>
             <w:rStyle w:val="Lienhypertexte"/>
@@ -2768,7 +2768,7 @@
             <w:noProof/>
             <w:webHidden/>
           </w:rPr>
-          <w:instrText xml:space="preserve"> PAGEREF _Toc243969256 \h </w:instrText>
+          <w:instrText xml:space="preserve"> PAGEREF _Toc243989739 \h </w:instrText>
         </w:r>
         <w:r>
           <w:rPr>
@@ -2809,7 +2809,7 @@
           <w:noProof/>
         </w:rPr>
       </w:pPr>
-      <w:hyperlink w:anchor="_Toc243969257" w:history="1">
+      <w:hyperlink w:anchor="_Toc243989740" w:history="1">
         <w:r>
           <w:rPr>
             <w:rStyle w:val="Lienhypertexte"/>
@@ -2836,7 +2836,7 @@
             <w:noProof/>
             <w:webHidden/>
           </w:rPr>
-          <w:instrText xml:space="preserve"> PAGEREF _Toc243969257 \h </w:instrText>
+          <w:instrText xml:space="preserve"> PAGEREF _Toc243989740 \h </w:instrText>
         </w:r>
         <w:r>
           <w:rPr>
@@ -2877,13 +2877,13 @@
           <w:noProof/>
         </w:rPr>
       </w:pPr>
-      <w:hyperlink w:anchor="_Toc243969258" w:history="1">
+      <w:hyperlink w:anchor="_Toc243989741" w:history="1">
         <w:r>
           <w:rPr>
             <w:rStyle w:val="Lienhypertexte"/>
             <w:noProof/>
           </w:rPr>
-          <w:t>Réglages non encore exposés dans l'interface</w:t>
+          <w:t>Réglages</w:t>
         </w:r>
         <w:r>
           <w:rPr>
@@ -2904,7 +2904,7 @@
             <w:noProof/>
             <w:webHidden/>
           </w:rPr>
-          <w:instrText xml:space="preserve"> PAGEREF _Toc243969258 \h </w:instrText>
+          <w:instrText xml:space="preserve"> PAGEREF _Toc243989741 \h </w:instrText>
         </w:r>
         <w:r>
           <w:rPr>
@@ -2945,7 +2945,7 @@
           <w:noProof/>
         </w:rPr>
       </w:pPr>
-      <w:hyperlink w:anchor="_Toc243969259" w:history="1">
+      <w:hyperlink w:anchor="_Toc243989742" w:history="1">
         <w:r>
           <w:rPr>
             <w:rStyle w:val="Lienhypertexte"/>
@@ -2972,7 +2972,7 @@
             <w:noProof/>
             <w:webHidden/>
           </w:rPr>
-          <w:instrText xml:space="preserve"> PAGEREF _Toc243969259 \h </w:instrText>
+          <w:instrText xml:space="preserve"> PAGEREF _Toc243989742 \h </w:instrText>
         </w:r>
         <w:r>
           <w:rPr>
@@ -3013,7 +3013,7 @@
           <w:noProof/>
         </w:rPr>
       </w:pPr>
-      <w:hyperlink w:anchor="_Toc243969260" w:history="1">
+      <w:hyperlink w:anchor="_Toc243989743" w:history="1">
         <w:r>
           <w:rPr>
             <w:rStyle w:val="Lienhypertexte"/>
@@ -3040,7 +3040,7 @@
             <w:noProof/>
             <w:webHidden/>
           </w:rPr>
-          <w:instrText xml:space="preserve"> PAGEREF _Toc243969260 \h </w:instrText>
+          <w:instrText xml:space="preserve"> PAGEREF _Toc243989743 \h </w:instrText>
         </w:r>
         <w:r>
           <w:rPr>
@@ -3081,7 +3081,7 @@
           <w:noProof/>
         </w:rPr>
       </w:pPr>
-      <w:hyperlink w:anchor="_Toc243969261" w:history="1">
+      <w:hyperlink w:anchor="_Toc243989744" w:history="1">
         <w:r>
           <w:rPr>
             <w:rStyle w:val="Lienhypertexte"/>
@@ -3108,7 +3108,7 @@
             <w:noProof/>
             <w:webHidden/>
           </w:rPr>
-          <w:instrText xml:space="preserve"> PAGEREF _Toc243969261 \h </w:instrText>
+          <w:instrText xml:space="preserve"> PAGEREF _Toc243989744 \h </w:instrText>
         </w:r>
         <w:r>
           <w:rPr>
@@ -3149,7 +3149,7 @@
           <w:noProof/>
         </w:rPr>
       </w:pPr>
-      <w:hyperlink w:anchor="_Toc243969262" w:history="1">
+      <w:hyperlink w:anchor="_Toc243989745" w:history="1">
         <w:r>
           <w:rPr>
             <w:rStyle w:val="Lienhypertexte"/>
@@ -3176,7 +3176,7 @@
             <w:noProof/>
             <w:webHidden/>
           </w:rPr>
-          <w:instrText xml:space="preserve"> PAGEREF _Toc243969262 \h </w:instrText>
+          <w:instrText xml:space="preserve"> PAGEREF _Toc243989745 \h </w:instrText>
         </w:r>
         <w:r>
           <w:rPr>
@@ -3196,7 +3196,7 @@
             <w:noProof/>
             <w:webHidden/>
           </w:rPr>
-          <w:t>29</w:t>
+          <w:t>30</w:t>
         </w:r>
         <w:r>
           <w:rPr>
@@ -3233,7 +3233,7 @@
       <w:pPr>
         <w:pStyle w:val="Titre1"/>
       </w:pPr>
-      <w:bookmarkStart w:id="1" w:name="_Toc243969220"/>
+      <w:bookmarkStart w:id="1" w:name="_Toc243989703"/>
       <w:r>
         <w:t>Présentation</w:t>
       </w:r>
@@ -3292,7 +3292,7 @@
       <w:pPr>
         <w:pStyle w:val="Titre2"/>
       </w:pPr>
-      <w:bookmarkStart w:id="2" w:name="_Toc243969221"/>
+      <w:bookmarkStart w:id="2" w:name="_Toc243989704"/>
       <w:r>
         <w:t>Chaîne de calcul</w:t>
       </w:r>
@@ -3702,7 +3702,7 @@
       <w:pPr>
         <w:pStyle w:val="Titre2"/>
       </w:pPr>
-      <w:bookmarkStart w:id="3" w:name="_Toc243969222"/>
+      <w:bookmarkStart w:id="3" w:name="_Toc243989705"/>
       <w:r>
         <w:t>Ce que Meca3D calcule</w:t>
       </w:r>
@@ -3862,7 +3862,7 @@
       <w:pPr>
         <w:pStyle w:val="Titre2"/>
       </w:pPr>
-      <w:bookmarkStart w:id="4" w:name="_Toc243969223"/>
+      <w:bookmarkStart w:id="4" w:name="_Toc243989706"/>
       <w:r>
         <w:t>Public et contexte d'usage</w:t>
       </w:r>
@@ -3976,7 +3976,7 @@
       <w:pPr>
         <w:pStyle w:val="Titre1"/>
       </w:pPr>
-      <w:bookmarkStart w:id="5" w:name="_Toc243969224"/>
+      <w:bookmarkStart w:id="5" w:name="_Toc243989707"/>
       <w:r>
         <w:t>Installation</w:t>
       </w:r>
@@ -3986,7 +3986,7 @@
       <w:pPr>
         <w:pStyle w:val="Titre2"/>
       </w:pPr>
-      <w:bookmarkStart w:id="6" w:name="_Toc243969225"/>
+      <w:bookmarkStart w:id="6" w:name="_Toc243989708"/>
       <w:r>
         <w:t>Prérequis</w:t>
       </w:r>
@@ -4251,7 +4251,7 @@
       <w:pPr>
         <w:pStyle w:val="Titre2"/>
       </w:pPr>
-      <w:bookmarkStart w:id="7" w:name="_Toc243969226"/>
+      <w:bookmarkStart w:id="7" w:name="_Toc243989709"/>
       <w:r>
         <w:t>Installer l'exécutable</w:t>
       </w:r>
@@ -4505,7 +4505,7 @@
       <w:pPr>
         <w:pStyle w:val="Titre2"/>
       </w:pPr>
-      <w:bookmarkStart w:id="8" w:name="_Toc243969227"/>
+      <w:bookmarkStart w:id="8" w:name="_Toc243989710"/>
       <w:r>
         <w:t>Préparer SolidCraft</w:t>
       </w:r>
@@ -4629,7 +4629,7 @@
       <w:pPr>
         <w:pStyle w:val="Titre2"/>
       </w:pPr>
-      <w:bookmarkStart w:id="9" w:name="_Toc243969228"/>
+      <w:bookmarkStart w:id="9" w:name="_Toc243989711"/>
       <w:r>
         <w:t>Installation depuis les sources (enseignants, développeurs)</w:t>
       </w:r>
@@ -4729,7 +4729,7 @@
           <w:noProof/>
         </w:rPr>
         <w:drawing>
-          <wp:inline distT="0" distB="0" distL="0" distR="0" wp14:anchorId="54C7B630" wp14:editId="0CA53305">
+          <wp:inline distT="0" distB="0" distL="0" distR="0" wp14:anchorId="7782475F" wp14:editId="5BF8EEFC">
             <wp:extent cx="5976000" cy="50800"/>
             <wp:effectExtent l="0" t="0" r="0" b="0"/>
             <wp:docPr id="2" name="Picture 2"/>
@@ -4785,7 +4785,7 @@
       <w:pPr>
         <w:pStyle w:val="Titre1"/>
       </w:pPr>
-      <w:bookmarkStart w:id="10" w:name="_Toc243969229"/>
+      <w:bookmarkStart w:id="10" w:name="_Toc243989712"/>
       <w:r>
         <w:t>Prise en main en cinq minutes</w:t>
       </w:r>
@@ -5122,7 +5122,7 @@
           <w:noProof/>
         </w:rPr>
         <w:drawing>
-          <wp:inline distT="0" distB="0" distL="0" distR="0" wp14:anchorId="38A309A7" wp14:editId="61B62668">
+          <wp:inline distT="0" distB="0" distL="0" distR="0" wp14:anchorId="77F533E7" wp14:editId="14D51683">
             <wp:extent cx="5976000" cy="3548250"/>
             <wp:effectExtent l="0" t="0" r="0" b="0"/>
             <wp:docPr id="3" name="Picture 3"/>
@@ -5182,7 +5182,7 @@
           <w:noProof/>
         </w:rPr>
         <w:drawing>
-          <wp:inline distT="0" distB="0" distL="0" distR="0" wp14:anchorId="23EC3C59" wp14:editId="38D3F0A2">
+          <wp:inline distT="0" distB="0" distL="0" distR="0" wp14:anchorId="4DCD6127" wp14:editId="5B14EC88">
             <wp:extent cx="5976000" cy="3548250"/>
             <wp:effectExtent l="0" t="0" r="0" b="0"/>
             <wp:docPr id="4" name="Picture 4"/>
@@ -5240,7 +5240,7 @@
           <w:noProof/>
         </w:rPr>
         <w:drawing>
-          <wp:inline distT="0" distB="0" distL="0" distR="0" wp14:anchorId="35C34993" wp14:editId="1FEA5443">
+          <wp:inline distT="0" distB="0" distL="0" distR="0" wp14:anchorId="4CC315AA" wp14:editId="7323090D">
             <wp:extent cx="5976000" cy="50800"/>
             <wp:effectExtent l="0" t="0" r="0" b="0"/>
             <wp:docPr id="5" name="Picture 5"/>
@@ -5296,7 +5296,7 @@
       <w:pPr>
         <w:pStyle w:val="Titre1"/>
       </w:pPr>
-      <w:bookmarkStart w:id="11" w:name="_Toc243969230"/>
+      <w:bookmarkStart w:id="11" w:name="_Toc243989713"/>
       <w:r>
         <w:t>L'interface</w:t>
       </w:r>
@@ -5644,7 +5644,7 @@
       <w:pPr>
         <w:pStyle w:val="Titre2"/>
       </w:pPr>
-      <w:bookmarkStart w:id="12" w:name="_Toc243969231"/>
+      <w:bookmarkStart w:id="12" w:name="_Toc243989714"/>
       <w:r>
         <w:t>L'arbre de l'étude</w:t>
       </w:r>
@@ -5949,7 +5949,7 @@
       <w:pPr>
         <w:pStyle w:val="Titre2"/>
       </w:pPr>
-      <w:bookmarkStart w:id="13" w:name="_Toc243969232"/>
+      <w:bookmarkStart w:id="13" w:name="_Toc243989715"/>
       <w:r>
         <w:t>Les menus</w:t>
       </w:r>
@@ -6199,7 +6199,7 @@
       <w:pPr>
         <w:pStyle w:val="Titre2"/>
       </w:pPr>
-      <w:bookmarkStart w:id="14" w:name="_Toc243969233"/>
+      <w:bookmarkStart w:id="14" w:name="_Toc243989716"/>
       <w:r>
         <w:t>Le journal</w:t>
       </w:r>
@@ -6235,7 +6235,7 @@
           <w:noProof/>
         </w:rPr>
         <w:drawing>
-          <wp:inline distT="0" distB="0" distL="0" distR="0" wp14:anchorId="7BAF493B" wp14:editId="0E9953CC">
+          <wp:inline distT="0" distB="0" distL="0" distR="0" wp14:anchorId="221F1FF3" wp14:editId="1F197A3B">
             <wp:extent cx="5976000" cy="50800"/>
             <wp:effectExtent l="0" t="0" r="0" b="0"/>
             <wp:docPr id="6" name="Picture 6"/>
@@ -6291,7 +6291,7 @@
       <w:pPr>
         <w:pStyle w:val="Titre1"/>
       </w:pPr>
-      <w:bookmarkStart w:id="15" w:name="_Toc243969234"/>
+      <w:bookmarkStart w:id="15" w:name="_Toc243989717"/>
       <w:r>
         <w:t>Conduire une étude complète</w:t>
       </w:r>
@@ -6309,7 +6309,7 @@
       <w:pPr>
         <w:pStyle w:val="Titre2"/>
       </w:pPr>
-      <w:bookmarkStart w:id="16" w:name="_Toc243969235"/>
+      <w:bookmarkStart w:id="16" w:name="_Toc243989718"/>
       <w:r>
         <w:t>5.1 Préparer la maquette dans SolidCraft</w:t>
       </w:r>
@@ -6454,7 +6454,7 @@
         <w:rPr>
           <w:rFonts w:cs="Aptos"/>
         </w:rPr>
-        <w:t>). Meca3D les importe avec leur rapport.</w:t>
+        <w:t>). Meca3D les importe avec leur rapport ; un couplage absent de la maquette se saisit dans Meca3D (§ 5.3).</w:t>
       </w:r>
     </w:p>
     <w:p>
@@ -6498,7 +6498,7 @@
       <w:pPr>
         <w:pStyle w:val="Titre2"/>
       </w:pPr>
-      <w:bookmarkStart w:id="17" w:name="_Toc243969236"/>
+      <w:bookmarkStart w:id="17" w:name="_Toc243989719"/>
       <w:r>
         <w:t>5.2 Connexion et import</w:t>
       </w:r>
@@ -6557,7 +6557,7 @@
       <w:pPr>
         <w:pStyle w:val="Titre2"/>
       </w:pPr>
-      <w:bookmarkStart w:id="18" w:name="_Toc243969237"/>
+      <w:bookmarkStart w:id="18" w:name="_Toc243989720"/>
       <w:r>
         <w:t>5.3 Choisir et valider les liaisons</w:t>
       </w:r>
@@ -7761,7 +7761,7 @@
           <w:noProof/>
         </w:rPr>
         <w:drawing>
-          <wp:inline distT="0" distB="0" distL="0" distR="0" wp14:anchorId="2B307A39" wp14:editId="7DCDB0A0">
+          <wp:inline distT="0" distB="0" distL="0" distR="0" wp14:anchorId="2F72F1D1" wp14:editId="67B3A43B">
             <wp:extent cx="5976000" cy="3548250"/>
             <wp:effectExtent l="0" t="0" r="0" b="0"/>
             <wp:docPr id="7" name="Picture 7"/>
@@ -7859,9 +7859,135 @@
     </w:p>
     <w:p>
       <w:pPr>
+        <w:pStyle w:val="Titre3"/>
+      </w:pPr>
+      <w:r>
+        <w:t>Frottement de Coulomb</w:t>
+      </w:r>
+    </w:p>
+    <w:p>
+      <w:r>
+        <w:rPr>
+          <w:rFonts w:cs="Aptos"/>
+        </w:rPr>
+        <w:t xml:space="preserve">Pour une glissière, un appui plan ou un pivot, le groupe </w:t>
+      </w:r>
+      <w:r>
+        <w:rPr>
+          <w:rFonts w:cs="Aptos"/>
+          <w:b/>
+        </w:rPr>
+        <w:t>Frottement de Coulomb</w:t>
+      </w:r>
+      <w:r>
+        <w:rPr>
+          <w:rFonts w:cs="Aptos"/>
+        </w:rPr>
+        <w:t xml:space="preserve"> règle le coefficient f (0 : liaison parfaite). Un pivot frottant demande en plus le rayon r de l'axe, en mm : le couple résistant vaut f·r·|R_radiale|. La loi est régularisée près de la vitesse nulle, F = f·|N|·tanh(v/v_ε) ; la vitesse de régularisation affiche « défaut » (v_ε = 10⁻⁴ m/s, ω_ε = 10⁻² rad/s) et peut être changée. </w:t>
+      </w:r>
+      <w:r>
+        <w:rPr>
+          <w:rFonts w:cs="Aptos"/>
+          <w:b/>
+        </w:rPr>
+        <w:t>Appliquer le frottement</w:t>
+      </w:r>
+      <w:r>
+        <w:rPr>
+          <w:rFonts w:cs="Aptos"/>
+        </w:rPr>
+        <w:t xml:space="preserve"> enregistre les trois valeurs.</w:t>
+      </w:r>
+    </w:p>
+    <w:p>
+      <w:pPr>
+        <w:pStyle w:val="Titre3"/>
+      </w:pPr>
+      <w:r>
+        <w:t>Pas d'une liaison hélicoïdale</w:t>
+      </w:r>
+    </w:p>
+    <w:p>
+      <w:r>
+        <w:rPr>
+          <w:rFonts w:cs="Aptos"/>
+        </w:rPr>
+        <w:t xml:space="preserve">Une liaison hélicoïdale demande son pas p, en mm par tour (Tx = p·Rx / 2π) : groupe </w:t>
+      </w:r>
+      <w:r>
+        <w:rPr>
+          <w:rFonts w:cs="Aptos"/>
+          <w:b/>
+        </w:rPr>
+        <w:t>Pas de la liaison hélicoïdale</w:t>
+      </w:r>
+      <w:r>
+        <w:rPr>
+          <w:rFonts w:cs="Aptos"/>
+        </w:rPr>
+        <w:t xml:space="preserve">, puis </w:t>
+      </w:r>
+      <w:r>
+        <w:rPr>
+          <w:rFonts w:cs="Aptos"/>
+          <w:b/>
+        </w:rPr>
+        <w:t>Appliquer le pas</w:t>
+      </w:r>
+      <w:r>
+        <w:rPr>
+          <w:rFonts w:cs="Aptos"/>
+        </w:rPr>
+        <w:t>.</w:t>
+      </w:r>
+    </w:p>
+    <w:p>
+      <w:pPr>
+        <w:pStyle w:val="Titre3"/>
+      </w:pPr>
+      <w:r>
+        <w:t>Couplages</w:t>
+      </w:r>
+    </w:p>
+    <w:p>
+      <w:r>
+        <w:rPr>
+          <w:rFonts w:cs="Aptos"/>
+        </w:rPr>
+        <w:t xml:space="preserve">La rubrique </w:t>
+      </w:r>
+      <w:r>
+        <w:rPr>
+          <w:rFonts w:cs="Aptos"/>
+          <w:b/>
+        </w:rPr>
+        <w:t>Couplages</w:t>
+      </w:r>
+      <w:r>
+        <w:rPr>
+          <w:rFonts w:cs="Aptos"/>
+        </w:rPr>
+        <w:t xml:space="preserve"> du modèle cinématique liste les couplages importés et saisis. Sélectionner la rubrique pour en créer un : genre, liaison d'entrée (1) et liaison de sortie (2), puis le rapport : nombres de dents Z₁ et Z₂ et sens (extérieur ou intérieur) pour un engrenage, rayon primitif r (mm) pour un pignon-crémaillère, pas p (mm par tour) pour un vis-écrou. Le </w:t>
+      </w:r>
+      <w:r>
+        <w:rPr>
+          <w:rFonts w:cs="Aptos"/>
+          <w:b/>
+        </w:rPr>
+        <w:t>rendement η</w:t>
+      </w:r>
+      <w:r>
+        <w:rPr>
+          <w:rFonts w:cs="Aptos"/>
+        </w:rPr>
+        <w:t>, entre 0 (exclu) et 1, s'applique dans le sens de la puissance transmise. Chaque couplage ajoute une équation au calcul de m et h (§ 5.4). Sélectionner un couplage permet de le modifier ou de le supprimer.</w:t>
+      </w:r>
+    </w:p>
+    <w:p>
+      <w:pPr>
         <w:pStyle w:val="Titre2"/>
       </w:pPr>
-      <w:bookmarkStart w:id="19" w:name="_Toc243969238"/>
+      <w:bookmarkStart w:id="19" w:name="_Toc243989721"/>
       <w:r>
         <w:t>5.4 Graphe, mobilité et hyperstatisme</w:t>
       </w:r>
@@ -7933,7 +8059,7 @@
           <w:noProof/>
         </w:rPr>
         <w:drawing>
-          <wp:inline distT="0" distB="0" distL="0" distR="0" wp14:anchorId="56FDD4BF" wp14:editId="62D78F82">
+          <wp:inline distT="0" distB="0" distL="0" distR="0" wp14:anchorId="71B06C4F" wp14:editId="1837FCBA">
             <wp:extent cx="5976000" cy="3548250"/>
             <wp:effectExtent l="0" t="0" r="0" b="0"/>
             <wp:docPr id="8" name="Picture 8"/>
@@ -8137,7 +8263,7 @@
       <w:pPr>
         <w:pStyle w:val="Titre2"/>
       </w:pPr>
-      <w:bookmarkStart w:id="20" w:name="_Toc243969239"/>
+      <w:bookmarkStart w:id="20" w:name="_Toc243989722"/>
       <w:r>
         <w:t>5.5 Lois d'entrée (pilotes)</w:t>
       </w:r>
@@ -8532,7 +8658,7 @@
           <w:noProof/>
         </w:rPr>
         <w:drawing>
-          <wp:inline distT="0" distB="0" distL="0" distR="0" wp14:anchorId="02A94C31" wp14:editId="33DC9EBC">
+          <wp:inline distT="0" distB="0" distL="0" distR="0" wp14:anchorId="36E71FF2" wp14:editId="5BC15F7A">
             <wp:extent cx="5976000" cy="3548250"/>
             <wp:effectExtent l="0" t="0" r="0" b="0"/>
             <wp:docPr id="9" name="Picture 9"/>
@@ -8585,7 +8711,7 @@
       <w:pPr>
         <w:pStyle w:val="Titre2"/>
       </w:pPr>
-      <w:bookmarkStart w:id="21" w:name="_Toc243969240"/>
+      <w:bookmarkStart w:id="21" w:name="_Toc243989723"/>
       <w:r>
         <w:t>5.6 Pesanteur, actions et ressorts</w:t>
       </w:r>
@@ -8723,7 +8849,7 @@
       <w:pPr>
         <w:pStyle w:val="Titre2"/>
       </w:pPr>
-      <w:bookmarkStart w:id="22" w:name="_Toc243969241"/>
+      <w:bookmarkStart w:id="22" w:name="_Toc243989724"/>
       <w:r>
         <w:t>5.7 Capteurs</w:t>
       </w:r>
@@ -8963,7 +9089,7 @@
           <w:noProof/>
         </w:rPr>
         <w:drawing>
-          <wp:inline distT="0" distB="0" distL="0" distR="0" wp14:anchorId="31C26F36" wp14:editId="0B313E17">
+          <wp:inline distT="0" distB="0" distL="0" distR="0" wp14:anchorId="2478BFFC" wp14:editId="4769F945">
             <wp:extent cx="5976000" cy="3548250"/>
             <wp:effectExtent l="0" t="0" r="0" b="0"/>
             <wp:docPr id="10" name="Picture 10"/>
@@ -9016,7 +9142,7 @@
       <w:pPr>
         <w:pStyle w:val="Titre2"/>
       </w:pPr>
-      <w:bookmarkStart w:id="23" w:name="_Toc243969242"/>
+      <w:bookmarkStart w:id="23" w:name="_Toc243989725"/>
       <w:r>
         <w:t>5.8 Simuler</w:t>
       </w:r>
@@ -9276,14 +9402,59 @@
         <w:rPr>
           <w:rFonts w:cs="Aptos"/>
         </w:rPr>
-        <w:t xml:space="preserve"> (durée, nombre de pas, période d'écriture des capteurs) sont enregistrés dans l'étude. Une étude importée reçoit 1 s, 1 000 pas et 1 ms. Dans la version 0.1.0, ils ne se modifient pas encore depuis l'interface (voir l'annexe B pour les modifier dans le fichier d'étude).</w:t>
+        <w:t xml:space="preserve"> s'ouvrent par un clic sur l'étape </w:t>
+      </w:r>
+      <w:r>
+        <w:rPr>
+          <w:rFonts w:cs="Aptos"/>
+          <w:b/>
+        </w:rPr>
+        <w:t>Simulation</w:t>
+      </w:r>
+      <w:r>
+        <w:rPr>
+          <w:rFonts w:cs="Aptos"/>
+        </w:rPr>
+        <w:t xml:space="preserve"> ou par </w:t>
+      </w:r>
+      <w:r>
+        <w:rPr>
+          <w:rFonts w:cs="Aptos"/>
+          <w:b/>
+        </w:rPr>
+        <w:t>Simulation → Réglages de simulation…</w:t>
+      </w:r>
+      <w:r>
+        <w:rPr>
+          <w:rFonts w:cs="Aptos"/>
+        </w:rPr>
+        <w:t> </w:t>
+      </w:r>
+      <w:r>
+        <w:rPr>
+          <w:rFonts w:cs="Aptos"/>
+        </w:rPr>
+        <w:t xml:space="preserve">: durée (s), nombre de pas d'intégration et période d'écriture des capteurs (ms). Le pas de temps h = durée / nombre de pas est affiché ; 1 ms convient à la plupart des mécanismes de TP. </w:t>
+      </w:r>
+      <w:r>
+        <w:rPr>
+          <w:rFonts w:cs="Aptos"/>
+          <w:b/>
+        </w:rPr>
+        <w:t>Appliquer les réglages</w:t>
+      </w:r>
+      <w:r>
+        <w:rPr>
+          <w:rFonts w:cs="Aptos"/>
+        </w:rPr>
+        <w:t xml:space="preserve"> les enregistre dans l'étude. Une étude importée reçoit 1 s, 1 000 pas et 1 ms.</w:t>
       </w:r>
     </w:p>
     <w:p>
       <w:pPr>
         <w:pStyle w:val="Titre2"/>
       </w:pPr>
-      <w:bookmarkStart w:id="24" w:name="_Toc243969243"/>
+      <w:bookmarkStart w:id="24" w:name="_Toc243989726"/>
       <w:r>
         <w:t>5.9 Exploiter les résultats</w:t>
       </w:r>
@@ -9329,7 +9500,7 @@
           <w:noProof/>
         </w:rPr>
         <w:drawing>
-          <wp:inline distT="0" distB="0" distL="0" distR="0" wp14:anchorId="7B27B92A" wp14:editId="3DF78508">
+          <wp:inline distT="0" distB="0" distL="0" distR="0" wp14:anchorId="478C93EC" wp14:editId="7713A5FD">
             <wp:extent cx="5976000" cy="3548250"/>
             <wp:effectExtent l="0" t="0" r="0" b="0"/>
             <wp:docPr id="11" name="Picture 11"/>
@@ -9418,7 +9589,7 @@
           <w:noProof/>
         </w:rPr>
         <w:drawing>
-          <wp:inline distT="0" distB="0" distL="0" distR="0" wp14:anchorId="5BB758A6" wp14:editId="23D0C2DB">
+          <wp:inline distT="0" distB="0" distL="0" distR="0" wp14:anchorId="47D3D245" wp14:editId="2436888B">
             <wp:extent cx="5976000" cy="3548250"/>
             <wp:effectExtent l="0" t="0" r="0" b="0"/>
             <wp:docPr id="12" name="Picture 12"/>
@@ -9586,7 +9757,7 @@
           <w:noProof/>
         </w:rPr>
         <w:drawing>
-          <wp:inline distT="0" distB="0" distL="0" distR="0" wp14:anchorId="1AD00A47" wp14:editId="3A26FA8B">
+          <wp:inline distT="0" distB="0" distL="0" distR="0" wp14:anchorId="5B21106A" wp14:editId="1E7F9D22">
             <wp:extent cx="5976000" cy="3548250"/>
             <wp:effectExtent l="0" t="0" r="0" b="0"/>
             <wp:docPr id="13" name="Picture 13"/>
@@ -9639,7 +9810,7 @@
       <w:pPr>
         <w:pStyle w:val="Titre2"/>
       </w:pPr>
-      <w:bookmarkStart w:id="25" w:name="_Toc243969244"/>
+      <w:bookmarkStart w:id="25" w:name="_Toc243989727"/>
       <w:r>
         <w:t>5.10 Enregistrer l'étude</w:t>
       </w:r>
@@ -9683,7 +9854,7 @@
           <w:noProof/>
         </w:rPr>
         <w:drawing>
-          <wp:inline distT="0" distB="0" distL="0" distR="0" wp14:anchorId="04667B8B" wp14:editId="6A9E3D30">
+          <wp:inline distT="0" distB="0" distL="0" distR="0" wp14:anchorId="20BBE70A" wp14:editId="639B1B42">
             <wp:extent cx="5976000" cy="50800"/>
             <wp:effectExtent l="0" t="0" r="0" b="0"/>
             <wp:docPr id="14" name="Picture 14"/>
@@ -9739,7 +9910,7 @@
       <w:pPr>
         <w:pStyle w:val="Titre1"/>
       </w:pPr>
-      <w:bookmarkStart w:id="26" w:name="_Toc243969245"/>
+      <w:bookmarkStart w:id="26" w:name="_Toc243989728"/>
       <w:r>
         <w:t>Les exemples fournis</w:t>
       </w:r>
@@ -10407,7 +10578,7 @@
       <w:pPr>
         <w:pStyle w:val="Titre2"/>
       </w:pPr>
-      <w:bookmarkStart w:id="27" w:name="_Toc243969246"/>
+      <w:bookmarkStart w:id="27" w:name="_Toc243989729"/>
       <w:r>
         <w:t>Bielle-manivelle</w:t>
       </w:r>
@@ -10433,7 +10604,7 @@
       <w:pPr>
         <w:pStyle w:val="Titre2"/>
       </w:pPr>
-      <w:bookmarkStart w:id="28" w:name="_Toc243969247"/>
+      <w:bookmarkStart w:id="28" w:name="_Toc243989730"/>
       <w:r>
         <w:t>Pendule simple</w:t>
       </w:r>
@@ -10451,7 +10622,7 @@
       <w:pPr>
         <w:pStyle w:val="Titre2"/>
       </w:pPr>
-      <w:bookmarkStart w:id="29" w:name="_Toc243969248"/>
+      <w:bookmarkStart w:id="29" w:name="_Toc243989731"/>
       <w:r>
         <w:t>Pendule double</w:t>
       </w:r>
@@ -10469,7 +10640,7 @@
       <w:pPr>
         <w:pStyle w:val="Titre2"/>
       </w:pPr>
-      <w:bookmarkStart w:id="30" w:name="_Toc243969249"/>
+      <w:bookmarkStart w:id="30" w:name="_Toc243989732"/>
       <w:r>
         <w:t>Réducteur à engrenage</w:t>
       </w:r>
@@ -10486,7 +10657,7 @@
           <w:noProof/>
         </w:rPr>
         <w:drawing>
-          <wp:inline distT="0" distB="0" distL="0" distR="0" wp14:anchorId="539E5565" wp14:editId="7C3EE04D">
+          <wp:inline distT="0" distB="0" distL="0" distR="0" wp14:anchorId="5071AEC2" wp14:editId="344A2504">
             <wp:extent cx="5976000" cy="3548250"/>
             <wp:effectExtent l="0" t="0" r="0" b="0"/>
             <wp:docPr id="15" name="Picture 15"/>
@@ -10547,7 +10718,7 @@
       <w:pPr>
         <w:pStyle w:val="Titre2"/>
       </w:pPr>
-      <w:bookmarkStart w:id="31" w:name="_Toc243969250"/>
+      <w:bookmarkStart w:id="31" w:name="_Toc243989733"/>
       <w:r>
         <w:t>Système vis-écrou</w:t>
       </w:r>
@@ -10570,7 +10741,7 @@
           <w:noProof/>
         </w:rPr>
         <w:drawing>
-          <wp:inline distT="0" distB="0" distL="0" distR="0" wp14:anchorId="132FD74C" wp14:editId="2D6332B0">
+          <wp:inline distT="0" distB="0" distL="0" distR="0" wp14:anchorId="1B7ACA72" wp14:editId="50B52F89">
             <wp:extent cx="5976000" cy="50800"/>
             <wp:effectExtent l="0" t="0" r="0" b="0"/>
             <wp:docPr id="16" name="Picture 16"/>
@@ -10626,7 +10797,7 @@
       <w:pPr>
         <w:pStyle w:val="Titre1"/>
       </w:pPr>
-      <w:bookmarkStart w:id="32" w:name="_Toc243969251"/>
+      <w:bookmarkStart w:id="32" w:name="_Toc243989734"/>
       <w:r>
         <w:t>Conventions</w:t>
       </w:r>
@@ -11053,7 +11224,7 @@
           <w:noProof/>
         </w:rPr>
         <w:drawing>
-          <wp:inline distT="0" distB="0" distL="0" distR="0" wp14:anchorId="519C46A1" wp14:editId="734E6D45">
+          <wp:inline distT="0" distB="0" distL="0" distR="0" wp14:anchorId="51ED767B" wp14:editId="1DE7331D">
             <wp:extent cx="5976000" cy="50800"/>
             <wp:effectExtent l="0" t="0" r="0" b="0"/>
             <wp:docPr id="17" name="Picture 17"/>
@@ -11109,7 +11280,7 @@
       <w:pPr>
         <w:pStyle w:val="Titre1"/>
       </w:pPr>
-      <w:bookmarkStart w:id="33" w:name="_Toc243969252"/>
+      <w:bookmarkStart w:id="33" w:name="_Toc243989735"/>
       <w:r>
         <w:t>Usage enseignant</w:t>
       </w:r>
@@ -11349,7 +11520,7 @@
       <w:pPr>
         <w:pStyle w:val="Titre2"/>
       </w:pPr>
-      <w:bookmarkStart w:id="34" w:name="_Toc243969253"/>
+      <w:bookmarkStart w:id="34" w:name="_Toc243989736"/>
       <w:r>
         <w:t>Pistes pédagogiques</w:t>
       </w:r>
@@ -11489,7 +11660,7 @@
           <w:noProof/>
         </w:rPr>
         <w:drawing>
-          <wp:inline distT="0" distB="0" distL="0" distR="0" wp14:anchorId="22C2E7A7" wp14:editId="2A3DC79D">
+          <wp:inline distT="0" distB="0" distL="0" distR="0" wp14:anchorId="49A09EA0" wp14:editId="31F237B8">
             <wp:extent cx="5976000" cy="50800"/>
             <wp:effectExtent l="0" t="0" r="0" b="0"/>
             <wp:docPr id="18" name="Picture 18"/>
@@ -11545,7 +11716,7 @@
       <w:pPr>
         <w:pStyle w:val="Titre1"/>
       </w:pPr>
-      <w:bookmarkStart w:id="35" w:name="_Toc243969254"/>
+      <w:bookmarkStart w:id="35" w:name="_Toc243989737"/>
       <w:r>
         <w:t>Ligne de commande</w:t>
       </w:r>
@@ -11857,7 +12028,7 @@
           <w:noProof/>
         </w:rPr>
         <w:drawing>
-          <wp:inline distT="0" distB="0" distL="0" distR="0" wp14:anchorId="1F1F92A0" wp14:editId="1948CDA2">
+          <wp:inline distT="0" distB="0" distL="0" distR="0" wp14:anchorId="34504E48" wp14:editId="07D80217">
             <wp:extent cx="5976000" cy="50800"/>
             <wp:effectExtent l="0" t="0" r="0" b="0"/>
             <wp:docPr id="19" name="Picture 19"/>
@@ -11913,7 +12084,7 @@
       <w:pPr>
         <w:pStyle w:val="Titre1"/>
       </w:pPr>
-      <w:bookmarkStart w:id="36" w:name="_Toc243969255"/>
+      <w:bookmarkStart w:id="36" w:name="_Toc243989738"/>
       <w:r>
         <w:t>Messages et dépannage</w:t>
       </w:r>
@@ -12506,7 +12677,7 @@
           <w:noProof/>
         </w:rPr>
         <w:drawing>
-          <wp:inline distT="0" distB="0" distL="0" distR="0" wp14:anchorId="19057A99" wp14:editId="023D02A6">
+          <wp:inline distT="0" distB="0" distL="0" distR="0" wp14:anchorId="04D4EF58" wp14:editId="77EEC547">
             <wp:extent cx="5976000" cy="50800"/>
             <wp:effectExtent l="0" t="0" r="0" b="0"/>
             <wp:docPr id="20" name="Picture 20"/>
@@ -12562,7 +12733,7 @@
       <w:pPr>
         <w:pStyle w:val="Titre1"/>
       </w:pPr>
-      <w:bookmarkStart w:id="37" w:name="_Toc243969256"/>
+      <w:bookmarkStart w:id="37" w:name="_Toc243989739"/>
       <w:r>
         <w:t>Limites de la version 0.1.0</w:t>
       </w:r>
@@ -12572,7 +12743,7 @@
       <w:pPr>
         <w:pStyle w:val="Titre2"/>
       </w:pPr>
-      <w:bookmarkStart w:id="38" w:name="_Toc243969257"/>
+      <w:bookmarkStart w:id="38" w:name="_Toc243989740"/>
       <w:r>
         <w:t>Hors périmètre</w:t>
       </w:r>
@@ -12654,9 +12825,9 @@
       <w:pPr>
         <w:pStyle w:val="Titre2"/>
       </w:pPr>
-      <w:bookmarkStart w:id="39" w:name="_Toc243969258"/>
-      <w:r>
-        <w:t>Réglages non encore exposés dans l'interface</w:t>
+      <w:bookmarkStart w:id="39" w:name="_Toc243989741"/>
+      <w:r>
+        <w:t>Réglages</w:t>
       </w:r>
       <w:bookmarkEnd w:id="39"/>
     </w:p>
@@ -12665,51 +12836,7 @@
         <w:rPr>
           <w:rFonts w:cs="Aptos"/>
         </w:rPr>
-        <w:t>Le moteur de calcul et le fichier d'étude les prennent en charge, mais l'interface de la version 0.1.0 ne permet pas encore de les saisir :</w:t>
-      </w:r>
-    </w:p>
-    <w:p>
-      <w:pPr>
-        <w:pStyle w:val="Listepuces"/>
-        <w:spacing w:after="60"/>
-      </w:pPr>
-      <w:r>
-        <w:rPr>
-          <w:rFonts w:cs="Aptos"/>
-        </w:rPr>
-        <w:t>durée, nombre de pas et période d'écriture de la simulation ;</w:t>
-      </w:r>
-    </w:p>
-    <w:p>
-      <w:pPr>
-        <w:pStyle w:val="Listepuces"/>
-        <w:spacing w:after="60"/>
-      </w:pPr>
-      <w:r>
-        <w:rPr>
-          <w:rFonts w:cs="Aptos"/>
-        </w:rPr>
-        <w:t>coefficient de frottement de Coulomb d'une liaison et rayon d'axe d'un pivot frottant ;</w:t>
-      </w:r>
-    </w:p>
-    <w:p>
-      <w:pPr>
-        <w:pStyle w:val="Listepuces"/>
-        <w:spacing w:after="60"/>
-      </w:pPr>
-      <w:r>
-        <w:rPr>
-          <w:rFonts w:cs="Aptos"/>
-        </w:rPr>
-        <w:t>rendement d'un couplage, et saisie d'un couplage absent de la maquette.</w:t>
-      </w:r>
-    </w:p>
-    <w:p>
-      <w:r>
-        <w:rPr>
-          <w:rFonts w:cs="Aptos"/>
-        </w:rPr>
-        <w:t xml:space="preserve">L'annexe B indique comment les renseigner dans le fichier </w:t>
+        <w:t xml:space="preserve">Tous les réglages de l'étude se saisissent dans l'interface : réglages de simulation (§ 5.8), frottement, pas des hélicoïdales et couplages (§ 5.3). Le fichier </w:t>
       </w:r>
       <w:r>
         <w:rPr>
@@ -12723,14 +12850,14 @@
         <w:rPr>
           <w:rFonts w:cs="Aptos"/>
         </w:rPr>
-        <w:t>.</w:t>
+        <w:t xml:space="preserve"> n'a jamais besoin d'être modifié à la main (annexe B).</w:t>
       </w:r>
     </w:p>
     <w:p>
       <w:pPr>
         <w:pStyle w:val="Titre2"/>
       </w:pPr>
-      <w:bookmarkStart w:id="40" w:name="_Toc243969259"/>
+      <w:bookmarkStart w:id="40" w:name="_Toc243989742"/>
       <w:r>
         <w:t>Distribution</w:t>
       </w:r>
@@ -12769,7 +12896,7 @@
           <w:noProof/>
         </w:rPr>
         <w:drawing>
-          <wp:inline distT="0" distB="0" distL="0" distR="0" wp14:anchorId="799B3D38" wp14:editId="53887FE9">
+          <wp:inline distT="0" distB="0" distL="0" distR="0" wp14:anchorId="1E132B7B" wp14:editId="6077DCBB">
             <wp:extent cx="5976000" cy="50800"/>
             <wp:effectExtent l="0" t="0" r="0" b="0"/>
             <wp:docPr id="21" name="Picture 21"/>
@@ -12825,7 +12952,7 @@
       <w:pPr>
         <w:pStyle w:val="Titre1"/>
       </w:pPr>
-      <w:bookmarkStart w:id="41" w:name="_Toc243969260"/>
+      <w:bookmarkStart w:id="41" w:name="_Toc243989743"/>
       <w:r>
         <w:t>Annexe A — Glossaire</w:t>
       </w:r>
@@ -13378,7 +13505,7 @@
       <w:pPr>
         <w:pStyle w:val="Titre1"/>
       </w:pPr>
-      <w:bookmarkStart w:id="42" w:name="_Toc243969261"/>
+      <w:bookmarkStart w:id="42" w:name="_Toc243989744"/>
       <w:r>
         <w:t>Annexe B — Le fichier d'étude</w:t>
       </w:r>
@@ -13403,7 +13530,7 @@
         <w:rPr>
           <w:rFonts w:cs="Aptos"/>
         </w:rPr>
-        <w:t xml:space="preserve"> est un texte JSON lisible, en UTF-8. Un enseignant peut le modifier avec un éditeur de texte (Bloc-notes, VS Code) pour renseigner les réglages que l'interface 0.1.0 n'expose pas. Enregistrer une copie avant toute modification : un fichier invalide est refusé à l'ouverture.</w:t>
+        <w:t xml:space="preserve"> est un texte JSON lisible, en UTF-8. Toutes ses valeurs se saisissent dans l'interface ; cette annexe montre comment elles y sont écrites, pour relire une étude ou la préparer avec un éditeur de texte (Bloc-notes, VS Code). Enregistrer une copie avant toute modification à la main : un fichier invalide est refusé à l'ouverture.</w:t>
       </w:r>
     </w:p>
     <w:p>
@@ -13468,7 +13595,7 @@
         <w:rPr>
           <w:rFonts w:cs="Aptos"/>
         </w:rPr>
-        <w:t>Durée en s, nombre de pas d'intégration, période d'écriture des capteurs en s. Un pas de 1 ms convient à la plupart des mécanismes de TP.</w:t>
+        <w:t>Durée en s, nombre de pas d'intégration, période d'écriture des capteurs en s (saisie en ms dans l'interface). Un pas de 1 ms convient à la plupart des mécanismes de TP. Interface : étape Simulation ou menu Simulation → Réglages de simulation…</w:t>
       </w:r>
     </w:p>
     <w:p>
@@ -13544,7 +13671,35 @@
         <w:rPr>
           <w:rFonts w:cs="Aptos"/>
         </w:rPr>
-        <w:t>Coefficient f sans dimension ; rayon d'axe en m pour un pivot. La loi est régularisée près de la vitesse nulle (v_ε = 10⁻⁴ m/s, ω_ε = 10⁻² rad/s).</w:t>
+        <w:t xml:space="preserve">Coefficient f sans dimension ; rayon d'axe en m pour un pivot (saisi en mm). La loi est régularisée près de la vitesse nulle (v_ε = 10⁻⁴ m/s, ω_ε = 10⁻² rad/s par défaut ; clé optionnelle </w:t>
+      </w:r>
+      <w:r>
+        <w:rPr>
+          <w:rFonts w:ascii="Cascadia Mono" w:eastAsia="Cascadia Mono" w:hAnsi="Cascadia Mono" w:cs="Cascadia Mono"/>
+          <w:color w:val="1B3A6B"/>
+          <w:sz w:val="19"/>
+        </w:rPr>
+        <w:t>epsilon</w:t>
+      </w:r>
+      <w:r>
+        <w:rPr>
+          <w:rFonts w:cs="Aptos"/>
+        </w:rPr>
+        <w:t xml:space="preserve">). Interface : groupe Frottement de Coulomb du panneau de la liaison. Le pas d'une hélicoïdale s'écrit dans la clé </w:t>
+      </w:r>
+      <w:r>
+        <w:rPr>
+          <w:rFonts w:ascii="Cascadia Mono" w:eastAsia="Cascadia Mono" w:hAnsi="Cascadia Mono" w:cs="Cascadia Mono"/>
+          <w:color w:val="1B3A6B"/>
+          <w:sz w:val="19"/>
+        </w:rPr>
+        <w:t>pas</w:t>
+      </w:r>
+      <w:r>
+        <w:rPr>
+          <w:rFonts w:cs="Aptos"/>
+        </w:rPr>
+        <w:t>, en m par tour (groupe Pas de la liaison hélicoïdale).</w:t>
       </w:r>
     </w:p>
     <w:p>
@@ -13593,7 +13748,29 @@
                 <w:color w:val="1B3A6B"/>
                 <w:sz w:val="18"/>
               </w:rPr>
-              <w:t>{"genre": "engrenage", ..., "k": 0.3333333333333333, "rendement": 0.95}</w:t>
+              <w:t>{"genre": "engrenage", "nom": "K1", "liaison_1": "L1", "liaison_2": "L2",</w:t>
+            </w:r>
+            <w:r>
+              <w:br/>
+            </w:r>
+            <w:r>
+              <w:rPr>
+                <w:rFonts w:ascii="Cascadia Mono" w:eastAsia="Cascadia Mono" w:hAnsi="Cascadia Mono" w:cs="Cascadia Mono"/>
+                <w:color w:val="1B3A6B"/>
+                <w:sz w:val="18"/>
+              </w:rPr>
+              <w:t xml:space="preserve"> "k": 0.3333333333333333, "sens": "exterieur", "rendement": 0.95,</w:t>
+            </w:r>
+            <w:r>
+              <w:br/>
+            </w:r>
+            <w:r>
+              <w:rPr>
+                <w:rFonts w:ascii="Cascadia Mono" w:eastAsia="Cascadia Mono" w:hAnsi="Cascadia Mono" w:cs="Cascadia Mono"/>
+                <w:color w:val="1B3A6B"/>
+                <w:sz w:val="18"/>
+              </w:rPr>
+              <w:t xml:space="preserve"> "z1": 20, "z2": 60}</w:t>
             </w:r>
           </w:p>
         </w:tc>
@@ -13609,7 +13786,63 @@
         <w:rPr>
           <w:rFonts w:cs="Aptos"/>
         </w:rPr>
-        <w:t>Rendement η entre 0 (exclu) et 1. Le sens de la perte suit le signe de la puissance transmise à chaque instant.</w:t>
+        <w:t xml:space="preserve">Rendement η entre 0 (exclu) et 1. Le sens de la perte suit le signe de la puissance transmise à chaque instant. Les nombres de dents </w:t>
+      </w:r>
+      <w:r>
+        <w:rPr>
+          <w:rFonts w:ascii="Cascadia Mono" w:eastAsia="Cascadia Mono" w:hAnsi="Cascadia Mono" w:cs="Cascadia Mono"/>
+          <w:color w:val="1B3A6B"/>
+          <w:sz w:val="19"/>
+        </w:rPr>
+        <w:t>z1</w:t>
+      </w:r>
+      <w:r>
+        <w:rPr>
+          <w:rFonts w:cs="Aptos"/>
+        </w:rPr>
+        <w:t xml:space="preserve"> et </w:t>
+      </w:r>
+      <w:r>
+        <w:rPr>
+          <w:rFonts w:ascii="Cascadia Mono" w:eastAsia="Cascadia Mono" w:hAnsi="Cascadia Mono" w:cs="Cascadia Mono"/>
+          <w:color w:val="1B3A6B"/>
+          <w:sz w:val="19"/>
+        </w:rPr>
+        <w:t>z2</w:t>
+      </w:r>
+      <w:r>
+        <w:rPr>
+          <w:rFonts w:cs="Aptos"/>
+        </w:rPr>
+        <w:t xml:space="preserve">, facultatifs, sont écrits quand l'engrenage a été saisi par ses dents ; le calcul n'utilise que k. Pignon-crémaillère : clé </w:t>
+      </w:r>
+      <w:r>
+        <w:rPr>
+          <w:rFonts w:ascii="Cascadia Mono" w:eastAsia="Cascadia Mono" w:hAnsi="Cascadia Mono" w:cs="Cascadia Mono"/>
+          <w:color w:val="1B3A6B"/>
+          <w:sz w:val="19"/>
+        </w:rPr>
+        <w:t>r</w:t>
+      </w:r>
+      <w:r>
+        <w:rPr>
+          <w:rFonts w:cs="Aptos"/>
+        </w:rPr>
+        <w:t xml:space="preserve"> (m) ; vis-écrou : clé </w:t>
+      </w:r>
+      <w:r>
+        <w:rPr>
+          <w:rFonts w:ascii="Cascadia Mono" w:eastAsia="Cascadia Mono" w:hAnsi="Cascadia Mono" w:cs="Cascadia Mono"/>
+          <w:color w:val="1B3A6B"/>
+          <w:sz w:val="19"/>
+        </w:rPr>
+        <w:t>p</w:t>
+      </w:r>
+      <w:r>
+        <w:rPr>
+          <w:rFonts w:cs="Aptos"/>
+        </w:rPr>
+        <w:t xml:space="preserve"> (m par tour). Interface : rubrique Couplages.</w:t>
       </w:r>
     </w:p>
     <w:p>
@@ -13910,7 +14143,7 @@
                 <w:rFonts w:cs="Aptos"/>
                 <w:sz w:val="20"/>
               </w:rPr>
-              <w:t>genre, liaisons couplées, rapport, rendement</w:t>
+              <w:t>genre, liaisons couplées, rapport (et dents), rendement</w:t>
             </w:r>
           </w:p>
         </w:tc>
@@ -14139,7 +14372,7 @@
       <w:pPr>
         <w:pStyle w:val="Titre1"/>
       </w:pPr>
-      <w:bookmarkStart w:id="43" w:name="_Toc243969262"/>
+      <w:bookmarkStart w:id="43" w:name="_Toc243989745"/>
       <w:r>
         <w:t>Annexe C — Références et licence</w:t>
       </w:r>
@@ -14263,7 +14496,7 @@
           <w:noProof/>
         </w:rPr>
         <w:drawing>
-          <wp:inline distT="0" distB="0" distL="0" distR="0" wp14:anchorId="369FF413" wp14:editId="31633BFE">
+          <wp:inline distT="0" distB="0" distL="0" distR="0" wp14:anchorId="715BE3F9" wp14:editId="6D45B2D4">
             <wp:extent cx="5976000" cy="50800"/>
             <wp:effectExtent l="0" t="0" r="0" b="0"/>
             <wp:docPr id="22" name="Picture 22"/>
@@ -14530,10 +14763,10 @@
               <w:noProof/>
             </w:rPr>
             <w:drawing>
-              <wp:inline distT="0" distB="0" distL="0" distR="0" wp14:anchorId="383BF201" wp14:editId="6EBFEF4B">
+              <wp:inline distT="0" distB="0" distL="0" distR="0" wp14:anchorId="1A527A37" wp14:editId="69274BC5">
                 <wp:extent cx="1512000" cy="432000"/>
                 <wp:effectExtent l="0" t="0" r="0" b="0"/>
-                <wp:docPr id="556070977" name="Picture 1"/>
+                <wp:docPr id="1095741739" name="Picture 1"/>
                 <wp:cNvGraphicFramePr>
                   <a:graphicFrameLocks xmlns:a="http://schemas.openxmlformats.org/drawingml/2006/main" noChangeAspect="1"/>
                 </wp:cNvGraphicFramePr>
@@ -14781,31 +15014,31 @@
       </w:rPr>
     </w:lvl>
   </w:abstractNum>
-  <w:num w:numId="1" w16cid:durableId="1883664137">
+  <w:num w:numId="1" w16cid:durableId="325402782">
     <w:abstractNumId w:val="8"/>
   </w:num>
-  <w:num w:numId="2" w16cid:durableId="477648512">
+  <w:num w:numId="2" w16cid:durableId="1181705475">
     <w:abstractNumId w:val="6"/>
   </w:num>
-  <w:num w:numId="3" w16cid:durableId="455874098">
+  <w:num w:numId="3" w16cid:durableId="1776905371">
     <w:abstractNumId w:val="5"/>
   </w:num>
-  <w:num w:numId="4" w16cid:durableId="1548906678">
+  <w:num w:numId="4" w16cid:durableId="93863985">
     <w:abstractNumId w:val="4"/>
   </w:num>
-  <w:num w:numId="5" w16cid:durableId="959843860">
+  <w:num w:numId="5" w16cid:durableId="1051853363">
     <w:abstractNumId w:val="7"/>
   </w:num>
-  <w:num w:numId="6" w16cid:durableId="1730493844">
+  <w:num w:numId="6" w16cid:durableId="21824259">
     <w:abstractNumId w:val="3"/>
   </w:num>
-  <w:num w:numId="7" w16cid:durableId="318848276">
+  <w:num w:numId="7" w16cid:durableId="1155098875">
     <w:abstractNumId w:val="2"/>
   </w:num>
-  <w:num w:numId="8" w16cid:durableId="700278461">
+  <w:num w:numId="8" w16cid:durableId="1464041456">
     <w:abstractNumId w:val="1"/>
   </w:num>
-  <w:num w:numId="9" w16cid:durableId="251671342">
+  <w:num w:numId="9" w16cid:durableId="1244144906">
     <w:abstractNumId w:val="0"/>
   </w:num>
 </w:numbering>
@@ -26197,7 +26430,7 @@
     <w:autoRedefine/>
     <w:uiPriority w:val="39"/>
     <w:unhideWhenUsed/>
-    <w:rsid w:val="00B30CE6"/>
+    <w:rsid w:val="006F607C"/>
     <w:pPr>
       <w:spacing w:after="100"/>
     </w:pPr>
@@ -26209,7 +26442,7 @@
     <w:autoRedefine/>
     <w:uiPriority w:val="39"/>
     <w:unhideWhenUsed/>
-    <w:rsid w:val="00B30CE6"/>
+    <w:rsid w:val="006F607C"/>
     <w:pPr>
       <w:spacing w:after="100"/>
       <w:ind w:left="220"/>
@@ -26220,7 +26453,7 @@
     <w:basedOn w:val="Policepardfaut"/>
     <w:uiPriority w:val="99"/>
     <w:unhideWhenUsed/>
-    <w:rsid w:val="00B30CE6"/>
+    <w:rsid w:val="006F607C"/>
     <w:rPr>
       <w:color w:val="0000FF" w:themeColor="hyperlink"/>
       <w:u w:val="single"/>

</xml_diff>

<commit_message>
docs: guide utilisateur 1.1 : lancement de SolidCraft et ouverture de la maquette depuis Meca3D (EX-07)
Co-Authored-By: Claude Opus 5.5 <noreply@anthropic.com>
</commit_message>
<xml_diff>
--- a/docs/guide/Meca3D_Guide_utilisateur.docx
+++ b/docs/guide/Meca3D_Guide_utilisateur.docx
@@ -48,7 +48,7 @@
                 <w:noProof/>
               </w:rPr>
               <w:drawing>
-                <wp:inline distT="0" distB="0" distL="0" distR="0" wp14:anchorId="57FD72AC" wp14:editId="31251ACF">
+                <wp:inline distT="0" distB="0" distL="0" distR="0" wp14:anchorId="7D8D6E40" wp14:editId="35CB77B9">
                   <wp:extent cx="3240000" cy="925714"/>
                   <wp:effectExtent l="0" t="0" r="0" b="0"/>
                   <wp:docPr id="1" name="Picture 1"/>
@@ -153,7 +153,7 @@
                 <w:color w:val="8A8A8A"/>
                 <w:sz w:val="20"/>
               </w:rPr>
-              <w:t>RÉFÉRENCE  MIA-DOC-2026-101    VERSION  1.0    ÉMIS LE  27/10/2026</w:t>
+              <w:t>RÉFÉRENCE  MIA-DOC-2026-101    VERSION  1.1    ÉMIS LE  28/10/2026</w:t>
             </w:r>
             <w:r>
               <w:br/>
@@ -200,7 +200,7 @@
       <w:pPr>
         <w:pStyle w:val="Titre1"/>
       </w:pPr>
-      <w:bookmarkStart w:id="0" w:name="_Toc243989702"/>
+      <w:bookmarkStart w:id="0" w:name="_Toc244069473"/>
       <w:r>
         <w:t>Table des matières</w:t>
       </w:r>
@@ -225,7 +225,7 @@
       <w:r>
         <w:fldChar w:fldCharType="separate"/>
       </w:r>
-      <w:hyperlink w:anchor="_Toc243989702" w:history="1">
+      <w:hyperlink w:anchor="_Toc244069473" w:history="1">
         <w:r>
           <w:rPr>
             <w:rStyle w:val="Lienhypertexte"/>
@@ -252,7 +252,7 @@
             <w:noProof/>
             <w:webHidden/>
           </w:rPr>
-          <w:instrText xml:space="preserve"> PAGEREF _Toc243989702 \h </w:instrText>
+          <w:instrText xml:space="preserve"> PAGEREF _Toc244069473 \h </w:instrText>
         </w:r>
         <w:r>
           <w:rPr>
@@ -293,7 +293,7 @@
           <w:noProof/>
         </w:rPr>
       </w:pPr>
-      <w:hyperlink w:anchor="_Toc243989703" w:history="1">
+      <w:hyperlink w:anchor="_Toc244069474" w:history="1">
         <w:r>
           <w:rPr>
             <w:rStyle w:val="Lienhypertexte"/>
@@ -320,7 +320,7 @@
             <w:noProof/>
             <w:webHidden/>
           </w:rPr>
-          <w:instrText xml:space="preserve"> PAGEREF _Toc243989703 \h </w:instrText>
+          <w:instrText xml:space="preserve"> PAGEREF _Toc244069474 \h </w:instrText>
         </w:r>
         <w:r>
           <w:rPr>
@@ -361,7 +361,7 @@
           <w:noProof/>
         </w:rPr>
       </w:pPr>
-      <w:hyperlink w:anchor="_Toc243989704" w:history="1">
+      <w:hyperlink w:anchor="_Toc244069475" w:history="1">
         <w:r>
           <w:rPr>
             <w:rStyle w:val="Lienhypertexte"/>
@@ -388,7 +388,7 @@
             <w:noProof/>
             <w:webHidden/>
           </w:rPr>
-          <w:instrText xml:space="preserve"> PAGEREF _Toc243989704 \h </w:instrText>
+          <w:instrText xml:space="preserve"> PAGEREF _Toc244069475 \h </w:instrText>
         </w:r>
         <w:r>
           <w:rPr>
@@ -429,7 +429,7 @@
           <w:noProof/>
         </w:rPr>
       </w:pPr>
-      <w:hyperlink w:anchor="_Toc243989705" w:history="1">
+      <w:hyperlink w:anchor="_Toc244069476" w:history="1">
         <w:r>
           <w:rPr>
             <w:rStyle w:val="Lienhypertexte"/>
@@ -456,7 +456,7 @@
             <w:noProof/>
             <w:webHidden/>
           </w:rPr>
-          <w:instrText xml:space="preserve"> PAGEREF _Toc243989705 \h </w:instrText>
+          <w:instrText xml:space="preserve"> PAGEREF _Toc244069476 \h </w:instrText>
         </w:r>
         <w:r>
           <w:rPr>
@@ -497,7 +497,7 @@
           <w:noProof/>
         </w:rPr>
       </w:pPr>
-      <w:hyperlink w:anchor="_Toc243989706" w:history="1">
+      <w:hyperlink w:anchor="_Toc244069477" w:history="1">
         <w:r>
           <w:rPr>
             <w:rStyle w:val="Lienhypertexte"/>
@@ -524,7 +524,7 @@
             <w:noProof/>
             <w:webHidden/>
           </w:rPr>
-          <w:instrText xml:space="preserve"> PAGEREF _Toc243989706 \h </w:instrText>
+          <w:instrText xml:space="preserve"> PAGEREF _Toc244069477 \h </w:instrText>
         </w:r>
         <w:r>
           <w:rPr>
@@ -565,7 +565,7 @@
           <w:noProof/>
         </w:rPr>
       </w:pPr>
-      <w:hyperlink w:anchor="_Toc243989707" w:history="1">
+      <w:hyperlink w:anchor="_Toc244069478" w:history="1">
         <w:r>
           <w:rPr>
             <w:rStyle w:val="Lienhypertexte"/>
@@ -592,7 +592,7 @@
             <w:noProof/>
             <w:webHidden/>
           </w:rPr>
-          <w:instrText xml:space="preserve"> PAGEREF _Toc243989707 \h </w:instrText>
+          <w:instrText xml:space="preserve"> PAGEREF _Toc244069478 \h </w:instrText>
         </w:r>
         <w:r>
           <w:rPr>
@@ -633,7 +633,7 @@
           <w:noProof/>
         </w:rPr>
       </w:pPr>
-      <w:hyperlink w:anchor="_Toc243989708" w:history="1">
+      <w:hyperlink w:anchor="_Toc244069479" w:history="1">
         <w:r>
           <w:rPr>
             <w:rStyle w:val="Lienhypertexte"/>
@@ -660,7 +660,7 @@
             <w:noProof/>
             <w:webHidden/>
           </w:rPr>
-          <w:instrText xml:space="preserve"> PAGEREF _Toc243989708 \h </w:instrText>
+          <w:instrText xml:space="preserve"> PAGEREF _Toc244069479 \h </w:instrText>
         </w:r>
         <w:r>
           <w:rPr>
@@ -701,7 +701,7 @@
           <w:noProof/>
         </w:rPr>
       </w:pPr>
-      <w:hyperlink w:anchor="_Toc243989709" w:history="1">
+      <w:hyperlink w:anchor="_Toc244069480" w:history="1">
         <w:r>
           <w:rPr>
             <w:rStyle w:val="Lienhypertexte"/>
@@ -728,7 +728,7 @@
             <w:noProof/>
             <w:webHidden/>
           </w:rPr>
-          <w:instrText xml:space="preserve"> PAGEREF _Toc243989709 \h </w:instrText>
+          <w:instrText xml:space="preserve"> PAGEREF _Toc244069480 \h </w:instrText>
         </w:r>
         <w:r>
           <w:rPr>
@@ -769,7 +769,7 @@
           <w:noProof/>
         </w:rPr>
       </w:pPr>
-      <w:hyperlink w:anchor="_Toc243989710" w:history="1">
+      <w:hyperlink w:anchor="_Toc244069481" w:history="1">
         <w:r>
           <w:rPr>
             <w:rStyle w:val="Lienhypertexte"/>
@@ -796,7 +796,7 @@
             <w:noProof/>
             <w:webHidden/>
           </w:rPr>
-          <w:instrText xml:space="preserve"> PAGEREF _Toc243989710 \h </w:instrText>
+          <w:instrText xml:space="preserve"> PAGEREF _Toc244069481 \h </w:instrText>
         </w:r>
         <w:r>
           <w:rPr>
@@ -837,7 +837,7 @@
           <w:noProof/>
         </w:rPr>
       </w:pPr>
-      <w:hyperlink w:anchor="_Toc243989711" w:history="1">
+      <w:hyperlink w:anchor="_Toc244069482" w:history="1">
         <w:r>
           <w:rPr>
             <w:rStyle w:val="Lienhypertexte"/>
@@ -864,7 +864,7 @@
             <w:noProof/>
             <w:webHidden/>
           </w:rPr>
-          <w:instrText xml:space="preserve"> PAGEREF _Toc243989711 \h </w:instrText>
+          <w:instrText xml:space="preserve"> PAGEREF _Toc244069482 \h </w:instrText>
         </w:r>
         <w:r>
           <w:rPr>
@@ -905,7 +905,7 @@
           <w:noProof/>
         </w:rPr>
       </w:pPr>
-      <w:hyperlink w:anchor="_Toc243989712" w:history="1">
+      <w:hyperlink w:anchor="_Toc244069483" w:history="1">
         <w:r>
           <w:rPr>
             <w:rStyle w:val="Lienhypertexte"/>
@@ -932,7 +932,7 @@
             <w:noProof/>
             <w:webHidden/>
           </w:rPr>
-          <w:instrText xml:space="preserve"> PAGEREF _Toc243989712 \h </w:instrText>
+          <w:instrText xml:space="preserve"> PAGEREF _Toc244069483 \h </w:instrText>
         </w:r>
         <w:r>
           <w:rPr>
@@ -973,7 +973,7 @@
           <w:noProof/>
         </w:rPr>
       </w:pPr>
-      <w:hyperlink w:anchor="_Toc243989713" w:history="1">
+      <w:hyperlink w:anchor="_Toc244069484" w:history="1">
         <w:r>
           <w:rPr>
             <w:rStyle w:val="Lienhypertexte"/>
@@ -1000,7 +1000,7 @@
             <w:noProof/>
             <w:webHidden/>
           </w:rPr>
-          <w:instrText xml:space="preserve"> PAGEREF _Toc243989713 \h </w:instrText>
+          <w:instrText xml:space="preserve"> PAGEREF _Toc244069484 \h </w:instrText>
         </w:r>
         <w:r>
           <w:rPr>
@@ -1041,7 +1041,7 @@
           <w:noProof/>
         </w:rPr>
       </w:pPr>
-      <w:hyperlink w:anchor="_Toc243989714" w:history="1">
+      <w:hyperlink w:anchor="_Toc244069485" w:history="1">
         <w:r>
           <w:rPr>
             <w:rStyle w:val="Lienhypertexte"/>
@@ -1068,7 +1068,7 @@
             <w:noProof/>
             <w:webHidden/>
           </w:rPr>
-          <w:instrText xml:space="preserve"> PAGEREF _Toc243989714 \h </w:instrText>
+          <w:instrText xml:space="preserve"> PAGEREF _Toc244069485 \h </w:instrText>
         </w:r>
         <w:r>
           <w:rPr>
@@ -1109,7 +1109,7 @@
           <w:noProof/>
         </w:rPr>
       </w:pPr>
-      <w:hyperlink w:anchor="_Toc243989715" w:history="1">
+      <w:hyperlink w:anchor="_Toc244069486" w:history="1">
         <w:r>
           <w:rPr>
             <w:rStyle w:val="Lienhypertexte"/>
@@ -1136,7 +1136,7 @@
             <w:noProof/>
             <w:webHidden/>
           </w:rPr>
-          <w:instrText xml:space="preserve"> PAGEREF _Toc243989715 \h </w:instrText>
+          <w:instrText xml:space="preserve"> PAGEREF _Toc244069486 \h </w:instrText>
         </w:r>
         <w:r>
           <w:rPr>
@@ -1177,7 +1177,7 @@
           <w:noProof/>
         </w:rPr>
       </w:pPr>
-      <w:hyperlink w:anchor="_Toc243989716" w:history="1">
+      <w:hyperlink w:anchor="_Toc244069487" w:history="1">
         <w:r>
           <w:rPr>
             <w:rStyle w:val="Lienhypertexte"/>
@@ -1204,7 +1204,7 @@
             <w:noProof/>
             <w:webHidden/>
           </w:rPr>
-          <w:instrText xml:space="preserve"> PAGEREF _Toc243989716 \h </w:instrText>
+          <w:instrText xml:space="preserve"> PAGEREF _Toc244069487 \h </w:instrText>
         </w:r>
         <w:r>
           <w:rPr>
@@ -1245,7 +1245,7 @@
           <w:noProof/>
         </w:rPr>
       </w:pPr>
-      <w:hyperlink w:anchor="_Toc243989717" w:history="1">
+      <w:hyperlink w:anchor="_Toc244069488" w:history="1">
         <w:r>
           <w:rPr>
             <w:rStyle w:val="Lienhypertexte"/>
@@ -1272,7 +1272,7 @@
             <w:noProof/>
             <w:webHidden/>
           </w:rPr>
-          <w:instrText xml:space="preserve"> PAGEREF _Toc243989717 \h </w:instrText>
+          <w:instrText xml:space="preserve"> PAGEREF _Toc244069488 \h </w:instrText>
         </w:r>
         <w:r>
           <w:rPr>
@@ -1313,7 +1313,7 @@
           <w:noProof/>
         </w:rPr>
       </w:pPr>
-      <w:hyperlink w:anchor="_Toc243989718" w:history="1">
+      <w:hyperlink w:anchor="_Toc244069489" w:history="1">
         <w:r>
           <w:rPr>
             <w:rStyle w:val="Lienhypertexte"/>
@@ -1340,7 +1340,7 @@
             <w:noProof/>
             <w:webHidden/>
           </w:rPr>
-          <w:instrText xml:space="preserve"> PAGEREF _Toc243989718 \h </w:instrText>
+          <w:instrText xml:space="preserve"> PAGEREF _Toc244069489 \h </w:instrText>
         </w:r>
         <w:r>
           <w:rPr>
@@ -1381,13 +1381,13 @@
           <w:noProof/>
         </w:rPr>
       </w:pPr>
-      <w:hyperlink w:anchor="_Toc243989719" w:history="1">
+      <w:hyperlink w:anchor="_Toc244069490" w:history="1">
         <w:r>
           <w:rPr>
             <w:rStyle w:val="Lienhypertexte"/>
             <w:noProof/>
           </w:rPr>
-          <w:t>5.2 Connexion et import</w:t>
+          <w:t>5.2 Lancement, ouverture de la maquette et import</w:t>
         </w:r>
         <w:r>
           <w:rPr>
@@ -1408,7 +1408,7 @@
             <w:noProof/>
             <w:webHidden/>
           </w:rPr>
-          <w:instrText xml:space="preserve"> PAGEREF _Toc243989719 \h </w:instrText>
+          <w:instrText xml:space="preserve"> PAGEREF _Toc244069490 \h </w:instrText>
         </w:r>
         <w:r>
           <w:rPr>
@@ -1449,7 +1449,7 @@
           <w:noProof/>
         </w:rPr>
       </w:pPr>
-      <w:hyperlink w:anchor="_Toc243989720" w:history="1">
+      <w:hyperlink w:anchor="_Toc244069491" w:history="1">
         <w:r>
           <w:rPr>
             <w:rStyle w:val="Lienhypertexte"/>
@@ -1476,7 +1476,7 @@
             <w:noProof/>
             <w:webHidden/>
           </w:rPr>
-          <w:instrText xml:space="preserve"> PAGEREF _Toc243989720 \h </w:instrText>
+          <w:instrText xml:space="preserve"> PAGEREF _Toc244069491 \h </w:instrText>
         </w:r>
         <w:r>
           <w:rPr>
@@ -1496,7 +1496,7 @@
             <w:noProof/>
             <w:webHidden/>
           </w:rPr>
-          <w:t>11</w:t>
+          <w:t>12</w:t>
         </w:r>
         <w:r>
           <w:rPr>
@@ -1517,7 +1517,7 @@
           <w:noProof/>
         </w:rPr>
       </w:pPr>
-      <w:hyperlink w:anchor="_Toc243989721" w:history="1">
+      <w:hyperlink w:anchor="_Toc244069492" w:history="1">
         <w:r>
           <w:rPr>
             <w:rStyle w:val="Lienhypertexte"/>
@@ -1544,7 +1544,7 @@
             <w:noProof/>
             <w:webHidden/>
           </w:rPr>
-          <w:instrText xml:space="preserve"> PAGEREF _Toc243989721 \h </w:instrText>
+          <w:instrText xml:space="preserve"> PAGEREF _Toc244069492 \h </w:instrText>
         </w:r>
         <w:r>
           <w:rPr>
@@ -1564,7 +1564,7 @@
             <w:noProof/>
             <w:webHidden/>
           </w:rPr>
-          <w:t>13</w:t>
+          <w:t>14</w:t>
         </w:r>
         <w:r>
           <w:rPr>
@@ -1585,7 +1585,7 @@
           <w:noProof/>
         </w:rPr>
       </w:pPr>
-      <w:hyperlink w:anchor="_Toc243989722" w:history="1">
+      <w:hyperlink w:anchor="_Toc244069493" w:history="1">
         <w:r>
           <w:rPr>
             <w:rStyle w:val="Lienhypertexte"/>
@@ -1612,7 +1612,7 @@
             <w:noProof/>
             <w:webHidden/>
           </w:rPr>
-          <w:instrText xml:space="preserve"> PAGEREF _Toc243989722 \h </w:instrText>
+          <w:instrText xml:space="preserve"> PAGEREF _Toc244069493 \h </w:instrText>
         </w:r>
         <w:r>
           <w:rPr>
@@ -1632,7 +1632,7 @@
             <w:noProof/>
             <w:webHidden/>
           </w:rPr>
-          <w:t>14</w:t>
+          <w:t>15</w:t>
         </w:r>
         <w:r>
           <w:rPr>
@@ -1653,7 +1653,7 @@
           <w:noProof/>
         </w:rPr>
       </w:pPr>
-      <w:hyperlink w:anchor="_Toc243989723" w:history="1">
+      <w:hyperlink w:anchor="_Toc244069494" w:history="1">
         <w:r>
           <w:rPr>
             <w:rStyle w:val="Lienhypertexte"/>
@@ -1680,7 +1680,7 @@
             <w:noProof/>
             <w:webHidden/>
           </w:rPr>
-          <w:instrText xml:space="preserve"> PAGEREF _Toc243989723 \h </w:instrText>
+          <w:instrText xml:space="preserve"> PAGEREF _Toc244069494 \h </w:instrText>
         </w:r>
         <w:r>
           <w:rPr>
@@ -1700,7 +1700,7 @@
             <w:noProof/>
             <w:webHidden/>
           </w:rPr>
-          <w:t>15</w:t>
+          <w:t>16</w:t>
         </w:r>
         <w:r>
           <w:rPr>
@@ -1721,7 +1721,7 @@
           <w:noProof/>
         </w:rPr>
       </w:pPr>
-      <w:hyperlink w:anchor="_Toc243989724" w:history="1">
+      <w:hyperlink w:anchor="_Toc244069495" w:history="1">
         <w:r>
           <w:rPr>
             <w:rStyle w:val="Lienhypertexte"/>
@@ -1748,7 +1748,7 @@
             <w:noProof/>
             <w:webHidden/>
           </w:rPr>
-          <w:instrText xml:space="preserve"> PAGEREF _Toc243989724 \h </w:instrText>
+          <w:instrText xml:space="preserve"> PAGEREF _Toc244069495 \h </w:instrText>
         </w:r>
         <w:r>
           <w:rPr>
@@ -1789,7 +1789,7 @@
           <w:noProof/>
         </w:rPr>
       </w:pPr>
-      <w:hyperlink w:anchor="_Toc243989725" w:history="1">
+      <w:hyperlink w:anchor="_Toc244069496" w:history="1">
         <w:r>
           <w:rPr>
             <w:rStyle w:val="Lienhypertexte"/>
@@ -1816,7 +1816,7 @@
             <w:noProof/>
             <w:webHidden/>
           </w:rPr>
-          <w:instrText xml:space="preserve"> PAGEREF _Toc243989725 \h </w:instrText>
+          <w:instrText xml:space="preserve"> PAGEREF _Toc244069496 \h </w:instrText>
         </w:r>
         <w:r>
           <w:rPr>
@@ -1836,7 +1836,7 @@
             <w:noProof/>
             <w:webHidden/>
           </w:rPr>
-          <w:t>16</w:t>
+          <w:t>17</w:t>
         </w:r>
         <w:r>
           <w:rPr>
@@ -1857,7 +1857,7 @@
           <w:noProof/>
         </w:rPr>
       </w:pPr>
-      <w:hyperlink w:anchor="_Toc243989726" w:history="1">
+      <w:hyperlink w:anchor="_Toc244069497" w:history="1">
         <w:r>
           <w:rPr>
             <w:rStyle w:val="Lienhypertexte"/>
@@ -1884,7 +1884,7 @@
             <w:noProof/>
             <w:webHidden/>
           </w:rPr>
-          <w:instrText xml:space="preserve"> PAGEREF _Toc243989726 \h </w:instrText>
+          <w:instrText xml:space="preserve"> PAGEREF _Toc244069497 \h </w:instrText>
         </w:r>
         <w:r>
           <w:rPr>
@@ -1925,7 +1925,7 @@
           <w:noProof/>
         </w:rPr>
       </w:pPr>
-      <w:hyperlink w:anchor="_Toc243989727" w:history="1">
+      <w:hyperlink w:anchor="_Toc244069498" w:history="1">
         <w:r>
           <w:rPr>
             <w:rStyle w:val="Lienhypertexte"/>
@@ -1952,7 +1952,7 @@
             <w:noProof/>
             <w:webHidden/>
           </w:rPr>
-          <w:instrText xml:space="preserve"> PAGEREF _Toc243989727 \h </w:instrText>
+          <w:instrText xml:space="preserve"> PAGEREF _Toc244069498 \h </w:instrText>
         </w:r>
         <w:r>
           <w:rPr>
@@ -1972,7 +1972,7 @@
             <w:noProof/>
             <w:webHidden/>
           </w:rPr>
-          <w:t>19</w:t>
+          <w:t>20</w:t>
         </w:r>
         <w:r>
           <w:rPr>
@@ -1993,7 +1993,7 @@
           <w:noProof/>
         </w:rPr>
       </w:pPr>
-      <w:hyperlink w:anchor="_Toc243989728" w:history="1">
+      <w:hyperlink w:anchor="_Toc244069499" w:history="1">
         <w:r>
           <w:rPr>
             <w:rStyle w:val="Lienhypertexte"/>
@@ -2020,7 +2020,7 @@
             <w:noProof/>
             <w:webHidden/>
           </w:rPr>
-          <w:instrText xml:space="preserve"> PAGEREF _Toc243989728 \h </w:instrText>
+          <w:instrText xml:space="preserve"> PAGEREF _Toc244069499 \h </w:instrText>
         </w:r>
         <w:r>
           <w:rPr>
@@ -2040,7 +2040,7 @@
             <w:noProof/>
             <w:webHidden/>
           </w:rPr>
-          <w:t>20</w:t>
+          <w:t>21</w:t>
         </w:r>
         <w:r>
           <w:rPr>
@@ -2061,7 +2061,7 @@
           <w:noProof/>
         </w:rPr>
       </w:pPr>
-      <w:hyperlink w:anchor="_Toc243989729" w:history="1">
+      <w:hyperlink w:anchor="_Toc244069500" w:history="1">
         <w:r>
           <w:rPr>
             <w:rStyle w:val="Lienhypertexte"/>
@@ -2088,7 +2088,7 @@
             <w:noProof/>
             <w:webHidden/>
           </w:rPr>
-          <w:instrText xml:space="preserve"> PAGEREF _Toc243989729 \h </w:instrText>
+          <w:instrText xml:space="preserve"> PAGEREF _Toc244069500 \h </w:instrText>
         </w:r>
         <w:r>
           <w:rPr>
@@ -2108,7 +2108,7 @@
             <w:noProof/>
             <w:webHidden/>
           </w:rPr>
-          <w:t>20</w:t>
+          <w:t>21</w:t>
         </w:r>
         <w:r>
           <w:rPr>
@@ -2129,7 +2129,7 @@
           <w:noProof/>
         </w:rPr>
       </w:pPr>
-      <w:hyperlink w:anchor="_Toc243989730" w:history="1">
+      <w:hyperlink w:anchor="_Toc244069501" w:history="1">
         <w:r>
           <w:rPr>
             <w:rStyle w:val="Lienhypertexte"/>
@@ -2156,7 +2156,7 @@
             <w:noProof/>
             <w:webHidden/>
           </w:rPr>
-          <w:instrText xml:space="preserve"> PAGEREF _Toc243989730 \h </w:instrText>
+          <w:instrText xml:space="preserve"> PAGEREF _Toc244069501 \h </w:instrText>
         </w:r>
         <w:r>
           <w:rPr>
@@ -2176,7 +2176,7 @@
             <w:noProof/>
             <w:webHidden/>
           </w:rPr>
-          <w:t>20</w:t>
+          <w:t>21</w:t>
         </w:r>
         <w:r>
           <w:rPr>
@@ -2197,7 +2197,7 @@
           <w:noProof/>
         </w:rPr>
       </w:pPr>
-      <w:hyperlink w:anchor="_Toc243989731" w:history="1">
+      <w:hyperlink w:anchor="_Toc244069502" w:history="1">
         <w:r>
           <w:rPr>
             <w:rStyle w:val="Lienhypertexte"/>
@@ -2224,7 +2224,7 @@
             <w:noProof/>
             <w:webHidden/>
           </w:rPr>
-          <w:instrText xml:space="preserve"> PAGEREF _Toc243989731 \h </w:instrText>
+          <w:instrText xml:space="preserve"> PAGEREF _Toc244069502 \h </w:instrText>
         </w:r>
         <w:r>
           <w:rPr>
@@ -2244,7 +2244,7 @@
             <w:noProof/>
             <w:webHidden/>
           </w:rPr>
-          <w:t>20</w:t>
+          <w:t>21</w:t>
         </w:r>
         <w:r>
           <w:rPr>
@@ -2265,7 +2265,7 @@
           <w:noProof/>
         </w:rPr>
       </w:pPr>
-      <w:hyperlink w:anchor="_Toc243989732" w:history="1">
+      <w:hyperlink w:anchor="_Toc244069503" w:history="1">
         <w:r>
           <w:rPr>
             <w:rStyle w:val="Lienhypertexte"/>
@@ -2292,7 +2292,7 @@
             <w:noProof/>
             <w:webHidden/>
           </w:rPr>
-          <w:instrText xml:space="preserve"> PAGEREF _Toc243989732 \h </w:instrText>
+          <w:instrText xml:space="preserve"> PAGEREF _Toc244069503 \h </w:instrText>
         </w:r>
         <w:r>
           <w:rPr>
@@ -2312,7 +2312,7 @@
             <w:noProof/>
             <w:webHidden/>
           </w:rPr>
-          <w:t>21</w:t>
+          <w:t>22</w:t>
         </w:r>
         <w:r>
           <w:rPr>
@@ -2333,7 +2333,7 @@
           <w:noProof/>
         </w:rPr>
       </w:pPr>
-      <w:hyperlink w:anchor="_Toc243989733" w:history="1">
+      <w:hyperlink w:anchor="_Toc244069504" w:history="1">
         <w:r>
           <w:rPr>
             <w:rStyle w:val="Lienhypertexte"/>
@@ -2360,7 +2360,7 @@
             <w:noProof/>
             <w:webHidden/>
           </w:rPr>
-          <w:instrText xml:space="preserve"> PAGEREF _Toc243989733 \h </w:instrText>
+          <w:instrText xml:space="preserve"> PAGEREF _Toc244069504 \h </w:instrText>
         </w:r>
         <w:r>
           <w:rPr>
@@ -2380,7 +2380,7 @@
             <w:noProof/>
             <w:webHidden/>
           </w:rPr>
-          <w:t>21</w:t>
+          <w:t>22</w:t>
         </w:r>
         <w:r>
           <w:rPr>
@@ -2401,7 +2401,7 @@
           <w:noProof/>
         </w:rPr>
       </w:pPr>
-      <w:hyperlink w:anchor="_Toc243989734" w:history="1">
+      <w:hyperlink w:anchor="_Toc244069505" w:history="1">
         <w:r>
           <w:rPr>
             <w:rStyle w:val="Lienhypertexte"/>
@@ -2428,7 +2428,7 @@
             <w:noProof/>
             <w:webHidden/>
           </w:rPr>
-          <w:instrText xml:space="preserve"> PAGEREF _Toc243989734 \h </w:instrText>
+          <w:instrText xml:space="preserve"> PAGEREF _Toc244069505 \h </w:instrText>
         </w:r>
         <w:r>
           <w:rPr>
@@ -2448,7 +2448,7 @@
             <w:noProof/>
             <w:webHidden/>
           </w:rPr>
-          <w:t>22</w:t>
+          <w:t>23</w:t>
         </w:r>
         <w:r>
           <w:rPr>
@@ -2469,7 +2469,7 @@
           <w:noProof/>
         </w:rPr>
       </w:pPr>
-      <w:hyperlink w:anchor="_Toc243989735" w:history="1">
+      <w:hyperlink w:anchor="_Toc244069506" w:history="1">
         <w:r>
           <w:rPr>
             <w:rStyle w:val="Lienhypertexte"/>
@@ -2496,7 +2496,7 @@
             <w:noProof/>
             <w:webHidden/>
           </w:rPr>
-          <w:instrText xml:space="preserve"> PAGEREF _Toc243989735 \h </w:instrText>
+          <w:instrText xml:space="preserve"> PAGEREF _Toc244069506 \h </w:instrText>
         </w:r>
         <w:r>
           <w:rPr>
@@ -2516,7 +2516,7 @@
             <w:noProof/>
             <w:webHidden/>
           </w:rPr>
-          <w:t>23</w:t>
+          <w:t>24</w:t>
         </w:r>
         <w:r>
           <w:rPr>
@@ -2537,7 +2537,7 @@
           <w:noProof/>
         </w:rPr>
       </w:pPr>
-      <w:hyperlink w:anchor="_Toc243989736" w:history="1">
+      <w:hyperlink w:anchor="_Toc244069507" w:history="1">
         <w:r>
           <w:rPr>
             <w:rStyle w:val="Lienhypertexte"/>
@@ -2564,7 +2564,7 @@
             <w:noProof/>
             <w:webHidden/>
           </w:rPr>
-          <w:instrText xml:space="preserve"> PAGEREF _Toc243989736 \h </w:instrText>
+          <w:instrText xml:space="preserve"> PAGEREF _Toc244069507 \h </w:instrText>
         </w:r>
         <w:r>
           <w:rPr>
@@ -2584,7 +2584,7 @@
             <w:noProof/>
             <w:webHidden/>
           </w:rPr>
-          <w:t>23</w:t>
+          <w:t>24</w:t>
         </w:r>
         <w:r>
           <w:rPr>
@@ -2605,7 +2605,7 @@
           <w:noProof/>
         </w:rPr>
       </w:pPr>
-      <w:hyperlink w:anchor="_Toc243989737" w:history="1">
+      <w:hyperlink w:anchor="_Toc244069508" w:history="1">
         <w:r>
           <w:rPr>
             <w:rStyle w:val="Lienhypertexte"/>
@@ -2632,7 +2632,7 @@
             <w:noProof/>
             <w:webHidden/>
           </w:rPr>
-          <w:instrText xml:space="preserve"> PAGEREF _Toc243989737 \h </w:instrText>
+          <w:instrText xml:space="preserve"> PAGEREF _Toc244069508 \h </w:instrText>
         </w:r>
         <w:r>
           <w:rPr>
@@ -2652,7 +2652,7 @@
             <w:noProof/>
             <w:webHidden/>
           </w:rPr>
-          <w:t>24</w:t>
+          <w:t>25</w:t>
         </w:r>
         <w:r>
           <w:rPr>
@@ -2673,7 +2673,7 @@
           <w:noProof/>
         </w:rPr>
       </w:pPr>
-      <w:hyperlink w:anchor="_Toc243989738" w:history="1">
+      <w:hyperlink w:anchor="_Toc244069509" w:history="1">
         <w:r>
           <w:rPr>
             <w:rStyle w:val="Lienhypertexte"/>
@@ -2700,7 +2700,7 @@
             <w:noProof/>
             <w:webHidden/>
           </w:rPr>
-          <w:instrText xml:space="preserve"> PAGEREF _Toc243989738 \h </w:instrText>
+          <w:instrText xml:space="preserve"> PAGEREF _Toc244069509 \h </w:instrText>
         </w:r>
         <w:r>
           <w:rPr>
@@ -2720,7 +2720,7 @@
             <w:noProof/>
             <w:webHidden/>
           </w:rPr>
-          <w:t>25</w:t>
+          <w:t>26</w:t>
         </w:r>
         <w:r>
           <w:rPr>
@@ -2741,7 +2741,7 @@
           <w:noProof/>
         </w:rPr>
       </w:pPr>
-      <w:hyperlink w:anchor="_Toc243989739" w:history="1">
+      <w:hyperlink w:anchor="_Toc244069510" w:history="1">
         <w:r>
           <w:rPr>
             <w:rStyle w:val="Lienhypertexte"/>
@@ -2768,7 +2768,7 @@
             <w:noProof/>
             <w:webHidden/>
           </w:rPr>
-          <w:instrText xml:space="preserve"> PAGEREF _Toc243989739 \h </w:instrText>
+          <w:instrText xml:space="preserve"> PAGEREF _Toc244069510 \h </w:instrText>
         </w:r>
         <w:r>
           <w:rPr>
@@ -2788,7 +2788,7 @@
             <w:noProof/>
             <w:webHidden/>
           </w:rPr>
-          <w:t>26</w:t>
+          <w:t>27</w:t>
         </w:r>
         <w:r>
           <w:rPr>
@@ -2809,7 +2809,7 @@
           <w:noProof/>
         </w:rPr>
       </w:pPr>
-      <w:hyperlink w:anchor="_Toc243989740" w:history="1">
+      <w:hyperlink w:anchor="_Toc244069511" w:history="1">
         <w:r>
           <w:rPr>
             <w:rStyle w:val="Lienhypertexte"/>
@@ -2836,7 +2836,7 @@
             <w:noProof/>
             <w:webHidden/>
           </w:rPr>
-          <w:instrText xml:space="preserve"> PAGEREF _Toc243989740 \h </w:instrText>
+          <w:instrText xml:space="preserve"> PAGEREF _Toc244069511 \h </w:instrText>
         </w:r>
         <w:r>
           <w:rPr>
@@ -2856,7 +2856,7 @@
             <w:noProof/>
             <w:webHidden/>
           </w:rPr>
-          <w:t>26</w:t>
+          <w:t>27</w:t>
         </w:r>
         <w:r>
           <w:rPr>
@@ -2877,7 +2877,7 @@
           <w:noProof/>
         </w:rPr>
       </w:pPr>
-      <w:hyperlink w:anchor="_Toc243989741" w:history="1">
+      <w:hyperlink w:anchor="_Toc244069512" w:history="1">
         <w:r>
           <w:rPr>
             <w:rStyle w:val="Lienhypertexte"/>
@@ -2904,7 +2904,7 @@
             <w:noProof/>
             <w:webHidden/>
           </w:rPr>
-          <w:instrText xml:space="preserve"> PAGEREF _Toc243989741 \h </w:instrText>
+          <w:instrText xml:space="preserve"> PAGEREF _Toc244069512 \h </w:instrText>
         </w:r>
         <w:r>
           <w:rPr>
@@ -2924,7 +2924,7 @@
             <w:noProof/>
             <w:webHidden/>
           </w:rPr>
-          <w:t>26</w:t>
+          <w:t>27</w:t>
         </w:r>
         <w:r>
           <w:rPr>
@@ -2945,7 +2945,7 @@
           <w:noProof/>
         </w:rPr>
       </w:pPr>
-      <w:hyperlink w:anchor="_Toc243989742" w:history="1">
+      <w:hyperlink w:anchor="_Toc244069513" w:history="1">
         <w:r>
           <w:rPr>
             <w:rStyle w:val="Lienhypertexte"/>
@@ -2972,7 +2972,7 @@
             <w:noProof/>
             <w:webHidden/>
           </w:rPr>
-          <w:instrText xml:space="preserve"> PAGEREF _Toc243989742 \h </w:instrText>
+          <w:instrText xml:space="preserve"> PAGEREF _Toc244069513 \h </w:instrText>
         </w:r>
         <w:r>
           <w:rPr>
@@ -2992,7 +2992,7 @@
             <w:noProof/>
             <w:webHidden/>
           </w:rPr>
-          <w:t>26</w:t>
+          <w:t>27</w:t>
         </w:r>
         <w:r>
           <w:rPr>
@@ -3013,7 +3013,7 @@
           <w:noProof/>
         </w:rPr>
       </w:pPr>
-      <w:hyperlink w:anchor="_Toc243989743" w:history="1">
+      <w:hyperlink w:anchor="_Toc244069514" w:history="1">
         <w:r>
           <w:rPr>
             <w:rStyle w:val="Lienhypertexte"/>
@@ -3040,7 +3040,7 @@
             <w:noProof/>
             <w:webHidden/>
           </w:rPr>
-          <w:instrText xml:space="preserve"> PAGEREF _Toc243989743 \h </w:instrText>
+          <w:instrText xml:space="preserve"> PAGEREF _Toc244069514 \h </w:instrText>
         </w:r>
         <w:r>
           <w:rPr>
@@ -3060,7 +3060,7 @@
             <w:noProof/>
             <w:webHidden/>
           </w:rPr>
-          <w:t>27</w:t>
+          <w:t>28</w:t>
         </w:r>
         <w:r>
           <w:rPr>
@@ -3081,7 +3081,7 @@
           <w:noProof/>
         </w:rPr>
       </w:pPr>
-      <w:hyperlink w:anchor="_Toc243989744" w:history="1">
+      <w:hyperlink w:anchor="_Toc244069515" w:history="1">
         <w:r>
           <w:rPr>
             <w:rStyle w:val="Lienhypertexte"/>
@@ -3108,7 +3108,7 @@
             <w:noProof/>
             <w:webHidden/>
           </w:rPr>
-          <w:instrText xml:space="preserve"> PAGEREF _Toc243989744 \h </w:instrText>
+          <w:instrText xml:space="preserve"> PAGEREF _Toc244069515 \h </w:instrText>
         </w:r>
         <w:r>
           <w:rPr>
@@ -3128,7 +3128,7 @@
             <w:noProof/>
             <w:webHidden/>
           </w:rPr>
-          <w:t>28</w:t>
+          <w:t>29</w:t>
         </w:r>
         <w:r>
           <w:rPr>
@@ -3149,7 +3149,7 @@
           <w:noProof/>
         </w:rPr>
       </w:pPr>
-      <w:hyperlink w:anchor="_Toc243989745" w:history="1">
+      <w:hyperlink w:anchor="_Toc244069516" w:history="1">
         <w:r>
           <w:rPr>
             <w:rStyle w:val="Lienhypertexte"/>
@@ -3176,7 +3176,7 @@
             <w:noProof/>
             <w:webHidden/>
           </w:rPr>
-          <w:instrText xml:space="preserve"> PAGEREF _Toc243989745 \h </w:instrText>
+          <w:instrText xml:space="preserve"> PAGEREF _Toc244069516 \h </w:instrText>
         </w:r>
         <w:r>
           <w:rPr>
@@ -3196,7 +3196,7 @@
             <w:noProof/>
             <w:webHidden/>
           </w:rPr>
-          <w:t>30</w:t>
+          <w:t>31</w:t>
         </w:r>
         <w:r>
           <w:rPr>
@@ -3233,7 +3233,7 @@
       <w:pPr>
         <w:pStyle w:val="Titre1"/>
       </w:pPr>
-      <w:bookmarkStart w:id="1" w:name="_Toc243989703"/>
+      <w:bookmarkStart w:id="1" w:name="_Toc244069474"/>
       <w:r>
         <w:t>Présentation</w:t>
       </w:r>
@@ -3292,7 +3292,7 @@
       <w:pPr>
         <w:pStyle w:val="Titre2"/>
       </w:pPr>
-      <w:bookmarkStart w:id="2" w:name="_Toc243989704"/>
+      <w:bookmarkStart w:id="2" w:name="_Toc244069475"/>
       <w:r>
         <w:t>Chaîne de calcul</w:t>
       </w:r>
@@ -3702,7 +3702,7 @@
       <w:pPr>
         <w:pStyle w:val="Titre2"/>
       </w:pPr>
-      <w:bookmarkStart w:id="3" w:name="_Toc243989705"/>
+      <w:bookmarkStart w:id="3" w:name="_Toc244069476"/>
       <w:r>
         <w:t>Ce que Meca3D calcule</w:t>
       </w:r>
@@ -3862,7 +3862,7 @@
       <w:pPr>
         <w:pStyle w:val="Titre2"/>
       </w:pPr>
-      <w:bookmarkStart w:id="4" w:name="_Toc243989706"/>
+      <w:bookmarkStart w:id="4" w:name="_Toc244069477"/>
       <w:r>
         <w:t>Public et contexte d'usage</w:t>
       </w:r>
@@ -3873,7 +3873,7 @@
         <w:rPr>
           <w:rFonts w:cs="Aptos"/>
         </w:rPr>
-        <w:t>Meca3D s'adresse aux élèves ingénieurs, en TP encadré comme chez eux, et aux enseignants pour la préparation des maquettes, les démonstrations et les corrigés. Il fonctionne sous Windows 11. SolidCraft est lancé à côté, maquette ouverte ; Meca3D s'y connecte, lit le mécanisme, puis renvoie le mouvement simulé dans la maquette.</w:t>
+        <w:t>Meca3D s'adresse aux élèves ingénieurs, en TP encadré comme chez eux, et aux enseignants pour la préparation des maquettes, les démonstrations et les corrigés. Il fonctionne sous Windows 11. Tout se pilote depuis Meca3D : il lance SolidCraft, y ouvre la maquette, lit le mécanisme, puis renvoie le mouvement simulé dans la maquette.</w:t>
       </w:r>
     </w:p>
     <w:tbl>
@@ -3976,7 +3976,7 @@
       <w:pPr>
         <w:pStyle w:val="Titre1"/>
       </w:pPr>
-      <w:bookmarkStart w:id="5" w:name="_Toc243989707"/>
+      <w:bookmarkStart w:id="5" w:name="_Toc244069478"/>
       <w:r>
         <w:t>Installation</w:t>
       </w:r>
@@ -3986,7 +3986,7 @@
       <w:pPr>
         <w:pStyle w:val="Titre2"/>
       </w:pPr>
-      <w:bookmarkStart w:id="6" w:name="_Toc243989708"/>
+      <w:bookmarkStart w:id="6" w:name="_Toc244069479"/>
       <w:r>
         <w:t>Prérequis</w:t>
       </w:r>
@@ -4251,7 +4251,7 @@
       <w:pPr>
         <w:pStyle w:val="Titre2"/>
       </w:pPr>
-      <w:bookmarkStart w:id="7" w:name="_Toc243989709"/>
+      <w:bookmarkStart w:id="7" w:name="_Toc244069480"/>
       <w:r>
         <w:t>Installer l'exécutable</w:t>
       </w:r>
@@ -4505,7 +4505,7 @@
       <w:pPr>
         <w:pStyle w:val="Titre2"/>
       </w:pPr>
-      <w:bookmarkStart w:id="8" w:name="_Toc243989710"/>
+      <w:bookmarkStart w:id="8" w:name="_Toc244069481"/>
       <w:r>
         <w:t>Préparer SolidCraft</w:t>
       </w:r>
@@ -4516,20 +4516,39 @@
         <w:rPr>
           <w:rFonts w:cs="Aptos"/>
         </w:rPr>
-        <w:t xml:space="preserve">Meca3D dialogue avec SolidCraft par son </w:t>
+        <w:t xml:space="preserve">SolidCraft 0.15.0 est livré en version </w:t>
       </w:r>
       <w:r>
         <w:rPr>
           <w:rFonts w:cs="Aptos"/>
           <w:b/>
         </w:rPr>
-        <w:t>canal de contrôle</w:t>
+        <w:t>portable</w:t>
       </w:r>
       <w:r>
         <w:rPr>
           <w:rFonts w:cs="Aptos"/>
         </w:rPr>
-        <w:t xml:space="preserve"> local (TCP sur 127.0.0.1, authentifié par un jeton que SolidCraft écrit dans son dossier de contrôle). Aucun réglage n'est nécessaire : Meca3D lit le port courant dans </w:t>
+        <w:t> </w:t>
+      </w:r>
+      <w:r>
+        <w:rPr>
+          <w:rFonts w:cs="Aptos"/>
+        </w:rPr>
+        <w:t xml:space="preserve">: une archive à décompresser, sans installation. La décompresser </w:t>
+      </w:r>
+      <w:r>
+        <w:rPr>
+          <w:rFonts w:cs="Aptos"/>
+          <w:b/>
+        </w:rPr>
+        <w:t>à côté de Meca3D</w:t>
+      </w:r>
+      <w:r>
+        <w:rPr>
+          <w:rFonts w:cs="Aptos"/>
+        </w:rPr>
+        <w:t xml:space="preserve">, dans le dossier qui contient le dossier </w:t>
       </w:r>
       <w:r>
         <w:rPr>
@@ -4537,13 +4556,13 @@
           <w:color w:val="1B3A6B"/>
           <w:sz w:val="19"/>
         </w:rPr>
-        <w:t>%LOCALAPPDATA%\SolidCraft\control\current.port</w:t>
+        <w:t>meca3d</w:t>
       </w:r>
       <w:r>
         <w:rPr>
           <w:rFonts w:cs="Aptos"/>
         </w:rPr>
-        <w:t xml:space="preserve">, et à défaut utilise le port 27878. Pour imposer un port, lancer SolidCraft avec l'option </w:t>
+        <w:t xml:space="preserve"> (celui de </w:t>
       </w:r>
       <w:r>
         <w:rPr>
@@ -4551,13 +4570,103 @@
           <w:color w:val="1B3A6B"/>
           <w:sz w:val="19"/>
         </w:rPr>
+        <w:t>meca3d.exe</w:t>
+      </w:r>
+      <w:r>
+        <w:rPr>
+          <w:rFonts w:cs="Aptos"/>
+        </w:rPr>
+        <w:t xml:space="preserve">) : Meca3D y trouve </w:t>
+      </w:r>
+      <w:r>
+        <w:rPr>
+          <w:rFonts w:ascii="Cascadia Mono" w:eastAsia="Cascadia Mono" w:hAnsi="Cascadia Mono" w:cs="Cascadia Mono"/>
+          <w:color w:val="1B3A6B"/>
+          <w:sz w:val="19"/>
+        </w:rPr>
+        <w:t>solidcraft.exe</w:t>
+      </w:r>
+      <w:r>
+        <w:rPr>
+          <w:rFonts w:cs="Aptos"/>
+        </w:rPr>
+        <w:t xml:space="preserve"> tout seul, jusqu'à deux niveaux de sous-dossiers. Sinon, il demande une seule fois où se trouve </w:t>
+      </w:r>
+      <w:r>
+        <w:rPr>
+          <w:rFonts w:ascii="Cascadia Mono" w:eastAsia="Cascadia Mono" w:hAnsi="Cascadia Mono" w:cs="Cascadia Mono"/>
+          <w:color w:val="1B3A6B"/>
+          <w:sz w:val="19"/>
+        </w:rPr>
+        <w:t>solidcraft.exe</w:t>
+      </w:r>
+      <w:r>
+        <w:rPr>
+          <w:rFonts w:cs="Aptos"/>
+        </w:rPr>
+        <w:t xml:space="preserve"> et s'en souvient ; </w:t>
+      </w:r>
+      <w:r>
+        <w:rPr>
+          <w:rFonts w:cs="Aptos"/>
+          <w:b/>
+        </w:rPr>
+        <w:t>SolidCraft → Emplacement de SolidCraft…</w:t>
+      </w:r>
+      <w:r>
+        <w:rPr>
+          <w:rFonts w:cs="Aptos"/>
+        </w:rPr>
+        <w:t xml:space="preserve"> permet de changer ce choix.</w:t>
+      </w:r>
+    </w:p>
+    <w:p>
+      <w:r>
+        <w:rPr>
+          <w:rFonts w:cs="Aptos"/>
+        </w:rPr>
+        <w:t xml:space="preserve">Meca3D dialogue avec SolidCraft par son </w:t>
+      </w:r>
+      <w:r>
+        <w:rPr>
+          <w:rFonts w:cs="Aptos"/>
+          <w:b/>
+        </w:rPr>
+        <w:t>canal de contrôle</w:t>
+      </w:r>
+      <w:r>
+        <w:rPr>
+          <w:rFonts w:cs="Aptos"/>
+        </w:rPr>
+        <w:t xml:space="preserve"> local (TCP sur 127.0.0.1, authentifié par un jeton que SolidCraft écrit dans son dossier de contrôle). Quand Meca3D lance SolidCraft, il lui passe l'option </w:t>
+      </w:r>
+      <w:r>
+        <w:rPr>
+          <w:rFonts w:ascii="Cascadia Mono" w:eastAsia="Cascadia Mono" w:hAnsi="Cascadia Mono" w:cs="Cascadia Mono"/>
+          <w:color w:val="1B3A6B"/>
+          <w:sz w:val="19"/>
+        </w:rPr>
         <w:t>--control 7878</w:t>
       </w:r>
       <w:r>
         <w:rPr>
           <w:rFonts w:cs="Aptos"/>
         </w:rPr>
-        <w:t>.</w:t>
+        <w:t xml:space="preserve"> et s'y connecte. Un SolidCraft ouvert à la main est trouvé par le port courant, lu dans </w:t>
+      </w:r>
+      <w:r>
+        <w:rPr>
+          <w:rFonts w:ascii="Cascadia Mono" w:eastAsia="Cascadia Mono" w:hAnsi="Cascadia Mono" w:cs="Cascadia Mono"/>
+          <w:color w:val="1B3A6B"/>
+          <w:sz w:val="19"/>
+        </w:rPr>
+        <w:t>%LOCALAPPDATA%\SolidCraft\control\current.port</w:t>
+      </w:r>
+      <w:r>
+        <w:rPr>
+          <w:rFonts w:cs="Aptos"/>
+        </w:rPr>
+        <w:t xml:space="preserve"> (27878 à défaut).</w:t>
       </w:r>
     </w:p>
     <w:tbl>
@@ -4629,7 +4738,7 @@
       <w:pPr>
         <w:pStyle w:val="Titre2"/>
       </w:pPr>
-      <w:bookmarkStart w:id="9" w:name="_Toc243989711"/>
+      <w:bookmarkStart w:id="9" w:name="_Toc244069482"/>
       <w:r>
         <w:t>Installation depuis les sources (enseignants, développeurs)</w:t>
       </w:r>
@@ -4729,7 +4838,7 @@
           <w:noProof/>
         </w:rPr>
         <w:drawing>
-          <wp:inline distT="0" distB="0" distL="0" distR="0" wp14:anchorId="7782475F" wp14:editId="5BF8EEFC">
+          <wp:inline distT="0" distB="0" distL="0" distR="0" wp14:anchorId="59BCD264" wp14:editId="3BE02C88">
             <wp:extent cx="5976000" cy="50800"/>
             <wp:effectExtent l="0" t="0" r="0" b="0"/>
             <wp:docPr id="2" name="Picture 2"/>
@@ -4785,7 +4894,7 @@
       <w:pPr>
         <w:pStyle w:val="Titre1"/>
       </w:pPr>
-      <w:bookmarkStart w:id="10" w:name="_Toc243989712"/>
+      <w:bookmarkStart w:id="10" w:name="_Toc244069483"/>
       <w:r>
         <w:t>Prise en main en cinq minutes</w:t>
       </w:r>
@@ -4841,34 +4950,20 @@
         <w:rPr>
           <w:rFonts w:cs="Aptos"/>
         </w:rPr>
-        <w:t xml:space="preserve">Lancer Meca3D, puis </w:t>
+        <w:t xml:space="preserve">Lancer Meca3D. S'il propose de lancer SolidCraft, répondre </w:t>
       </w:r>
       <w:r>
         <w:rPr>
           <w:rFonts w:cs="Aptos"/>
           <w:b/>
         </w:rPr>
-        <w:t>Fichier → Ouvrir une étude…</w:t>
+        <w:t>Non</w:t>
       </w:r>
       <w:r>
         <w:rPr>
           <w:rFonts w:cs="Aptos"/>
         </w:rPr>
-        <w:t xml:space="preserve"> et choisir </w:t>
-      </w:r>
-      <w:r>
-        <w:rPr>
-          <w:rFonts w:ascii="Cascadia Mono" w:eastAsia="Cascadia Mono" w:hAnsi="Cascadia Mono" w:cs="Cascadia Mono"/>
-          <w:color w:val="1B3A6B"/>
-          <w:sz w:val="19"/>
-        </w:rPr>
-        <w:t>exemples\bielle_manivelle.meca3d</w:t>
-      </w:r>
-      <w:r>
-        <w:rPr>
-          <w:rFonts w:cs="Aptos"/>
-        </w:rPr>
-        <w:t>.</w:t>
+        <w:t xml:space="preserve"> pour cet essai.</w:t>
       </w:r>
     </w:p>
     <w:p>
@@ -4898,27 +4993,42 @@
       <w:r>
         <w:rPr>
           <w:rFonts w:cs="Aptos"/>
-        </w:rPr>
-        <w:t xml:space="preserve">Dans l'arbre, cliquer sur </w:t>
+          <w:b/>
+        </w:rPr>
+        <w:t>Fichier → Ouvrir une étude…</w:t>
+      </w:r>
+      <w:r>
+        <w:rPr>
+          <w:rFonts w:cs="Aptos"/>
+        </w:rPr>
+        <w:t xml:space="preserve"> et choisir </w:t>
+      </w:r>
+      <w:r>
+        <w:rPr>
+          <w:rFonts w:ascii="Cascadia Mono" w:eastAsia="Cascadia Mono" w:hAnsi="Cascadia Mono" w:cs="Cascadia Mono"/>
+          <w:color w:val="1B3A6B"/>
+          <w:sz w:val="19"/>
+        </w:rPr>
+        <w:t>exemples\bielle_manivelle.meca3d</w:t>
+      </w:r>
+      <w:r>
+        <w:rPr>
+          <w:rFonts w:cs="Aptos"/>
+        </w:rPr>
+        <w:t xml:space="preserve">. Meca3D propose d'ouvrir la maquette dans SolidCraft : répondre </w:t>
       </w:r>
       <w:r>
         <w:rPr>
           <w:rFonts w:cs="Aptos"/>
           <w:b/>
         </w:rPr>
-        <w:t>Graphe</w:t>
+        <w:t>Non</w:t>
       </w:r>
       <w:r>
         <w:rPr>
           <w:rFonts w:cs="Aptos"/>
         </w:rPr>
-        <w:t> </w:t>
-      </w:r>
-      <w:r>
-        <w:rPr>
-          <w:rFonts w:cs="Aptos"/>
-        </w:rPr>
-        <w:t>: le graphe des liaisons s'affiche avec μ = 1, m = 1, h = 0. Le mécanisme est isostatique et mobile.</w:t>
+        <w:t xml:space="preserve"> ici aussi.</w:t>
       </w:r>
     </w:p>
     <w:p>
@@ -4949,20 +5059,26 @@
         <w:rPr>
           <w:rFonts w:cs="Aptos"/>
         </w:rPr>
-        <w:t xml:space="preserve">Cliquer sur </w:t>
+        <w:t xml:space="preserve">Dans l'arbre, cliquer sur </w:t>
       </w:r>
       <w:r>
         <w:rPr>
           <w:rFonts w:cs="Aptos"/>
           <w:b/>
         </w:rPr>
-        <w:t>Simuler (dynamique)</w:t>
+        <w:t>Graphe</w:t>
       </w:r>
       <w:r>
         <w:rPr>
           <w:rFonts w:cs="Aptos"/>
         </w:rPr>
-        <w:t>. Le calcul tourne dans un processus séparé ; la barre d'état montre sa progression (quelques secondes).</w:t>
+        <w:t> </w:t>
+      </w:r>
+      <w:r>
+        <w:rPr>
+          <w:rFonts w:cs="Aptos"/>
+        </w:rPr>
+        <w:t>: le graphe des liaisons s'affiche avec μ = 1, m = 1, h = 0. Le mécanisme est isostatique et mobile.</w:t>
       </w:r>
     </w:p>
     <w:p>
@@ -4993,40 +5109,20 @@
         <w:rPr>
           <w:rFonts w:cs="Aptos"/>
         </w:rPr>
-        <w:t xml:space="preserve">Dans l'onglet </w:t>
+        <w:t xml:space="preserve">Cliquer sur </w:t>
       </w:r>
       <w:r>
         <w:rPr>
           <w:rFonts w:cs="Aptos"/>
           <w:b/>
         </w:rPr>
-        <w:t>Courbes</w:t>
+        <w:t>Simuler (dynamique)</w:t>
       </w:r>
       <w:r>
         <w:rPr>
           <w:rFonts w:cs="Aptos"/>
         </w:rPr>
-        <w:t xml:space="preserve">, choisir en ordonnée </w:t>
-      </w:r>
-      <w:r>
-        <w:rPr>
-          <w:rFonts w:ascii="Cascadia Mono" w:eastAsia="Cascadia Mono" w:hAnsi="Cascadia Mono" w:cs="Cascadia Mono"/>
-          <w:color w:val="1B3A6B"/>
-          <w:sz w:val="19"/>
-        </w:rPr>
-        <w:t>B_piston x (m)</w:t>
-      </w:r>
-      <w:r>
-        <w:rPr>
-          <w:rFonts w:cs="Aptos"/>
-        </w:rPr>
-        <w:t> </w:t>
-      </w:r>
-      <w:r>
-        <w:rPr>
-          <w:rFonts w:cs="Aptos"/>
-        </w:rPr>
-        <w:t>: la course du piston, de 0,2 à 0,4 m.</w:t>
+        <w:t>. Le calcul tourne dans un processus séparé ; la barre d'état montre sa progression (quelques secondes).</w:t>
       </w:r>
     </w:p>
     <w:p>
@@ -5064,13 +5160,33 @@
           <w:rFonts w:cs="Aptos"/>
           <w:b/>
         </w:rPr>
-        <w:t>Torseurs</w:t>
+        <w:t>Courbes</w:t>
       </w:r>
       <w:r>
         <w:rPr>
           <w:rFonts w:cs="Aptos"/>
         </w:rPr>
-        <w:t>, déplacer le curseur temporel pour lire les efforts dans chaque liaison à chaque instant.</w:t>
+        <w:t xml:space="preserve">, choisir en ordonnée </w:t>
+      </w:r>
+      <w:r>
+        <w:rPr>
+          <w:rFonts w:ascii="Cascadia Mono" w:eastAsia="Cascadia Mono" w:hAnsi="Cascadia Mono" w:cs="Cascadia Mono"/>
+          <w:color w:val="1B3A6B"/>
+          <w:sz w:val="19"/>
+        </w:rPr>
+        <w:t>B_piston x (m)</w:t>
+      </w:r>
+      <w:r>
+        <w:rPr>
+          <w:rFonts w:cs="Aptos"/>
+        </w:rPr>
+        <w:t> </w:t>
+      </w:r>
+      <w:r>
+        <w:rPr>
+          <w:rFonts w:cs="Aptos"/>
+        </w:rPr>
+        <w:t>: la course du piston, de 0,2 à 0,4 m.</w:t>
       </w:r>
     </w:p>
     <w:p>
@@ -5100,6 +5216,50 @@
       <w:r>
         <w:rPr>
           <w:rFonts w:cs="Aptos"/>
+        </w:rPr>
+        <w:t xml:space="preserve">Dans l'onglet </w:t>
+      </w:r>
+      <w:r>
+        <w:rPr>
+          <w:rFonts w:cs="Aptos"/>
+          <w:b/>
+        </w:rPr>
+        <w:t>Torseurs</w:t>
+      </w:r>
+      <w:r>
+        <w:rPr>
+          <w:rFonts w:cs="Aptos"/>
+        </w:rPr>
+        <w:t>, déplacer le curseur temporel pour lire les efforts dans chaque liaison à chaque instant.</w:t>
+      </w:r>
+    </w:p>
+    <w:p>
+      <w:pPr>
+        <w:tabs>
+          <w:tab w:val="left" w:pos="397"/>
+        </w:tabs>
+        <w:spacing w:after="60"/>
+        <w:ind w:left="397" w:hanging="397"/>
+      </w:pPr>
+      <w:r>
+        <w:rPr>
+          <w:rFonts w:ascii="Cascadia Mono" w:eastAsia="Cascadia Mono" w:hAnsi="Cascadia Mono" w:cs="Cascadia Mono"/>
+          <w:color w:val="00B4D8"/>
+          <w:sz w:val="20"/>
+        </w:rPr>
+        <w:t>7.</w:t>
+      </w:r>
+      <w:r>
+        <w:rPr>
+          <w:rFonts w:ascii="Cascadia Mono" w:eastAsia="Cascadia Mono" w:hAnsi="Cascadia Mono" w:cs="Cascadia Mono"/>
+          <w:color w:val="00B4D8"/>
+          <w:sz w:val="20"/>
+        </w:rPr>
+        <w:tab/>
+      </w:r>
+      <w:r>
+        <w:rPr>
+          <w:rFonts w:cs="Aptos"/>
           <w:b/>
         </w:rPr>
         <w:t>Fichier → Exporter les résultats en CSV…</w:t>
@@ -5122,7 +5282,7 @@
           <w:noProof/>
         </w:rPr>
         <w:drawing>
-          <wp:inline distT="0" distB="0" distL="0" distR="0" wp14:anchorId="77F533E7" wp14:editId="14D51683">
+          <wp:inline distT="0" distB="0" distL="0" distR="0" wp14:anchorId="22192DF5" wp14:editId="3B04CD98">
             <wp:extent cx="5976000" cy="3548250"/>
             <wp:effectExtent l="0" t="0" r="0" b="0"/>
             <wp:docPr id="3" name="Picture 3"/>
@@ -5182,7 +5342,7 @@
           <w:noProof/>
         </w:rPr>
         <w:drawing>
-          <wp:inline distT="0" distB="0" distL="0" distR="0" wp14:anchorId="4DCD6127" wp14:editId="5B14EC88">
+          <wp:inline distT="0" distB="0" distL="0" distR="0" wp14:anchorId="425025E6" wp14:editId="17CAAEB1">
             <wp:extent cx="5976000" cy="3548250"/>
             <wp:effectExtent l="0" t="0" r="0" b="0"/>
             <wp:docPr id="4" name="Picture 4"/>
@@ -5240,7 +5400,7 @@
           <w:noProof/>
         </w:rPr>
         <w:drawing>
-          <wp:inline distT="0" distB="0" distL="0" distR="0" wp14:anchorId="4CC315AA" wp14:editId="7323090D">
+          <wp:inline distT="0" distB="0" distL="0" distR="0" wp14:anchorId="559C7060" wp14:editId="6D8FF5EE">
             <wp:extent cx="5976000" cy="50800"/>
             <wp:effectExtent l="0" t="0" r="0" b="0"/>
             <wp:docPr id="5" name="Picture 5"/>
@@ -5296,7 +5456,7 @@
       <w:pPr>
         <w:pStyle w:val="Titre1"/>
       </w:pPr>
-      <w:bookmarkStart w:id="11" w:name="_Toc243989713"/>
+      <w:bookmarkStart w:id="11" w:name="_Toc244069484"/>
       <w:r>
         <w:t>L'interface</w:t>
       </w:r>
@@ -5457,7 +5617,7 @@
                 <w:rFonts w:cs="Aptos"/>
                 <w:sz w:val="20"/>
               </w:rPr>
-              <w:t>Commandes courantes : ouvrir, enregistrer, connecter, importer, simuler, annuler, exporter</w:t>
+              <w:t>Commandes courantes : ouvrir, enregistrer, lancer SolidCraft, connecter, importer, simuler, annuler, exporter</w:t>
             </w:r>
           </w:p>
         </w:tc>
@@ -5644,7 +5804,7 @@
       <w:pPr>
         <w:pStyle w:val="Titre2"/>
       </w:pPr>
-      <w:bookmarkStart w:id="12" w:name="_Toc243989714"/>
+      <w:bookmarkStart w:id="12" w:name="_Toc244069485"/>
       <w:r>
         <w:t>L'arbre de l'étude</w:t>
       </w:r>
@@ -5949,7 +6109,7 @@
       <w:pPr>
         <w:pStyle w:val="Titre2"/>
       </w:pPr>
-      <w:bookmarkStart w:id="13" w:name="_Toc243989715"/>
+      <w:bookmarkStart w:id="13" w:name="_Toc244069486"/>
       <w:r>
         <w:t>Les menus</w:t>
       </w:r>
@@ -6102,7 +6262,7 @@
                 <w:rFonts w:cs="Aptos"/>
                 <w:sz w:val="20"/>
               </w:rPr>
-              <w:t>Connecter, Importer la maquette</w:t>
+              <w:t>Lancer SolidCraft, Ouvrir une maquette…, Connecter, Importer la maquette, Emplacement de SolidCraft…</w:t>
             </w:r>
           </w:p>
         </w:tc>
@@ -6199,7 +6359,7 @@
       <w:pPr>
         <w:pStyle w:val="Titre2"/>
       </w:pPr>
-      <w:bookmarkStart w:id="14" w:name="_Toc243989716"/>
+      <w:bookmarkStart w:id="14" w:name="_Toc244069487"/>
       <w:r>
         <w:t>Le journal</w:t>
       </w:r>
@@ -6235,7 +6395,7 @@
           <w:noProof/>
         </w:rPr>
         <w:drawing>
-          <wp:inline distT="0" distB="0" distL="0" distR="0" wp14:anchorId="221F1FF3" wp14:editId="1F197A3B">
+          <wp:inline distT="0" distB="0" distL="0" distR="0" wp14:anchorId="46DA8A3F" wp14:editId="48F6642F">
             <wp:extent cx="5976000" cy="50800"/>
             <wp:effectExtent l="0" t="0" r="0" b="0"/>
             <wp:docPr id="6" name="Picture 6"/>
@@ -6291,7 +6451,7 @@
       <w:pPr>
         <w:pStyle w:val="Titre1"/>
       </w:pPr>
-      <w:bookmarkStart w:id="15" w:name="_Toc243989717"/>
+      <w:bookmarkStart w:id="15" w:name="_Toc244069488"/>
       <w:r>
         <w:t>Conduire une étude complète</w:t>
       </w:r>
@@ -6309,7 +6469,7 @@
       <w:pPr>
         <w:pStyle w:val="Titre2"/>
       </w:pPr>
-      <w:bookmarkStart w:id="16" w:name="_Toc243989718"/>
+      <w:bookmarkStart w:id="16" w:name="_Toc244069489"/>
       <w:r>
         <w:t>5.1 Préparer la maquette dans SolidCraft</w:t>
       </w:r>
@@ -6498,9 +6658,9 @@
       <w:pPr>
         <w:pStyle w:val="Titre2"/>
       </w:pPr>
-      <w:bookmarkStart w:id="17" w:name="_Toc243989719"/>
-      <w:r>
-        <w:t>5.2 Connexion et import</w:t>
+      <w:bookmarkStart w:id="17" w:name="_Toc244069490"/>
+      <w:r>
+        <w:t>5.2 Lancement, ouverture de la maquette et import</w:t>
       </w:r>
       <w:bookmarkEnd w:id="17"/>
     </w:p>
@@ -6508,56 +6668,207 @@
       <w:r>
         <w:rPr>
           <w:rFonts w:cs="Aptos"/>
-          <w:b/>
-        </w:rPr>
-        <w:t>SolidCraft → Connecter</w:t>
-      </w:r>
-      <w:r>
-        <w:rPr>
-          <w:rFonts w:cs="Aptos"/>
-        </w:rPr>
-        <w:t xml:space="preserve"> établit la liaison avec SolidCraft ; la barre d'état affiche « SolidCraft : connecté (port N) ». </w:t>
+        </w:rPr>
+        <w:t xml:space="preserve">Au démarrage, Meca3D se connecte à SolidCraft s'il est déjà ouvert ; sinon, il propose de le lancer. </w:t>
       </w:r>
       <w:r>
         <w:rPr>
           <w:rFonts w:cs="Aptos"/>
           <w:b/>
         </w:rPr>
-        <w:t>SolidCraft → Importer la maquette</w:t>
+        <w:t>SolidCraft → Lancer SolidCraft</w:t>
       </w:r>
       <w:r>
         <w:rPr>
           <w:rFonts w:cs="Aptos"/>
         </w:rPr>
-        <w:t xml:space="preserve"> lit ensuite les occurrences, les liaisons, les couplages, les masses, les centres de gravité et les matrices d'inertie. L'import se fait dans la pose courante de la maquette, qui devient la configuration de référence de l'étude.</w:t>
+        <w:t xml:space="preserve"> (aussi dans la barre d'outils) le lance à tout moment. Le premier démarrage de SolidCraft peut prendre une demi-minute ; la barre d'état affiche ensuite « SolidCraft : connecté (port N) ». </w:t>
+      </w:r>
+      <w:r>
+        <w:rPr>
+          <w:rFonts w:cs="Aptos"/>
+          <w:b/>
+        </w:rPr>
+        <w:t>SolidCraft → Connecter</w:t>
+      </w:r>
+      <w:r>
+        <w:rPr>
+          <w:rFonts w:cs="Aptos"/>
+        </w:rPr>
+        <w:t xml:space="preserve"> sert à se reconnecter à un SolidCraft ouvert à la main.</w:t>
       </w:r>
     </w:p>
     <w:p>
       <w:r>
         <w:rPr>
           <w:rFonts w:cs="Aptos"/>
-        </w:rPr>
-        <w:t xml:space="preserve">Si la maquette change après l'import (pièce ajoutée, liaison modifiée, masse changée), un bandeau « Maquette modifiée » propose de </w:t>
-      </w:r>
+          <w:b/>
+        </w:rPr>
+        <w:t>SolidCraft → Ouvrir une maquette…</w:t>
+      </w:r>
+      <w:r>
+        <w:rPr>
+          <w:rFonts w:cs="Aptos"/>
+        </w:rPr>
+        <w:t xml:space="preserve"> ouvre un fichier </w:t>
+      </w:r>
+      <w:r>
+        <w:rPr>
+          <w:rFonts w:ascii="Cascadia Mono" w:eastAsia="Cascadia Mono" w:hAnsi="Cascadia Mono" w:cs="Cascadia Mono"/>
+          <w:color w:val="1B3A6B"/>
+          <w:sz w:val="19"/>
+        </w:rPr>
+        <w:t>.solidcraft</w:t>
+      </w:r>
+      <w:r>
+        <w:rPr>
+          <w:rFonts w:cs="Aptos"/>
+        </w:rPr>
+        <w:t xml:space="preserve"> dans SolidCraft. Ouvrir la maquette par Meca3D a un avantage : Meca3D en retient le fichier, et l'étude importée le mémorise. À la réouverture de l'étude, Meca3D rouvre alors la maquette dans SolidCraft, en lançant SolidCraft au besoin. Le fichier est enregistré relativement au dossier de l'étude : un dossier contenant l'étude et sa maquette se copie d'un poste à l'autre sans réglage. Une étude dont la maquette est introuvable la cherche à côté du </w:t>
+      </w:r>
+      <w:r>
+        <w:rPr>
+          <w:rFonts w:ascii="Cascadia Mono" w:eastAsia="Cascadia Mono" w:hAnsi="Cascadia Mono" w:cs="Cascadia Mono"/>
+          <w:color w:val="1B3A6B"/>
+          <w:sz w:val="19"/>
+        </w:rPr>
+        <w:t>.meca3d</w:t>
+      </w:r>
+      <w:r>
+        <w:rPr>
+          <w:rFonts w:cs="Aptos"/>
+        </w:rPr>
+        <w:t>, puis demande le fichier.</w:t>
+      </w:r>
+    </w:p>
+    <w:tbl>
+      <w:tblPr>
+        <w:tblW w:w="0" w:type="auto"/>
+        <w:tblBorders>
+          <w:top w:val="nil"/>
+          <w:left w:val="nil"/>
+          <w:bottom w:val="nil"/>
+          <w:right w:val="nil"/>
+          <w:insideH w:val="nil"/>
+          <w:insideV w:val="nil"/>
+        </w:tblBorders>
+        <w:tblCellMar>
+          <w:top w:w="100" w:type="dxa"/>
+          <w:left w:w="180" w:type="dxa"/>
+          <w:bottom w:w="100" w:type="dxa"/>
+          <w:right w:w="180" w:type="dxa"/>
+        </w:tblCellMar>
+        <w:tblLook w:val="04A0" w:firstRow="1" w:lastRow="0" w:firstColumn="1" w:lastColumn="0" w:noHBand="0" w:noVBand="1"/>
+      </w:tblPr>
+      <w:tblGrid>
+        <w:gridCol w:w="9412"/>
+      </w:tblGrid>
+      <w:tr>
+        <w:tc>
+          <w:tcPr>
+            <w:tcW w:w="9412" w:type="dxa"/>
+            <w:tcBorders>
+              <w:left w:val="single" w:sz="24" w:space="0" w:color="E07A2C"/>
+            </w:tcBorders>
+            <w:shd w:val="clear" w:color="auto" w:fill="F5F4EF"/>
+          </w:tcPr>
+          <w:p>
+            <w:pPr>
+              <w:spacing w:after="40"/>
+            </w:pPr>
+            <w:r>
+              <w:rPr>
+                <w:rFonts w:ascii="Cascadia Mono" w:eastAsia="Cascadia Mono" w:hAnsi="Cascadia Mono" w:cs="Cascadia Mono"/>
+                <w:color w:val="E07A2C"/>
+                <w:spacing w:val="30"/>
+                <w:sz w:val="18"/>
+              </w:rPr>
+              <w:t>REMPLACEMENT DE LA MAQUETTE OUVERTE</w:t>
+            </w:r>
+          </w:p>
+          <w:p>
+            <w:pPr>
+              <w:spacing w:after="0"/>
+            </w:pPr>
+            <w:r>
+              <w:rPr>
+                <w:rFonts w:cs="Aptos"/>
+                <w:sz w:val="20"/>
+              </w:rPr>
+              <w:t xml:space="preserve">Si SolidCraft affiche déjà une autre maquette, Meca3D demande confirmation avant de la remplacer. Si cette maquette a des modifications non enregistrées, elles seront </w:t>
+            </w:r>
+            <w:r>
+              <w:rPr>
+                <w:rFonts w:cs="Aptos"/>
+                <w:b/>
+                <w:sz w:val="20"/>
+              </w:rPr>
+              <w:t>perdues</w:t>
+            </w:r>
+            <w:r>
+              <w:rPr>
+                <w:rFonts w:cs="Aptos"/>
+                <w:sz w:val="20"/>
+              </w:rPr>
+              <w:t> </w:t>
+            </w:r>
+            <w:r>
+              <w:rPr>
+                <w:rFonts w:cs="Aptos"/>
+                <w:sz w:val="20"/>
+              </w:rPr>
+              <w:t>: SolidCraft ne pose pas la question. Enregistrer d'abord dans SolidCraft en cas de doute.</w:t>
+            </w:r>
+          </w:p>
+        </w:tc>
+      </w:tr>
+    </w:tbl>
+    <w:p>
+      <w:pPr>
+        <w:spacing w:after="0"/>
+      </w:pPr>
+    </w:p>
+    <w:p>
       <w:r>
         <w:rPr>
           <w:rFonts w:cs="Aptos"/>
           <w:b/>
         </w:rPr>
-        <w:t>Réimporter</w:t>
+        <w:t>SolidCraft → Importer la maquette</w:t>
       </w:r>
       <w:r>
         <w:rPr>
           <w:rFonts w:cs="Aptos"/>
         </w:rPr>
-        <w:t>. Les choix de l'élève sont conservés pour les liaisons de même nom.</w:t>
+        <w:t xml:space="preserve"> lit ensuite les occurrences, les liaisons, les couplages, les masses, les centres de gravité et les matrices d'inertie. L'import se fait dans la pose courante de la maquette, qui devient la configuration de référence de l'étude.</w:t>
       </w:r>
     </w:p>
     <w:p>
+      <w:r>
+        <w:rPr>
+          <w:rFonts w:cs="Aptos"/>
+        </w:rPr>
+        <w:t xml:space="preserve">Si la maquette change après l'import (pièce ajoutée, liaison modifiée, masse changée), un bandeau « Maquette modifiée » propose de </w:t>
+      </w:r>
+      <w:r>
+        <w:rPr>
+          <w:rFonts w:cs="Aptos"/>
+          <w:b/>
+        </w:rPr>
+        <w:t>Réimporter</w:t>
+      </w:r>
+      <w:r>
+        <w:rPr>
+          <w:rFonts w:cs="Aptos"/>
+        </w:rPr>
+        <w:t>. Les choix de l'élève sont conservés pour les liaisons de même nom.</w:t>
+      </w:r>
+    </w:p>
+    <w:p>
       <w:pPr>
         <w:pStyle w:val="Titre2"/>
       </w:pPr>
-      <w:bookmarkStart w:id="18" w:name="_Toc243989720"/>
+      <w:bookmarkStart w:id="18" w:name="_Toc244069491"/>
       <w:r>
         <w:t>5.3 Choisir et valider les liaisons</w:t>
       </w:r>
@@ -7761,7 +8072,7 @@
           <w:noProof/>
         </w:rPr>
         <w:drawing>
-          <wp:inline distT="0" distB="0" distL="0" distR="0" wp14:anchorId="2F72F1D1" wp14:editId="67B3A43B">
+          <wp:inline distT="0" distB="0" distL="0" distR="0" wp14:anchorId="2F6E3BFD" wp14:editId="33001561">
             <wp:extent cx="5976000" cy="3548250"/>
             <wp:effectExtent l="0" t="0" r="0" b="0"/>
             <wp:docPr id="7" name="Picture 7"/>
@@ -7987,7 +8298,7 @@
       <w:pPr>
         <w:pStyle w:val="Titre2"/>
       </w:pPr>
-      <w:bookmarkStart w:id="19" w:name="_Toc243989721"/>
+      <w:bookmarkStart w:id="19" w:name="_Toc244069492"/>
       <w:r>
         <w:t>5.4 Graphe, mobilité et hyperstatisme</w:t>
       </w:r>
@@ -8059,7 +8370,7 @@
           <w:noProof/>
         </w:rPr>
         <w:drawing>
-          <wp:inline distT="0" distB="0" distL="0" distR="0" wp14:anchorId="71B06C4F" wp14:editId="1837FCBA">
+          <wp:inline distT="0" distB="0" distL="0" distR="0" wp14:anchorId="2540F41F" wp14:editId="47E2007C">
             <wp:extent cx="5976000" cy="3548250"/>
             <wp:effectExtent l="0" t="0" r="0" b="0"/>
             <wp:docPr id="8" name="Picture 8"/>
@@ -8263,7 +8574,7 @@
       <w:pPr>
         <w:pStyle w:val="Titre2"/>
       </w:pPr>
-      <w:bookmarkStart w:id="20" w:name="_Toc243989722"/>
+      <w:bookmarkStart w:id="20" w:name="_Toc244069493"/>
       <w:r>
         <w:t>5.5 Lois d'entrée (pilotes)</w:t>
       </w:r>
@@ -8658,7 +8969,7 @@
           <w:noProof/>
         </w:rPr>
         <w:drawing>
-          <wp:inline distT="0" distB="0" distL="0" distR="0" wp14:anchorId="36E71FF2" wp14:editId="5BC15F7A">
+          <wp:inline distT="0" distB="0" distL="0" distR="0" wp14:anchorId="443969DE" wp14:editId="699F34CD">
             <wp:extent cx="5976000" cy="3548250"/>
             <wp:effectExtent l="0" t="0" r="0" b="0"/>
             <wp:docPr id="9" name="Picture 9"/>
@@ -8711,7 +9022,7 @@
       <w:pPr>
         <w:pStyle w:val="Titre2"/>
       </w:pPr>
-      <w:bookmarkStart w:id="21" w:name="_Toc243989723"/>
+      <w:bookmarkStart w:id="21" w:name="_Toc244069494"/>
       <w:r>
         <w:t>5.6 Pesanteur, actions et ressorts</w:t>
       </w:r>
@@ -8849,7 +9160,7 @@
       <w:pPr>
         <w:pStyle w:val="Titre2"/>
       </w:pPr>
-      <w:bookmarkStart w:id="22" w:name="_Toc243989724"/>
+      <w:bookmarkStart w:id="22" w:name="_Toc244069495"/>
       <w:r>
         <w:t>5.7 Capteurs</w:t>
       </w:r>
@@ -9089,7 +9400,7 @@
           <w:noProof/>
         </w:rPr>
         <w:drawing>
-          <wp:inline distT="0" distB="0" distL="0" distR="0" wp14:anchorId="2478BFFC" wp14:editId="4769F945">
+          <wp:inline distT="0" distB="0" distL="0" distR="0" wp14:anchorId="1BB97D6F" wp14:editId="360DC073">
             <wp:extent cx="5976000" cy="3548250"/>
             <wp:effectExtent l="0" t="0" r="0" b="0"/>
             <wp:docPr id="10" name="Picture 10"/>
@@ -9142,7 +9453,7 @@
       <w:pPr>
         <w:pStyle w:val="Titre2"/>
       </w:pPr>
-      <w:bookmarkStart w:id="23" w:name="_Toc243989725"/>
+      <w:bookmarkStart w:id="23" w:name="_Toc244069496"/>
       <w:r>
         <w:t>5.8 Simuler</w:t>
       </w:r>
@@ -9454,7 +9765,7 @@
       <w:pPr>
         <w:pStyle w:val="Titre2"/>
       </w:pPr>
-      <w:bookmarkStart w:id="24" w:name="_Toc243989726"/>
+      <w:bookmarkStart w:id="24" w:name="_Toc244069497"/>
       <w:r>
         <w:t>5.9 Exploiter les résultats</w:t>
       </w:r>
@@ -9500,7 +9811,7 @@
           <w:noProof/>
         </w:rPr>
         <w:drawing>
-          <wp:inline distT="0" distB="0" distL="0" distR="0" wp14:anchorId="478C93EC" wp14:editId="7713A5FD">
+          <wp:inline distT="0" distB="0" distL="0" distR="0" wp14:anchorId="489CCD4D" wp14:editId="427CCE6D">
             <wp:extent cx="5976000" cy="3548250"/>
             <wp:effectExtent l="0" t="0" r="0" b="0"/>
             <wp:docPr id="11" name="Picture 11"/>
@@ -9589,7 +9900,7 @@
           <w:noProof/>
         </w:rPr>
         <w:drawing>
-          <wp:inline distT="0" distB="0" distL="0" distR="0" wp14:anchorId="47D3D245" wp14:editId="2436888B">
+          <wp:inline distT="0" distB="0" distL="0" distR="0" wp14:anchorId="49080211" wp14:editId="5344112E">
             <wp:extent cx="5976000" cy="3548250"/>
             <wp:effectExtent l="0" t="0" r="0" b="0"/>
             <wp:docPr id="12" name="Picture 12"/>
@@ -9757,7 +10068,7 @@
           <w:noProof/>
         </w:rPr>
         <w:drawing>
-          <wp:inline distT="0" distB="0" distL="0" distR="0" wp14:anchorId="5B21106A" wp14:editId="1E7F9D22">
+          <wp:inline distT="0" distB="0" distL="0" distR="0" wp14:anchorId="7553E4BB" wp14:editId="2E7ABDAA">
             <wp:extent cx="5976000" cy="3548250"/>
             <wp:effectExtent l="0" t="0" r="0" b="0"/>
             <wp:docPr id="13" name="Picture 13"/>
@@ -9810,7 +10121,7 @@
       <w:pPr>
         <w:pStyle w:val="Titre2"/>
       </w:pPr>
-      <w:bookmarkStart w:id="25" w:name="_Toc243989727"/>
+      <w:bookmarkStart w:id="25" w:name="_Toc244069498"/>
       <w:r>
         <w:t>5.10 Enregistrer l'étude</w:t>
       </w:r>
@@ -9854,7 +10165,7 @@
           <w:noProof/>
         </w:rPr>
         <w:drawing>
-          <wp:inline distT="0" distB="0" distL="0" distR="0" wp14:anchorId="20BBE70A" wp14:editId="639B1B42">
+          <wp:inline distT="0" distB="0" distL="0" distR="0" wp14:anchorId="35CAF39B" wp14:editId="45F05AC6">
             <wp:extent cx="5976000" cy="50800"/>
             <wp:effectExtent l="0" t="0" r="0" b="0"/>
             <wp:docPr id="14" name="Picture 14"/>
@@ -9910,7 +10221,7 @@
       <w:pPr>
         <w:pStyle w:val="Titre1"/>
       </w:pPr>
-      <w:bookmarkStart w:id="26" w:name="_Toc243989728"/>
+      <w:bookmarkStart w:id="26" w:name="_Toc244069499"/>
       <w:r>
         <w:t>Les exemples fournis</w:t>
       </w:r>
@@ -10578,7 +10889,7 @@
       <w:pPr>
         <w:pStyle w:val="Titre2"/>
       </w:pPr>
-      <w:bookmarkStart w:id="27" w:name="_Toc243989729"/>
+      <w:bookmarkStart w:id="27" w:name="_Toc244069500"/>
       <w:r>
         <w:t>Bielle-manivelle</w:t>
       </w:r>
@@ -10604,7 +10915,7 @@
       <w:pPr>
         <w:pStyle w:val="Titre2"/>
       </w:pPr>
-      <w:bookmarkStart w:id="28" w:name="_Toc243989730"/>
+      <w:bookmarkStart w:id="28" w:name="_Toc244069501"/>
       <w:r>
         <w:t>Pendule simple</w:t>
       </w:r>
@@ -10622,7 +10933,7 @@
       <w:pPr>
         <w:pStyle w:val="Titre2"/>
       </w:pPr>
-      <w:bookmarkStart w:id="29" w:name="_Toc243989731"/>
+      <w:bookmarkStart w:id="29" w:name="_Toc244069502"/>
       <w:r>
         <w:t>Pendule double</w:t>
       </w:r>
@@ -10640,7 +10951,7 @@
       <w:pPr>
         <w:pStyle w:val="Titre2"/>
       </w:pPr>
-      <w:bookmarkStart w:id="30" w:name="_Toc243989732"/>
+      <w:bookmarkStart w:id="30" w:name="_Toc244069503"/>
       <w:r>
         <w:t>Réducteur à engrenage</w:t>
       </w:r>
@@ -10657,7 +10968,7 @@
           <w:noProof/>
         </w:rPr>
         <w:drawing>
-          <wp:inline distT="0" distB="0" distL="0" distR="0" wp14:anchorId="5071AEC2" wp14:editId="344A2504">
+          <wp:inline distT="0" distB="0" distL="0" distR="0" wp14:anchorId="30D73320" wp14:editId="4AD11A42">
             <wp:extent cx="5976000" cy="3548250"/>
             <wp:effectExtent l="0" t="0" r="0" b="0"/>
             <wp:docPr id="15" name="Picture 15"/>
@@ -10718,7 +11029,7 @@
       <w:pPr>
         <w:pStyle w:val="Titre2"/>
       </w:pPr>
-      <w:bookmarkStart w:id="31" w:name="_Toc243989733"/>
+      <w:bookmarkStart w:id="31" w:name="_Toc244069504"/>
       <w:r>
         <w:t>Système vis-écrou</w:t>
       </w:r>
@@ -10741,7 +11052,7 @@
           <w:noProof/>
         </w:rPr>
         <w:drawing>
-          <wp:inline distT="0" distB="0" distL="0" distR="0" wp14:anchorId="1B7ACA72" wp14:editId="50B52F89">
+          <wp:inline distT="0" distB="0" distL="0" distR="0" wp14:anchorId="52E92254" wp14:editId="54D6CDE0">
             <wp:extent cx="5976000" cy="50800"/>
             <wp:effectExtent l="0" t="0" r="0" b="0"/>
             <wp:docPr id="16" name="Picture 16"/>
@@ -10797,7 +11108,7 @@
       <w:pPr>
         <w:pStyle w:val="Titre1"/>
       </w:pPr>
-      <w:bookmarkStart w:id="32" w:name="_Toc243989734"/>
+      <w:bookmarkStart w:id="32" w:name="_Toc244069505"/>
       <w:r>
         <w:t>Conventions</w:t>
       </w:r>
@@ -11224,7 +11535,7 @@
           <w:noProof/>
         </w:rPr>
         <w:drawing>
-          <wp:inline distT="0" distB="0" distL="0" distR="0" wp14:anchorId="51ED767B" wp14:editId="1DE7331D">
+          <wp:inline distT="0" distB="0" distL="0" distR="0" wp14:anchorId="4FA4F0A7" wp14:editId="05B10E30">
             <wp:extent cx="5976000" cy="50800"/>
             <wp:effectExtent l="0" t="0" r="0" b="0"/>
             <wp:docPr id="17" name="Picture 17"/>
@@ -11280,7 +11591,7 @@
       <w:pPr>
         <w:pStyle w:val="Titre1"/>
       </w:pPr>
-      <w:bookmarkStart w:id="33" w:name="_Toc243989735"/>
+      <w:bookmarkStart w:id="33" w:name="_Toc244069506"/>
       <w:r>
         <w:t>Usage enseignant</w:t>
       </w:r>
@@ -11520,7 +11831,7 @@
       <w:pPr>
         <w:pStyle w:val="Titre2"/>
       </w:pPr>
-      <w:bookmarkStart w:id="34" w:name="_Toc243989736"/>
+      <w:bookmarkStart w:id="34" w:name="_Toc244069507"/>
       <w:r>
         <w:t>Pistes pédagogiques</w:t>
       </w:r>
@@ -11660,7 +11971,7 @@
           <w:noProof/>
         </w:rPr>
         <w:drawing>
-          <wp:inline distT="0" distB="0" distL="0" distR="0" wp14:anchorId="49A09EA0" wp14:editId="31F237B8">
+          <wp:inline distT="0" distB="0" distL="0" distR="0" wp14:anchorId="747A00E8" wp14:editId="0781AA56">
             <wp:extent cx="5976000" cy="50800"/>
             <wp:effectExtent l="0" t="0" r="0" b="0"/>
             <wp:docPr id="18" name="Picture 18"/>
@@ -11716,7 +12027,7 @@
       <w:pPr>
         <w:pStyle w:val="Titre1"/>
       </w:pPr>
-      <w:bookmarkStart w:id="35" w:name="_Toc243989737"/>
+      <w:bookmarkStart w:id="35" w:name="_Toc244069508"/>
       <w:r>
         <w:t>Ligne de commande</w:t>
       </w:r>
@@ -12028,7 +12339,7 @@
           <w:noProof/>
         </w:rPr>
         <w:drawing>
-          <wp:inline distT="0" distB="0" distL="0" distR="0" wp14:anchorId="34504E48" wp14:editId="07D80217">
+          <wp:inline distT="0" distB="0" distL="0" distR="0" wp14:anchorId="14706802" wp14:editId="3752C222">
             <wp:extent cx="5976000" cy="50800"/>
             <wp:effectExtent l="0" t="0" r="0" b="0"/>
             <wp:docPr id="19" name="Picture 19"/>
@@ -12084,7 +12395,7 @@
       <w:pPr>
         <w:pStyle w:val="Titre1"/>
       </w:pPr>
-      <w:bookmarkStart w:id="36" w:name="_Toc243989738"/>
+      <w:bookmarkStart w:id="36" w:name="_Toc244069509"/>
       <w:r>
         <w:t>Messages et dépannage</w:t>
       </w:r>
@@ -12196,7 +12507,7 @@
                 <w:rFonts w:cs="Aptos"/>
                 <w:sz w:val="20"/>
               </w:rPr>
-              <w:t xml:space="preserve">Lancer SolidCraft 0.15.0. Si un port a été imposé, vérifier </w:t>
+              <w:t xml:space="preserve">SolidCraft → Lancer SolidCraft. S'il a été ouvert à la main avec un port imposé, vérifier </w:t>
             </w:r>
             <w:r>
               <w:rPr>
@@ -12234,7 +12545,7 @@
                 <w:rFonts w:cs="Aptos"/>
                 <w:sz w:val="20"/>
               </w:rPr>
-              <w:t>« jeton refusé »</w:t>
+              <w:t>« solidcraft.exe introuvable »</w:t>
             </w:r>
           </w:p>
         </w:tc>
@@ -12252,7 +12563,22 @@
                 <w:rFonts w:cs="Aptos"/>
                 <w:sz w:val="20"/>
               </w:rPr>
-              <w:t>SolidCraft a été relancé : cliquer de nouveau sur Connecter.</w:t>
+              <w:t xml:space="preserve">SolidCraft → Emplacement de SolidCraft… et désigner </w:t>
+            </w:r>
+            <w:r>
+              <w:rPr>
+                <w:rFonts w:ascii="Cascadia Mono" w:eastAsia="Cascadia Mono" w:hAnsi="Cascadia Mono" w:cs="Cascadia Mono"/>
+                <w:color w:val="1B3A6B"/>
+                <w:sz w:val="17"/>
+              </w:rPr>
+              <w:t>solidcraft.exe</w:t>
+            </w:r>
+            <w:r>
+              <w:rPr>
+                <w:rFonts w:cs="Aptos"/>
+                <w:sz w:val="20"/>
+              </w:rPr>
+              <w:t xml:space="preserve"> dans le dossier de la version portable.</w:t>
             </w:r>
           </w:p>
         </w:tc>
@@ -12275,7 +12601,7 @@
                 <w:rFonts w:cs="Aptos"/>
                 <w:sz w:val="20"/>
               </w:rPr>
-              <w:t>Avertissement de format SolidCraft</w:t>
+              <w:t>« SolidCraft ne répond pas … s après son lancement »</w:t>
             </w:r>
           </w:p>
         </w:tc>
@@ -12293,7 +12619,7 @@
                 <w:rFonts w:cs="Aptos"/>
                 <w:sz w:val="20"/>
               </w:rPr>
-              <w:t>Version de SolidCraft différente de 0.15.0 : l'import est tenté mais non garanti.</w:t>
+              <w:t>Démarrage anormalement long ou bloqué : vérifier la fenêtre de SolidCraft, puis SolidCraft → Connecter.</w:t>
             </w:r>
           </w:p>
         </w:tc>
@@ -12316,7 +12642,7 @@
                 <w:rFonts w:cs="Aptos"/>
                 <w:sz w:val="20"/>
               </w:rPr>
-              <w:t>Bouton Simuler grisé</w:t>
+              <w:t>« Ouverture de la maquette impossible »</w:t>
             </w:r>
           </w:p>
         </w:tc>
@@ -12334,7 +12660,22 @@
                 <w:rFonts w:cs="Aptos"/>
                 <w:sz w:val="20"/>
               </w:rPr>
-              <w:t>Une liaison reste à valider (⚠ dans l'arbre).</w:t>
+              <w:t xml:space="preserve">Fichier </w:t>
+            </w:r>
+            <w:r>
+              <w:rPr>
+                <w:rFonts w:ascii="Cascadia Mono" w:eastAsia="Cascadia Mono" w:hAnsi="Cascadia Mono" w:cs="Cascadia Mono"/>
+                <w:color w:val="1B3A6B"/>
+                <w:sz w:val="17"/>
+              </w:rPr>
+              <w:t>.solidcraft</w:t>
+            </w:r>
+            <w:r>
+              <w:rPr>
+                <w:rFonts w:cs="Aptos"/>
+                <w:sz w:val="20"/>
+              </w:rPr>
+              <w:t xml:space="preserve"> déplacé ou supprimé : SolidCraft → Ouvrir une maquette…, puis enregistrer l'étude.</w:t>
             </w:r>
           </w:p>
         </w:tc>
@@ -12357,7 +12698,7 @@
                 <w:rFonts w:cs="Aptos"/>
                 <w:sz w:val="20"/>
               </w:rPr>
-              <w:t>« Mobilité indisponible »</w:t>
+              <w:t>« jeton refusé »</w:t>
             </w:r>
           </w:p>
         </w:tc>
@@ -12375,7 +12716,7 @@
                 <w:rFonts w:cs="Aptos"/>
                 <w:sz w:val="20"/>
               </w:rPr>
-              <w:t>Une liaison n'a pas de type, ou une seconde direction manque.</w:t>
+              <w:t>SolidCraft a été relancé : cliquer de nouveau sur Connecter.</w:t>
             </w:r>
           </w:p>
         </w:tc>
@@ -12398,7 +12739,7 @@
                 <w:rFonts w:cs="Aptos"/>
                 <w:sz w:val="20"/>
               </w:rPr>
-              <w:t>Simulation refusée, h &gt; 0</w:t>
+              <w:t>Avertissement de format SolidCraft</w:t>
             </w:r>
           </w:p>
         </w:tc>
@@ -12416,7 +12757,7 @@
                 <w:rFonts w:cs="Aptos"/>
                 <w:sz w:val="20"/>
               </w:rPr>
-              <w:t>Revoir les liaisons du cycle indiqué, ou, en cinématique seulement, cocher Hyperstatique autorisé.</w:t>
+              <w:t>Version de SolidCraft différente de 0.15.0 : l'import est tenté mais non garanti.</w:t>
             </w:r>
           </w:p>
         </w:tc>
@@ -12439,7 +12780,7 @@
                 <w:rFonts w:cs="Aptos"/>
                 <w:sz w:val="20"/>
               </w:rPr>
-              <w:t>Simulation cinématique refusée</w:t>
+              <w:t>Bouton Simuler grisé</w:t>
             </w:r>
           </w:p>
         </w:tc>
@@ -12457,7 +12798,7 @@
                 <w:rFonts w:cs="Aptos"/>
                 <w:sz w:val="20"/>
               </w:rPr>
-              <w:t>Il faut exactement m lois d'entrée.</w:t>
+              <w:t>Une liaison reste à valider (⚠ dans l'arbre).</w:t>
             </w:r>
           </w:p>
         </w:tc>
@@ -12480,7 +12821,7 @@
                 <w:rFonts w:cs="Aptos"/>
                 <w:sz w:val="20"/>
               </w:rPr>
-              <w:t>Échec du solveur à t = …</w:t>
+              <w:t>« Mobilité indisponible »</w:t>
             </w:r>
           </w:p>
         </w:tc>
@@ -12498,7 +12839,7 @@
                 <w:rFonts w:cs="Aptos"/>
                 <w:sz w:val="20"/>
               </w:rPr>
-              <w:t>Point mort ou blocage : vérifier la pose d'import, les lois d'entrée et la durée.</w:t>
+              <w:t>Une liaison n'a pas de type, ou une seconde direction manque.</w:t>
             </w:r>
           </w:p>
         </w:tc>
@@ -12521,7 +12862,7 @@
                 <w:rFonts w:cs="Aptos"/>
                 <w:sz w:val="20"/>
               </w:rPr>
-              <w:t>Animation lente</w:t>
+              <w:t>Simulation refusée, h &gt; 0</w:t>
             </w:r>
           </w:p>
         </w:tc>
@@ -12539,7 +12880,7 @@
                 <w:rFonts w:cs="Aptos"/>
                 <w:sz w:val="20"/>
               </w:rPr>
-              <w:t>La fenêtre SolidCraft est réduite ou masquée : la garder visible.</w:t>
+              <w:t>Revoir les liaisons du cycle indiqué, ou, en cinématique seulement, cocher Hyperstatique autorisé.</w:t>
             </w:r>
           </w:p>
         </w:tc>
@@ -12562,7 +12903,7 @@
                 <w:rFonts w:cs="Aptos"/>
                 <w:sz w:val="20"/>
               </w:rPr>
-              <w:t>Animation indisponible</w:t>
+              <w:t>Simulation cinématique refusée</w:t>
             </w:r>
           </w:p>
         </w:tc>
@@ -12580,7 +12921,7 @@
                 <w:rFonts w:cs="Aptos"/>
                 <w:sz w:val="20"/>
               </w:rPr>
-              <w:t>Lancer d'abord une simulation et connecter SolidCraft.</w:t>
+              <w:t>Il faut exactement m lois d'entrée.</w:t>
             </w:r>
           </w:p>
         </w:tc>
@@ -12603,7 +12944,7 @@
                 <w:rFonts w:cs="Aptos"/>
                 <w:sz w:val="20"/>
               </w:rPr>
-              <w:t>Bandeau « Maquette modifiée »</w:t>
+              <w:t>Échec du solveur à t = …</w:t>
             </w:r>
           </w:p>
         </w:tc>
@@ -12621,7 +12962,7 @@
                 <w:rFonts w:cs="Aptos"/>
                 <w:sz w:val="20"/>
               </w:rPr>
-              <w:t>La structure de la maquette a changé : Réimporter.</w:t>
+              <w:t>Point mort ou blocage : vérifier la pose d'import, les lois d'entrée et la durée.</w:t>
             </w:r>
           </w:p>
         </w:tc>
@@ -12644,7 +12985,7 @@
                 <w:rFonts w:cs="Aptos"/>
                 <w:sz w:val="20"/>
               </w:rPr>
-              <w:t>Blocage par SmartScreen</w:t>
+              <w:t>Animation lente</w:t>
             </w:r>
           </w:p>
         </w:tc>
@@ -12652,6 +12993,129 @@
           <w:tcPr>
             <w:tcW w:w="5783" w:type="dxa"/>
             <w:shd w:val="clear" w:color="auto" w:fill="FAFAF7"/>
+          </w:tcPr>
+          <w:p>
+            <w:pPr>
+              <w:spacing w:after="0" w:line="252" w:lineRule="auto"/>
+            </w:pPr>
+            <w:r>
+              <w:rPr>
+                <w:rFonts w:cs="Aptos"/>
+                <w:sz w:val="20"/>
+              </w:rPr>
+              <w:t>La fenêtre SolidCraft est réduite ou masquée : la garder visible.</w:t>
+            </w:r>
+          </w:p>
+        </w:tc>
+      </w:tr>
+      <w:tr>
+        <w:trPr>
+          <w:jc w:val="center"/>
+        </w:trPr>
+        <w:tc>
+          <w:tcPr>
+            <w:tcW w:w="3628" w:type="dxa"/>
+            <w:shd w:val="clear" w:color="auto" w:fill="F5F4EF"/>
+          </w:tcPr>
+          <w:p>
+            <w:pPr>
+              <w:spacing w:after="0" w:line="252" w:lineRule="auto"/>
+            </w:pPr>
+            <w:r>
+              <w:rPr>
+                <w:rFonts w:cs="Aptos"/>
+                <w:sz w:val="20"/>
+              </w:rPr>
+              <w:t>Animation indisponible</w:t>
+            </w:r>
+          </w:p>
+        </w:tc>
+        <w:tc>
+          <w:tcPr>
+            <w:tcW w:w="5783" w:type="dxa"/>
+            <w:shd w:val="clear" w:color="auto" w:fill="F5F4EF"/>
+          </w:tcPr>
+          <w:p>
+            <w:pPr>
+              <w:spacing w:after="0" w:line="252" w:lineRule="auto"/>
+            </w:pPr>
+            <w:r>
+              <w:rPr>
+                <w:rFonts w:cs="Aptos"/>
+                <w:sz w:val="20"/>
+              </w:rPr>
+              <w:t>Lancer d'abord une simulation et connecter SolidCraft.</w:t>
+            </w:r>
+          </w:p>
+        </w:tc>
+      </w:tr>
+      <w:tr>
+        <w:trPr>
+          <w:jc w:val="center"/>
+        </w:trPr>
+        <w:tc>
+          <w:tcPr>
+            <w:tcW w:w="3628" w:type="dxa"/>
+            <w:shd w:val="clear" w:color="auto" w:fill="FAFAF7"/>
+          </w:tcPr>
+          <w:p>
+            <w:pPr>
+              <w:spacing w:after="0" w:line="252" w:lineRule="auto"/>
+            </w:pPr>
+            <w:r>
+              <w:rPr>
+                <w:rFonts w:cs="Aptos"/>
+                <w:sz w:val="20"/>
+              </w:rPr>
+              <w:t>Bandeau « Maquette modifiée »</w:t>
+            </w:r>
+          </w:p>
+        </w:tc>
+        <w:tc>
+          <w:tcPr>
+            <w:tcW w:w="5783" w:type="dxa"/>
+            <w:shd w:val="clear" w:color="auto" w:fill="FAFAF7"/>
+          </w:tcPr>
+          <w:p>
+            <w:pPr>
+              <w:spacing w:after="0" w:line="252" w:lineRule="auto"/>
+            </w:pPr>
+            <w:r>
+              <w:rPr>
+                <w:rFonts w:cs="Aptos"/>
+                <w:sz w:val="20"/>
+              </w:rPr>
+              <w:t>La structure de la maquette a changé : Réimporter.</w:t>
+            </w:r>
+          </w:p>
+        </w:tc>
+      </w:tr>
+      <w:tr>
+        <w:trPr>
+          <w:jc w:val="center"/>
+        </w:trPr>
+        <w:tc>
+          <w:tcPr>
+            <w:tcW w:w="3628" w:type="dxa"/>
+            <w:shd w:val="clear" w:color="auto" w:fill="F5F4EF"/>
+          </w:tcPr>
+          <w:p>
+            <w:pPr>
+              <w:spacing w:after="0" w:line="252" w:lineRule="auto"/>
+            </w:pPr>
+            <w:r>
+              <w:rPr>
+                <w:rFonts w:cs="Aptos"/>
+                <w:sz w:val="20"/>
+              </w:rPr>
+              <w:t>Blocage par SmartScreen</w:t>
+            </w:r>
+          </w:p>
+        </w:tc>
+        <w:tc>
+          <w:tcPr>
+            <w:tcW w:w="5783" w:type="dxa"/>
+            <w:shd w:val="clear" w:color="auto" w:fill="F5F4EF"/>
           </w:tcPr>
           <w:p>
             <w:pPr>
@@ -12677,7 +13141,7 @@
           <w:noProof/>
         </w:rPr>
         <w:drawing>
-          <wp:inline distT="0" distB="0" distL="0" distR="0" wp14:anchorId="04D4EF58" wp14:editId="77EEC547">
+          <wp:inline distT="0" distB="0" distL="0" distR="0" wp14:anchorId="7CEE6F09" wp14:editId="6226A08E">
             <wp:extent cx="5976000" cy="50800"/>
             <wp:effectExtent l="0" t="0" r="0" b="0"/>
             <wp:docPr id="20" name="Picture 20"/>
@@ -12733,7 +13197,7 @@
       <w:pPr>
         <w:pStyle w:val="Titre1"/>
       </w:pPr>
-      <w:bookmarkStart w:id="37" w:name="_Toc243989739"/>
+      <w:bookmarkStart w:id="37" w:name="_Toc244069510"/>
       <w:r>
         <w:t>Limites de la version 0.1.0</w:t>
       </w:r>
@@ -12743,7 +13207,7 @@
       <w:pPr>
         <w:pStyle w:val="Titre2"/>
       </w:pPr>
-      <w:bookmarkStart w:id="38" w:name="_Toc243989740"/>
+      <w:bookmarkStart w:id="38" w:name="_Toc244069511"/>
       <w:r>
         <w:t>Hors périmètre</w:t>
       </w:r>
@@ -12825,7 +13289,7 @@
       <w:pPr>
         <w:pStyle w:val="Titre2"/>
       </w:pPr>
-      <w:bookmarkStart w:id="39" w:name="_Toc243989741"/>
+      <w:bookmarkStart w:id="39" w:name="_Toc244069512"/>
       <w:r>
         <w:t>Réglages</w:t>
       </w:r>
@@ -12857,7 +13321,7 @@
       <w:pPr>
         <w:pStyle w:val="Titre2"/>
       </w:pPr>
-      <w:bookmarkStart w:id="40" w:name="_Toc243989742"/>
+      <w:bookmarkStart w:id="40" w:name="_Toc244069513"/>
       <w:r>
         <w:t>Distribution</w:t>
       </w:r>
@@ -12896,7 +13360,7 @@
           <w:noProof/>
         </w:rPr>
         <w:drawing>
-          <wp:inline distT="0" distB="0" distL="0" distR="0" wp14:anchorId="1E132B7B" wp14:editId="6077DCBB">
+          <wp:inline distT="0" distB="0" distL="0" distR="0" wp14:anchorId="7EEA6430" wp14:editId="01128844">
             <wp:extent cx="5976000" cy="50800"/>
             <wp:effectExtent l="0" t="0" r="0" b="0"/>
             <wp:docPr id="21" name="Picture 21"/>
@@ -12952,7 +13416,7 @@
       <w:pPr>
         <w:pStyle w:val="Titre1"/>
       </w:pPr>
-      <w:bookmarkStart w:id="41" w:name="_Toc243989743"/>
+      <w:bookmarkStart w:id="41" w:name="_Toc244069514"/>
       <w:r>
         <w:t>Annexe A — Glossaire</w:t>
       </w:r>
@@ -13505,7 +13969,7 @@
       <w:pPr>
         <w:pStyle w:val="Titre1"/>
       </w:pPr>
-      <w:bookmarkStart w:id="42" w:name="_Toc243989744"/>
+      <w:bookmarkStart w:id="42" w:name="_Toc244069515"/>
       <w:r>
         <w:t>Annexe B — Le fichier d'étude</w:t>
       </w:r>
@@ -14041,7 +14505,7 @@
                 <w:color w:val="1B3A6B"/>
                 <w:sz w:val="17"/>
               </w:rPr>
-              <w:t>solides</w:t>
+              <w:t>chemin_maquette</w:t>
             </w:r>
           </w:p>
         </w:tc>
@@ -14059,7 +14523,7 @@
                 <w:rFonts w:cs="Aptos"/>
                 <w:sz w:val="20"/>
               </w:rPr>
-              <w:t>nom, fixe, masse (kg), centre de gravité (m), inertie (kg·m²), pose</w:t>
+              <w:t>fichier de la maquette, relatif au dossier de l'étude (facultatif)</w:t>
             </w:r>
           </w:p>
         </w:tc>
@@ -14083,7 +14547,7 @@
                 <w:color w:val="1B3A6B"/>
                 <w:sz w:val="17"/>
               </w:rPr>
-              <w:t>liaisons</w:t>
+              <w:t>solides</w:t>
             </w:r>
           </w:p>
         </w:tc>
@@ -14101,7 +14565,7 @@
                 <w:rFonts w:cs="Aptos"/>
                 <w:sz w:val="20"/>
               </w:rPr>
-              <w:t>liaison SolidCraft, type choisi, axe, statut, frottement</w:t>
+              <w:t>nom, fixe, masse (kg), centre de gravité (m), inertie (kg·m²), pose</w:t>
             </w:r>
           </w:p>
         </w:tc>
@@ -14125,7 +14589,7 @@
                 <w:color w:val="1B3A6B"/>
                 <w:sz w:val="17"/>
               </w:rPr>
-              <w:t>couplages</w:t>
+              <w:t>liaisons</w:t>
             </w:r>
           </w:p>
         </w:tc>
@@ -14143,7 +14607,7 @@
                 <w:rFonts w:cs="Aptos"/>
                 <w:sz w:val="20"/>
               </w:rPr>
-              <w:t>genre, liaisons couplées, rapport (et dents), rendement</w:t>
+              <w:t>liaison SolidCraft, type choisi, axe, statut, frottement</w:t>
             </w:r>
           </w:p>
         </w:tc>
@@ -14167,7 +14631,7 @@
                 <w:color w:val="1B3A6B"/>
                 <w:sz w:val="17"/>
               </w:rPr>
-              <w:t>pilotes</w:t>
+              <w:t>couplages</w:t>
             </w:r>
           </w:p>
         </w:tc>
@@ -14185,7 +14649,7 @@
                 <w:rFonts w:cs="Aptos"/>
                 <w:sz w:val="20"/>
               </w:rPr>
-              <w:t>liaison et loi d'entrée</w:t>
+              <w:t>genre, liaisons couplées, rapport (et dents), rendement</w:t>
             </w:r>
           </w:p>
         </w:tc>
@@ -14209,37 +14673,7 @@
                 <w:color w:val="1B3A6B"/>
                 <w:sz w:val="17"/>
               </w:rPr>
-              <w:t>pesanteur</w:t>
-            </w:r>
-            <w:r>
-              <w:rPr>
-                <w:rFonts w:cs="Aptos"/>
-                <w:sz w:val="20"/>
-              </w:rPr>
-              <w:t xml:space="preserve">, </w:t>
-            </w:r>
-            <w:r>
-              <w:rPr>
-                <w:rFonts w:ascii="Cascadia Mono" w:eastAsia="Cascadia Mono" w:hAnsi="Cascadia Mono" w:cs="Cascadia Mono"/>
-                <w:color w:val="1B3A6B"/>
-                <w:sz w:val="17"/>
-              </w:rPr>
-              <w:t>actions</w:t>
-            </w:r>
-            <w:r>
-              <w:rPr>
-                <w:rFonts w:cs="Aptos"/>
-                <w:sz w:val="20"/>
-              </w:rPr>
-              <w:t xml:space="preserve">, </w:t>
-            </w:r>
-            <w:r>
-              <w:rPr>
-                <w:rFonts w:ascii="Cascadia Mono" w:eastAsia="Cascadia Mono" w:hAnsi="Cascadia Mono" w:cs="Cascadia Mono"/>
-                <w:color w:val="1B3A6B"/>
-                <w:sz w:val="17"/>
-              </w:rPr>
-              <w:t>ressorts</w:t>
+              <w:t>pilotes</w:t>
             </w:r>
           </w:p>
         </w:tc>
@@ -14257,7 +14691,7 @@
                 <w:rFonts w:cs="Aptos"/>
                 <w:sz w:val="20"/>
               </w:rPr>
-              <w:t>données d'entrée</w:t>
+              <w:t>liaison et loi d'entrée</w:t>
             </w:r>
           </w:p>
         </w:tc>
@@ -14281,7 +14715,37 @@
                 <w:color w:val="1B3A6B"/>
                 <w:sz w:val="17"/>
               </w:rPr>
-              <w:t>capteurs</w:t>
+              <w:t>pesanteur</w:t>
+            </w:r>
+            <w:r>
+              <w:rPr>
+                <w:rFonts w:cs="Aptos"/>
+                <w:sz w:val="20"/>
+              </w:rPr>
+              <w:t xml:space="preserve">, </w:t>
+            </w:r>
+            <w:r>
+              <w:rPr>
+                <w:rFonts w:ascii="Cascadia Mono" w:eastAsia="Cascadia Mono" w:hAnsi="Cascadia Mono" w:cs="Cascadia Mono"/>
+                <w:color w:val="1B3A6B"/>
+                <w:sz w:val="17"/>
+              </w:rPr>
+              <w:t>actions</w:t>
+            </w:r>
+            <w:r>
+              <w:rPr>
+                <w:rFonts w:cs="Aptos"/>
+                <w:sz w:val="20"/>
+              </w:rPr>
+              <w:t xml:space="preserve">, </w:t>
+            </w:r>
+            <w:r>
+              <w:rPr>
+                <w:rFonts w:ascii="Cascadia Mono" w:eastAsia="Cascadia Mono" w:hAnsi="Cascadia Mono" w:cs="Cascadia Mono"/>
+                <w:color w:val="1B3A6B"/>
+                <w:sz w:val="17"/>
+              </w:rPr>
+              <w:t>ressorts</w:t>
             </w:r>
           </w:p>
         </w:tc>
@@ -14299,7 +14763,7 @@
                 <w:rFonts w:cs="Aptos"/>
                 <w:sz w:val="20"/>
               </w:rPr>
-              <w:t>capteurs de point et de liaison</w:t>
+              <w:t>données d'entrée</w:t>
             </w:r>
           </w:p>
         </w:tc>
@@ -14323,7 +14787,7 @@
                 <w:color w:val="1B3A6B"/>
                 <w:sz w:val="17"/>
               </w:rPr>
-              <w:t>reglages</w:t>
+              <w:t>capteurs</w:t>
             </w:r>
           </w:p>
         </w:tc>
@@ -14331,6 +14795,48 @@
           <w:tcPr>
             <w:tcW w:w="6236" w:type="dxa"/>
             <w:shd w:val="clear" w:color="auto" w:fill="F5F4EF"/>
+          </w:tcPr>
+          <w:p>
+            <w:pPr>
+              <w:spacing w:after="0" w:line="252" w:lineRule="auto"/>
+            </w:pPr>
+            <w:r>
+              <w:rPr>
+                <w:rFonts w:cs="Aptos"/>
+                <w:sz w:val="20"/>
+              </w:rPr>
+              <w:t>capteurs de point et de liaison</w:t>
+            </w:r>
+          </w:p>
+        </w:tc>
+      </w:tr>
+      <w:tr>
+        <w:trPr>
+          <w:jc w:val="center"/>
+        </w:trPr>
+        <w:tc>
+          <w:tcPr>
+            <w:tcW w:w="3175" w:type="dxa"/>
+            <w:shd w:val="clear" w:color="auto" w:fill="FAFAF7"/>
+          </w:tcPr>
+          <w:p>
+            <w:pPr>
+              <w:spacing w:after="0" w:line="252" w:lineRule="auto"/>
+            </w:pPr>
+            <w:r>
+              <w:rPr>
+                <w:rFonts w:ascii="Cascadia Mono" w:eastAsia="Cascadia Mono" w:hAnsi="Cascadia Mono" w:cs="Cascadia Mono"/>
+                <w:color w:val="1B3A6B"/>
+                <w:sz w:val="17"/>
+              </w:rPr>
+              <w:t>reglages</w:t>
+            </w:r>
+          </w:p>
+        </w:tc>
+        <w:tc>
+          <w:tcPr>
+            <w:tcW w:w="6236" w:type="dxa"/>
+            <w:shd w:val="clear" w:color="auto" w:fill="FAFAF7"/>
           </w:tcPr>
           <w:p>
             <w:pPr>
@@ -14372,7 +14878,7 @@
       <w:pPr>
         <w:pStyle w:val="Titre1"/>
       </w:pPr>
-      <w:bookmarkStart w:id="43" w:name="_Toc243989745"/>
+      <w:bookmarkStart w:id="43" w:name="_Toc244069516"/>
       <w:r>
         <w:t>Annexe C — Références et licence</w:t>
       </w:r>
@@ -14496,7 +15002,7 @@
           <w:noProof/>
         </w:rPr>
         <w:drawing>
-          <wp:inline distT="0" distB="0" distL="0" distR="0" wp14:anchorId="715BE3F9" wp14:editId="6D45B2D4">
+          <wp:inline distT="0" distB="0" distL="0" distR="0" wp14:anchorId="3F0251E0" wp14:editId="570BC88E">
             <wp:extent cx="5976000" cy="50800"/>
             <wp:effectExtent l="0" t="0" r="0" b="0"/>
             <wp:docPr id="22" name="Picture 22"/>
@@ -14763,10 +15269,10 @@
               <w:noProof/>
             </w:rPr>
             <w:drawing>
-              <wp:inline distT="0" distB="0" distL="0" distR="0" wp14:anchorId="1A527A37" wp14:editId="69274BC5">
+              <wp:inline distT="0" distB="0" distL="0" distR="0" wp14:anchorId="797CCA3C" wp14:editId="43676851">
                 <wp:extent cx="1512000" cy="432000"/>
                 <wp:effectExtent l="0" t="0" r="0" b="0"/>
-                <wp:docPr id="1095741739" name="Picture 1"/>
+                <wp:docPr id="1728730870" name="Picture 1"/>
                 <wp:cNvGraphicFramePr>
                   <a:graphicFrameLocks xmlns:a="http://schemas.openxmlformats.org/drawingml/2006/main" noChangeAspect="1"/>
                 </wp:cNvGraphicFramePr>
@@ -15014,31 +15520,31 @@
       </w:rPr>
     </w:lvl>
   </w:abstractNum>
-  <w:num w:numId="1" w16cid:durableId="325402782">
+  <w:num w:numId="1" w16cid:durableId="1357542213">
     <w:abstractNumId w:val="8"/>
   </w:num>
-  <w:num w:numId="2" w16cid:durableId="1181705475">
+  <w:num w:numId="2" w16cid:durableId="376053060">
     <w:abstractNumId w:val="6"/>
   </w:num>
-  <w:num w:numId="3" w16cid:durableId="1776905371">
+  <w:num w:numId="3" w16cid:durableId="1356535769">
     <w:abstractNumId w:val="5"/>
   </w:num>
-  <w:num w:numId="4" w16cid:durableId="93863985">
+  <w:num w:numId="4" w16cid:durableId="1500343710">
     <w:abstractNumId w:val="4"/>
   </w:num>
-  <w:num w:numId="5" w16cid:durableId="1051853363">
+  <w:num w:numId="5" w16cid:durableId="1085230123">
     <w:abstractNumId w:val="7"/>
   </w:num>
-  <w:num w:numId="6" w16cid:durableId="21824259">
+  <w:num w:numId="6" w16cid:durableId="1061053929">
     <w:abstractNumId w:val="3"/>
   </w:num>
-  <w:num w:numId="7" w16cid:durableId="1155098875">
+  <w:num w:numId="7" w16cid:durableId="1373728209">
     <w:abstractNumId w:val="2"/>
   </w:num>
-  <w:num w:numId="8" w16cid:durableId="1464041456">
+  <w:num w:numId="8" w16cid:durableId="1679045156">
     <w:abstractNumId w:val="1"/>
   </w:num>
-  <w:num w:numId="9" w16cid:durableId="1244144906">
+  <w:num w:numId="9" w16cid:durableId="1134716835">
     <w:abstractNumId w:val="0"/>
   </w:num>
 </w:numbering>
@@ -26430,7 +26936,7 @@
     <w:autoRedefine/>
     <w:uiPriority w:val="39"/>
     <w:unhideWhenUsed/>
-    <w:rsid w:val="006F607C"/>
+    <w:rsid w:val="007827AD"/>
     <w:pPr>
       <w:spacing w:after="100"/>
     </w:pPr>
@@ -26442,7 +26948,7 @@
     <w:autoRedefine/>
     <w:uiPriority w:val="39"/>
     <w:unhideWhenUsed/>
-    <w:rsid w:val="006F607C"/>
+    <w:rsid w:val="007827AD"/>
     <w:pPr>
       <w:spacing w:after="100"/>
       <w:ind w:left="220"/>
@@ -26453,7 +26959,7 @@
     <w:basedOn w:val="Policepardfaut"/>
     <w:uiPriority w:val="99"/>
     <w:unhideWhenUsed/>
-    <w:rsid w:val="006F607C"/>
+    <w:rsid w:val="007827AD"/>
     <w:rPr>
       <w:color w:val="0000FF" w:themeColor="hyperlink"/>
       <w:u w:val="single"/>

</xml_diff>

<commit_message>
feat(EX-07, EX-65): SolidCraft démarré sans question avec Meca3D, « Démarrer SolidCraft », études et maquettes récentes (lot 16)
Co-Authored-By: Claude Opus 5.5 <noreply@anthropic.com>
</commit_message>
<xml_diff>
--- a/docs/guide/Meca3D_Guide_utilisateur.docx
+++ b/docs/guide/Meca3D_Guide_utilisateur.docx
@@ -48,7 +48,7 @@
                 <w:noProof/>
               </w:rPr>
               <w:drawing>
-                <wp:inline distT="0" distB="0" distL="0" distR="0" wp14:anchorId="7D8D6E40" wp14:editId="35CB77B9">
+                <wp:inline distT="0" distB="0" distL="0" distR="0" wp14:anchorId="1A8C4BE9" wp14:editId="1348EAE9">
                   <wp:extent cx="3240000" cy="925714"/>
                   <wp:effectExtent l="0" t="0" r="0" b="0"/>
                   <wp:docPr id="1" name="Picture 1"/>
@@ -153,7 +153,7 @@
                 <w:color w:val="8A8A8A"/>
                 <w:sz w:val="20"/>
               </w:rPr>
-              <w:t>RÉFÉRENCE  MIA-DOC-2026-101    VERSION  1.1    ÉMIS LE  28/10/2026</w:t>
+              <w:t>RÉFÉRENCE  MIA-DOC-2026-101    VERSION  1.2    ÉMIS LE  28/10/2026</w:t>
             </w:r>
             <w:r>
               <w:br/>
@@ -200,7 +200,7 @@
       <w:pPr>
         <w:pStyle w:val="Titre1"/>
       </w:pPr>
-      <w:bookmarkStart w:id="0" w:name="_Toc244069473"/>
+      <w:bookmarkStart w:id="0" w:name="_Toc244157758"/>
       <w:r>
         <w:t>Table des matières</w:t>
       </w:r>
@@ -225,7 +225,7 @@
       <w:r>
         <w:fldChar w:fldCharType="separate"/>
       </w:r>
-      <w:hyperlink w:anchor="_Toc244069473" w:history="1">
+      <w:hyperlink w:anchor="_Toc244157758" w:history="1">
         <w:r>
           <w:rPr>
             <w:rStyle w:val="Lienhypertexte"/>
@@ -252,7 +252,7 @@
             <w:noProof/>
             <w:webHidden/>
           </w:rPr>
-          <w:instrText xml:space="preserve"> PAGEREF _Toc244069473 \h </w:instrText>
+          <w:instrText xml:space="preserve"> PAGEREF _Toc244157758 \h </w:instrText>
         </w:r>
         <w:r>
           <w:rPr>
@@ -293,7 +293,7 @@
           <w:noProof/>
         </w:rPr>
       </w:pPr>
-      <w:hyperlink w:anchor="_Toc244069474" w:history="1">
+      <w:hyperlink w:anchor="_Toc244157759" w:history="1">
         <w:r>
           <w:rPr>
             <w:rStyle w:val="Lienhypertexte"/>
@@ -320,7 +320,7 @@
             <w:noProof/>
             <w:webHidden/>
           </w:rPr>
-          <w:instrText xml:space="preserve"> PAGEREF _Toc244069474 \h </w:instrText>
+          <w:instrText xml:space="preserve"> PAGEREF _Toc244157759 \h </w:instrText>
         </w:r>
         <w:r>
           <w:rPr>
@@ -361,7 +361,7 @@
           <w:noProof/>
         </w:rPr>
       </w:pPr>
-      <w:hyperlink w:anchor="_Toc244069475" w:history="1">
+      <w:hyperlink w:anchor="_Toc244157760" w:history="1">
         <w:r>
           <w:rPr>
             <w:rStyle w:val="Lienhypertexte"/>
@@ -388,7 +388,7 @@
             <w:noProof/>
             <w:webHidden/>
           </w:rPr>
-          <w:instrText xml:space="preserve"> PAGEREF _Toc244069475 \h </w:instrText>
+          <w:instrText xml:space="preserve"> PAGEREF _Toc244157760 \h </w:instrText>
         </w:r>
         <w:r>
           <w:rPr>
@@ -429,7 +429,7 @@
           <w:noProof/>
         </w:rPr>
       </w:pPr>
-      <w:hyperlink w:anchor="_Toc244069476" w:history="1">
+      <w:hyperlink w:anchor="_Toc244157761" w:history="1">
         <w:r>
           <w:rPr>
             <w:rStyle w:val="Lienhypertexte"/>
@@ -456,7 +456,7 @@
             <w:noProof/>
             <w:webHidden/>
           </w:rPr>
-          <w:instrText xml:space="preserve"> PAGEREF _Toc244069476 \h </w:instrText>
+          <w:instrText xml:space="preserve"> PAGEREF _Toc244157761 \h </w:instrText>
         </w:r>
         <w:r>
           <w:rPr>
@@ -497,7 +497,7 @@
           <w:noProof/>
         </w:rPr>
       </w:pPr>
-      <w:hyperlink w:anchor="_Toc244069477" w:history="1">
+      <w:hyperlink w:anchor="_Toc244157762" w:history="1">
         <w:r>
           <w:rPr>
             <w:rStyle w:val="Lienhypertexte"/>
@@ -524,7 +524,7 @@
             <w:noProof/>
             <w:webHidden/>
           </w:rPr>
-          <w:instrText xml:space="preserve"> PAGEREF _Toc244069477 \h </w:instrText>
+          <w:instrText xml:space="preserve"> PAGEREF _Toc244157762 \h </w:instrText>
         </w:r>
         <w:r>
           <w:rPr>
@@ -565,7 +565,7 @@
           <w:noProof/>
         </w:rPr>
       </w:pPr>
-      <w:hyperlink w:anchor="_Toc244069478" w:history="1">
+      <w:hyperlink w:anchor="_Toc244157763" w:history="1">
         <w:r>
           <w:rPr>
             <w:rStyle w:val="Lienhypertexte"/>
@@ -592,7 +592,7 @@
             <w:noProof/>
             <w:webHidden/>
           </w:rPr>
-          <w:instrText xml:space="preserve"> PAGEREF _Toc244069478 \h </w:instrText>
+          <w:instrText xml:space="preserve"> PAGEREF _Toc244157763 \h </w:instrText>
         </w:r>
         <w:r>
           <w:rPr>
@@ -633,7 +633,7 @@
           <w:noProof/>
         </w:rPr>
       </w:pPr>
-      <w:hyperlink w:anchor="_Toc244069479" w:history="1">
+      <w:hyperlink w:anchor="_Toc244157764" w:history="1">
         <w:r>
           <w:rPr>
             <w:rStyle w:val="Lienhypertexte"/>
@@ -660,7 +660,7 @@
             <w:noProof/>
             <w:webHidden/>
           </w:rPr>
-          <w:instrText xml:space="preserve"> PAGEREF _Toc244069479 \h </w:instrText>
+          <w:instrText xml:space="preserve"> PAGEREF _Toc244157764 \h </w:instrText>
         </w:r>
         <w:r>
           <w:rPr>
@@ -701,7 +701,7 @@
           <w:noProof/>
         </w:rPr>
       </w:pPr>
-      <w:hyperlink w:anchor="_Toc244069480" w:history="1">
+      <w:hyperlink w:anchor="_Toc244157765" w:history="1">
         <w:r>
           <w:rPr>
             <w:rStyle w:val="Lienhypertexte"/>
@@ -728,7 +728,7 @@
             <w:noProof/>
             <w:webHidden/>
           </w:rPr>
-          <w:instrText xml:space="preserve"> PAGEREF _Toc244069480 \h </w:instrText>
+          <w:instrText xml:space="preserve"> PAGEREF _Toc244157765 \h </w:instrText>
         </w:r>
         <w:r>
           <w:rPr>
@@ -769,7 +769,7 @@
           <w:noProof/>
         </w:rPr>
       </w:pPr>
-      <w:hyperlink w:anchor="_Toc244069481" w:history="1">
+      <w:hyperlink w:anchor="_Toc244157766" w:history="1">
         <w:r>
           <w:rPr>
             <w:rStyle w:val="Lienhypertexte"/>
@@ -796,7 +796,7 @@
             <w:noProof/>
             <w:webHidden/>
           </w:rPr>
-          <w:instrText xml:space="preserve"> PAGEREF _Toc244069481 \h </w:instrText>
+          <w:instrText xml:space="preserve"> PAGEREF _Toc244157766 \h </w:instrText>
         </w:r>
         <w:r>
           <w:rPr>
@@ -837,7 +837,7 @@
           <w:noProof/>
         </w:rPr>
       </w:pPr>
-      <w:hyperlink w:anchor="_Toc244069482" w:history="1">
+      <w:hyperlink w:anchor="_Toc244157767" w:history="1">
         <w:r>
           <w:rPr>
             <w:rStyle w:val="Lienhypertexte"/>
@@ -864,7 +864,7 @@
             <w:noProof/>
             <w:webHidden/>
           </w:rPr>
-          <w:instrText xml:space="preserve"> PAGEREF _Toc244069482 \h </w:instrText>
+          <w:instrText xml:space="preserve"> PAGEREF _Toc244157767 \h </w:instrText>
         </w:r>
         <w:r>
           <w:rPr>
@@ -905,7 +905,7 @@
           <w:noProof/>
         </w:rPr>
       </w:pPr>
-      <w:hyperlink w:anchor="_Toc244069483" w:history="1">
+      <w:hyperlink w:anchor="_Toc244157768" w:history="1">
         <w:r>
           <w:rPr>
             <w:rStyle w:val="Lienhypertexte"/>
@@ -932,7 +932,7 @@
             <w:noProof/>
             <w:webHidden/>
           </w:rPr>
-          <w:instrText xml:space="preserve"> PAGEREF _Toc244069483 \h </w:instrText>
+          <w:instrText xml:space="preserve"> PAGEREF _Toc244157768 \h </w:instrText>
         </w:r>
         <w:r>
           <w:rPr>
@@ -973,7 +973,7 @@
           <w:noProof/>
         </w:rPr>
       </w:pPr>
-      <w:hyperlink w:anchor="_Toc244069484" w:history="1">
+      <w:hyperlink w:anchor="_Toc244157769" w:history="1">
         <w:r>
           <w:rPr>
             <w:rStyle w:val="Lienhypertexte"/>
@@ -1000,7 +1000,7 @@
             <w:noProof/>
             <w:webHidden/>
           </w:rPr>
-          <w:instrText xml:space="preserve"> PAGEREF _Toc244069484 \h </w:instrText>
+          <w:instrText xml:space="preserve"> PAGEREF _Toc244157769 \h </w:instrText>
         </w:r>
         <w:r>
           <w:rPr>
@@ -1041,7 +1041,7 @@
           <w:noProof/>
         </w:rPr>
       </w:pPr>
-      <w:hyperlink w:anchor="_Toc244069485" w:history="1">
+      <w:hyperlink w:anchor="_Toc244157770" w:history="1">
         <w:r>
           <w:rPr>
             <w:rStyle w:val="Lienhypertexte"/>
@@ -1068,7 +1068,7 @@
             <w:noProof/>
             <w:webHidden/>
           </w:rPr>
-          <w:instrText xml:space="preserve"> PAGEREF _Toc244069485 \h </w:instrText>
+          <w:instrText xml:space="preserve"> PAGEREF _Toc244157770 \h </w:instrText>
         </w:r>
         <w:r>
           <w:rPr>
@@ -1109,7 +1109,7 @@
           <w:noProof/>
         </w:rPr>
       </w:pPr>
-      <w:hyperlink w:anchor="_Toc244069486" w:history="1">
+      <w:hyperlink w:anchor="_Toc244157771" w:history="1">
         <w:r>
           <w:rPr>
             <w:rStyle w:val="Lienhypertexte"/>
@@ -1136,7 +1136,7 @@
             <w:noProof/>
             <w:webHidden/>
           </w:rPr>
-          <w:instrText xml:space="preserve"> PAGEREF _Toc244069486 \h </w:instrText>
+          <w:instrText xml:space="preserve"> PAGEREF _Toc244157771 \h </w:instrText>
         </w:r>
         <w:r>
           <w:rPr>
@@ -1177,7 +1177,7 @@
           <w:noProof/>
         </w:rPr>
       </w:pPr>
-      <w:hyperlink w:anchor="_Toc244069487" w:history="1">
+      <w:hyperlink w:anchor="_Toc244157772" w:history="1">
         <w:r>
           <w:rPr>
             <w:rStyle w:val="Lienhypertexte"/>
@@ -1204,7 +1204,7 @@
             <w:noProof/>
             <w:webHidden/>
           </w:rPr>
-          <w:instrText xml:space="preserve"> PAGEREF _Toc244069487 \h </w:instrText>
+          <w:instrText xml:space="preserve"> PAGEREF _Toc244157772 \h </w:instrText>
         </w:r>
         <w:r>
           <w:rPr>
@@ -1245,7 +1245,7 @@
           <w:noProof/>
         </w:rPr>
       </w:pPr>
-      <w:hyperlink w:anchor="_Toc244069488" w:history="1">
+      <w:hyperlink w:anchor="_Toc244157773" w:history="1">
         <w:r>
           <w:rPr>
             <w:rStyle w:val="Lienhypertexte"/>
@@ -1272,7 +1272,7 @@
             <w:noProof/>
             <w:webHidden/>
           </w:rPr>
-          <w:instrText xml:space="preserve"> PAGEREF _Toc244069488 \h </w:instrText>
+          <w:instrText xml:space="preserve"> PAGEREF _Toc244157773 \h </w:instrText>
         </w:r>
         <w:r>
           <w:rPr>
@@ -1313,7 +1313,7 @@
           <w:noProof/>
         </w:rPr>
       </w:pPr>
-      <w:hyperlink w:anchor="_Toc244069489" w:history="1">
+      <w:hyperlink w:anchor="_Toc244157774" w:history="1">
         <w:r>
           <w:rPr>
             <w:rStyle w:val="Lienhypertexte"/>
@@ -1340,7 +1340,7 @@
             <w:noProof/>
             <w:webHidden/>
           </w:rPr>
-          <w:instrText xml:space="preserve"> PAGEREF _Toc244069489 \h </w:instrText>
+          <w:instrText xml:space="preserve"> PAGEREF _Toc244157774 \h </w:instrText>
         </w:r>
         <w:r>
           <w:rPr>
@@ -1381,7 +1381,7 @@
           <w:noProof/>
         </w:rPr>
       </w:pPr>
-      <w:hyperlink w:anchor="_Toc244069490" w:history="1">
+      <w:hyperlink w:anchor="_Toc244157775" w:history="1">
         <w:r>
           <w:rPr>
             <w:rStyle w:val="Lienhypertexte"/>
@@ -1408,7 +1408,7 @@
             <w:noProof/>
             <w:webHidden/>
           </w:rPr>
-          <w:instrText xml:space="preserve"> PAGEREF _Toc244069490 \h </w:instrText>
+          <w:instrText xml:space="preserve"> PAGEREF _Toc244157775 \h </w:instrText>
         </w:r>
         <w:r>
           <w:rPr>
@@ -1449,7 +1449,7 @@
           <w:noProof/>
         </w:rPr>
       </w:pPr>
-      <w:hyperlink w:anchor="_Toc244069491" w:history="1">
+      <w:hyperlink w:anchor="_Toc244157776" w:history="1">
         <w:r>
           <w:rPr>
             <w:rStyle w:val="Lienhypertexte"/>
@@ -1476,7 +1476,7 @@
             <w:noProof/>
             <w:webHidden/>
           </w:rPr>
-          <w:instrText xml:space="preserve"> PAGEREF _Toc244069491 \h </w:instrText>
+          <w:instrText xml:space="preserve"> PAGEREF _Toc244157776 \h </w:instrText>
         </w:r>
         <w:r>
           <w:rPr>
@@ -1517,7 +1517,7 @@
           <w:noProof/>
         </w:rPr>
       </w:pPr>
-      <w:hyperlink w:anchor="_Toc244069492" w:history="1">
+      <w:hyperlink w:anchor="_Toc244157777" w:history="1">
         <w:r>
           <w:rPr>
             <w:rStyle w:val="Lienhypertexte"/>
@@ -1544,7 +1544,7 @@
             <w:noProof/>
             <w:webHidden/>
           </w:rPr>
-          <w:instrText xml:space="preserve"> PAGEREF _Toc244069492 \h </w:instrText>
+          <w:instrText xml:space="preserve"> PAGEREF _Toc244157777 \h </w:instrText>
         </w:r>
         <w:r>
           <w:rPr>
@@ -1585,7 +1585,7 @@
           <w:noProof/>
         </w:rPr>
       </w:pPr>
-      <w:hyperlink w:anchor="_Toc244069493" w:history="1">
+      <w:hyperlink w:anchor="_Toc244157778" w:history="1">
         <w:r>
           <w:rPr>
             <w:rStyle w:val="Lienhypertexte"/>
@@ -1612,7 +1612,7 @@
             <w:noProof/>
             <w:webHidden/>
           </w:rPr>
-          <w:instrText xml:space="preserve"> PAGEREF _Toc244069493 \h </w:instrText>
+          <w:instrText xml:space="preserve"> PAGEREF _Toc244157778 \h </w:instrText>
         </w:r>
         <w:r>
           <w:rPr>
@@ -1653,7 +1653,7 @@
           <w:noProof/>
         </w:rPr>
       </w:pPr>
-      <w:hyperlink w:anchor="_Toc244069494" w:history="1">
+      <w:hyperlink w:anchor="_Toc244157779" w:history="1">
         <w:r>
           <w:rPr>
             <w:rStyle w:val="Lienhypertexte"/>
@@ -1680,7 +1680,7 @@
             <w:noProof/>
             <w:webHidden/>
           </w:rPr>
-          <w:instrText xml:space="preserve"> PAGEREF _Toc244069494 \h </w:instrText>
+          <w:instrText xml:space="preserve"> PAGEREF _Toc244157779 \h </w:instrText>
         </w:r>
         <w:r>
           <w:rPr>
@@ -1721,7 +1721,7 @@
           <w:noProof/>
         </w:rPr>
       </w:pPr>
-      <w:hyperlink w:anchor="_Toc244069495" w:history="1">
+      <w:hyperlink w:anchor="_Toc244157780" w:history="1">
         <w:r>
           <w:rPr>
             <w:rStyle w:val="Lienhypertexte"/>
@@ -1748,7 +1748,7 @@
             <w:noProof/>
             <w:webHidden/>
           </w:rPr>
-          <w:instrText xml:space="preserve"> PAGEREF _Toc244069495 \h </w:instrText>
+          <w:instrText xml:space="preserve"> PAGEREF _Toc244157780 \h </w:instrText>
         </w:r>
         <w:r>
           <w:rPr>
@@ -1789,7 +1789,7 @@
           <w:noProof/>
         </w:rPr>
       </w:pPr>
-      <w:hyperlink w:anchor="_Toc244069496" w:history="1">
+      <w:hyperlink w:anchor="_Toc244157781" w:history="1">
         <w:r>
           <w:rPr>
             <w:rStyle w:val="Lienhypertexte"/>
@@ -1816,7 +1816,7 @@
             <w:noProof/>
             <w:webHidden/>
           </w:rPr>
-          <w:instrText xml:space="preserve"> PAGEREF _Toc244069496 \h </w:instrText>
+          <w:instrText xml:space="preserve"> PAGEREF _Toc244157781 \h </w:instrText>
         </w:r>
         <w:r>
           <w:rPr>
@@ -1857,7 +1857,7 @@
           <w:noProof/>
         </w:rPr>
       </w:pPr>
-      <w:hyperlink w:anchor="_Toc244069497" w:history="1">
+      <w:hyperlink w:anchor="_Toc244157782" w:history="1">
         <w:r>
           <w:rPr>
             <w:rStyle w:val="Lienhypertexte"/>
@@ -1884,7 +1884,7 @@
             <w:noProof/>
             <w:webHidden/>
           </w:rPr>
-          <w:instrText xml:space="preserve"> PAGEREF _Toc244069497 \h </w:instrText>
+          <w:instrText xml:space="preserve"> PAGEREF _Toc244157782 \h </w:instrText>
         </w:r>
         <w:r>
           <w:rPr>
@@ -1925,7 +1925,7 @@
           <w:noProof/>
         </w:rPr>
       </w:pPr>
-      <w:hyperlink w:anchor="_Toc244069498" w:history="1">
+      <w:hyperlink w:anchor="_Toc244157783" w:history="1">
         <w:r>
           <w:rPr>
             <w:rStyle w:val="Lienhypertexte"/>
@@ -1952,7 +1952,7 @@
             <w:noProof/>
             <w:webHidden/>
           </w:rPr>
-          <w:instrText xml:space="preserve"> PAGEREF _Toc244069498 \h </w:instrText>
+          <w:instrText xml:space="preserve"> PAGEREF _Toc244157783 \h </w:instrText>
         </w:r>
         <w:r>
           <w:rPr>
@@ -1993,7 +1993,7 @@
           <w:noProof/>
         </w:rPr>
       </w:pPr>
-      <w:hyperlink w:anchor="_Toc244069499" w:history="1">
+      <w:hyperlink w:anchor="_Toc244157784" w:history="1">
         <w:r>
           <w:rPr>
             <w:rStyle w:val="Lienhypertexte"/>
@@ -2020,7 +2020,7 @@
             <w:noProof/>
             <w:webHidden/>
           </w:rPr>
-          <w:instrText xml:space="preserve"> PAGEREF _Toc244069499 \h </w:instrText>
+          <w:instrText xml:space="preserve"> PAGEREF _Toc244157784 \h </w:instrText>
         </w:r>
         <w:r>
           <w:rPr>
@@ -2061,7 +2061,7 @@
           <w:noProof/>
         </w:rPr>
       </w:pPr>
-      <w:hyperlink w:anchor="_Toc244069500" w:history="1">
+      <w:hyperlink w:anchor="_Toc244157785" w:history="1">
         <w:r>
           <w:rPr>
             <w:rStyle w:val="Lienhypertexte"/>
@@ -2088,7 +2088,7 @@
             <w:noProof/>
             <w:webHidden/>
           </w:rPr>
-          <w:instrText xml:space="preserve"> PAGEREF _Toc244069500 \h </w:instrText>
+          <w:instrText xml:space="preserve"> PAGEREF _Toc244157785 \h </w:instrText>
         </w:r>
         <w:r>
           <w:rPr>
@@ -2129,7 +2129,7 @@
           <w:noProof/>
         </w:rPr>
       </w:pPr>
-      <w:hyperlink w:anchor="_Toc244069501" w:history="1">
+      <w:hyperlink w:anchor="_Toc244157786" w:history="1">
         <w:r>
           <w:rPr>
             <w:rStyle w:val="Lienhypertexte"/>
@@ -2156,7 +2156,7 @@
             <w:noProof/>
             <w:webHidden/>
           </w:rPr>
-          <w:instrText xml:space="preserve"> PAGEREF _Toc244069501 \h </w:instrText>
+          <w:instrText xml:space="preserve"> PAGEREF _Toc244157786 \h </w:instrText>
         </w:r>
         <w:r>
           <w:rPr>
@@ -2197,7 +2197,7 @@
           <w:noProof/>
         </w:rPr>
       </w:pPr>
-      <w:hyperlink w:anchor="_Toc244069502" w:history="1">
+      <w:hyperlink w:anchor="_Toc244157787" w:history="1">
         <w:r>
           <w:rPr>
             <w:rStyle w:val="Lienhypertexte"/>
@@ -2224,7 +2224,7 @@
             <w:noProof/>
             <w:webHidden/>
           </w:rPr>
-          <w:instrText xml:space="preserve"> PAGEREF _Toc244069502 \h </w:instrText>
+          <w:instrText xml:space="preserve"> PAGEREF _Toc244157787 \h </w:instrText>
         </w:r>
         <w:r>
           <w:rPr>
@@ -2265,7 +2265,7 @@
           <w:noProof/>
         </w:rPr>
       </w:pPr>
-      <w:hyperlink w:anchor="_Toc244069503" w:history="1">
+      <w:hyperlink w:anchor="_Toc244157788" w:history="1">
         <w:r>
           <w:rPr>
             <w:rStyle w:val="Lienhypertexte"/>
@@ -2292,7 +2292,7 @@
             <w:noProof/>
             <w:webHidden/>
           </w:rPr>
-          <w:instrText xml:space="preserve"> PAGEREF _Toc244069503 \h </w:instrText>
+          <w:instrText xml:space="preserve"> PAGEREF _Toc244157788 \h </w:instrText>
         </w:r>
         <w:r>
           <w:rPr>
@@ -2333,7 +2333,7 @@
           <w:noProof/>
         </w:rPr>
       </w:pPr>
-      <w:hyperlink w:anchor="_Toc244069504" w:history="1">
+      <w:hyperlink w:anchor="_Toc244157789" w:history="1">
         <w:r>
           <w:rPr>
             <w:rStyle w:val="Lienhypertexte"/>
@@ -2360,7 +2360,7 @@
             <w:noProof/>
             <w:webHidden/>
           </w:rPr>
-          <w:instrText xml:space="preserve"> PAGEREF _Toc244069504 \h </w:instrText>
+          <w:instrText xml:space="preserve"> PAGEREF _Toc244157789 \h </w:instrText>
         </w:r>
         <w:r>
           <w:rPr>
@@ -2401,7 +2401,7 @@
           <w:noProof/>
         </w:rPr>
       </w:pPr>
-      <w:hyperlink w:anchor="_Toc244069505" w:history="1">
+      <w:hyperlink w:anchor="_Toc244157790" w:history="1">
         <w:r>
           <w:rPr>
             <w:rStyle w:val="Lienhypertexte"/>
@@ -2428,7 +2428,7 @@
             <w:noProof/>
             <w:webHidden/>
           </w:rPr>
-          <w:instrText xml:space="preserve"> PAGEREF _Toc244069505 \h </w:instrText>
+          <w:instrText xml:space="preserve"> PAGEREF _Toc244157790 \h </w:instrText>
         </w:r>
         <w:r>
           <w:rPr>
@@ -2469,7 +2469,7 @@
           <w:noProof/>
         </w:rPr>
       </w:pPr>
-      <w:hyperlink w:anchor="_Toc244069506" w:history="1">
+      <w:hyperlink w:anchor="_Toc244157791" w:history="1">
         <w:r>
           <w:rPr>
             <w:rStyle w:val="Lienhypertexte"/>
@@ -2496,7 +2496,7 @@
             <w:noProof/>
             <w:webHidden/>
           </w:rPr>
-          <w:instrText xml:space="preserve"> PAGEREF _Toc244069506 \h </w:instrText>
+          <w:instrText xml:space="preserve"> PAGEREF _Toc244157791 \h </w:instrText>
         </w:r>
         <w:r>
           <w:rPr>
@@ -2537,7 +2537,7 @@
           <w:noProof/>
         </w:rPr>
       </w:pPr>
-      <w:hyperlink w:anchor="_Toc244069507" w:history="1">
+      <w:hyperlink w:anchor="_Toc244157792" w:history="1">
         <w:r>
           <w:rPr>
             <w:rStyle w:val="Lienhypertexte"/>
@@ -2564,7 +2564,7 @@
             <w:noProof/>
             <w:webHidden/>
           </w:rPr>
-          <w:instrText xml:space="preserve"> PAGEREF _Toc244069507 \h </w:instrText>
+          <w:instrText xml:space="preserve"> PAGEREF _Toc244157792 \h </w:instrText>
         </w:r>
         <w:r>
           <w:rPr>
@@ -2605,7 +2605,7 @@
           <w:noProof/>
         </w:rPr>
       </w:pPr>
-      <w:hyperlink w:anchor="_Toc244069508" w:history="1">
+      <w:hyperlink w:anchor="_Toc244157793" w:history="1">
         <w:r>
           <w:rPr>
             <w:rStyle w:val="Lienhypertexte"/>
@@ -2632,7 +2632,7 @@
             <w:noProof/>
             <w:webHidden/>
           </w:rPr>
-          <w:instrText xml:space="preserve"> PAGEREF _Toc244069508 \h </w:instrText>
+          <w:instrText xml:space="preserve"> PAGEREF _Toc244157793 \h </w:instrText>
         </w:r>
         <w:r>
           <w:rPr>
@@ -2673,7 +2673,7 @@
           <w:noProof/>
         </w:rPr>
       </w:pPr>
-      <w:hyperlink w:anchor="_Toc244069509" w:history="1">
+      <w:hyperlink w:anchor="_Toc244157794" w:history="1">
         <w:r>
           <w:rPr>
             <w:rStyle w:val="Lienhypertexte"/>
@@ -2700,7 +2700,7 @@
             <w:noProof/>
             <w:webHidden/>
           </w:rPr>
-          <w:instrText xml:space="preserve"> PAGEREF _Toc244069509 \h </w:instrText>
+          <w:instrText xml:space="preserve"> PAGEREF _Toc244157794 \h </w:instrText>
         </w:r>
         <w:r>
           <w:rPr>
@@ -2741,7 +2741,7 @@
           <w:noProof/>
         </w:rPr>
       </w:pPr>
-      <w:hyperlink w:anchor="_Toc244069510" w:history="1">
+      <w:hyperlink w:anchor="_Toc244157795" w:history="1">
         <w:r>
           <w:rPr>
             <w:rStyle w:val="Lienhypertexte"/>
@@ -2768,7 +2768,7 @@
             <w:noProof/>
             <w:webHidden/>
           </w:rPr>
-          <w:instrText xml:space="preserve"> PAGEREF _Toc244069510 \h </w:instrText>
+          <w:instrText xml:space="preserve"> PAGEREF _Toc244157795 \h </w:instrText>
         </w:r>
         <w:r>
           <w:rPr>
@@ -2809,7 +2809,7 @@
           <w:noProof/>
         </w:rPr>
       </w:pPr>
-      <w:hyperlink w:anchor="_Toc244069511" w:history="1">
+      <w:hyperlink w:anchor="_Toc244157796" w:history="1">
         <w:r>
           <w:rPr>
             <w:rStyle w:val="Lienhypertexte"/>
@@ -2836,7 +2836,7 @@
             <w:noProof/>
             <w:webHidden/>
           </w:rPr>
-          <w:instrText xml:space="preserve"> PAGEREF _Toc244069511 \h </w:instrText>
+          <w:instrText xml:space="preserve"> PAGEREF _Toc244157796 \h </w:instrText>
         </w:r>
         <w:r>
           <w:rPr>
@@ -2877,7 +2877,7 @@
           <w:noProof/>
         </w:rPr>
       </w:pPr>
-      <w:hyperlink w:anchor="_Toc244069512" w:history="1">
+      <w:hyperlink w:anchor="_Toc244157797" w:history="1">
         <w:r>
           <w:rPr>
             <w:rStyle w:val="Lienhypertexte"/>
@@ -2904,7 +2904,7 @@
             <w:noProof/>
             <w:webHidden/>
           </w:rPr>
-          <w:instrText xml:space="preserve"> PAGEREF _Toc244069512 \h </w:instrText>
+          <w:instrText xml:space="preserve"> PAGEREF _Toc244157797 \h </w:instrText>
         </w:r>
         <w:r>
           <w:rPr>
@@ -2945,7 +2945,7 @@
           <w:noProof/>
         </w:rPr>
       </w:pPr>
-      <w:hyperlink w:anchor="_Toc244069513" w:history="1">
+      <w:hyperlink w:anchor="_Toc244157798" w:history="1">
         <w:r>
           <w:rPr>
             <w:rStyle w:val="Lienhypertexte"/>
@@ -2972,7 +2972,7 @@
             <w:noProof/>
             <w:webHidden/>
           </w:rPr>
-          <w:instrText xml:space="preserve"> PAGEREF _Toc244069513 \h </w:instrText>
+          <w:instrText xml:space="preserve"> PAGEREF _Toc244157798 \h </w:instrText>
         </w:r>
         <w:r>
           <w:rPr>
@@ -3013,7 +3013,7 @@
           <w:noProof/>
         </w:rPr>
       </w:pPr>
-      <w:hyperlink w:anchor="_Toc244069514" w:history="1">
+      <w:hyperlink w:anchor="_Toc244157799" w:history="1">
         <w:r>
           <w:rPr>
             <w:rStyle w:val="Lienhypertexte"/>
@@ -3040,7 +3040,7 @@
             <w:noProof/>
             <w:webHidden/>
           </w:rPr>
-          <w:instrText xml:space="preserve"> PAGEREF _Toc244069514 \h </w:instrText>
+          <w:instrText xml:space="preserve"> PAGEREF _Toc244157799 \h </w:instrText>
         </w:r>
         <w:r>
           <w:rPr>
@@ -3081,7 +3081,7 @@
           <w:noProof/>
         </w:rPr>
       </w:pPr>
-      <w:hyperlink w:anchor="_Toc244069515" w:history="1">
+      <w:hyperlink w:anchor="_Toc244157800" w:history="1">
         <w:r>
           <w:rPr>
             <w:rStyle w:val="Lienhypertexte"/>
@@ -3108,7 +3108,7 @@
             <w:noProof/>
             <w:webHidden/>
           </w:rPr>
-          <w:instrText xml:space="preserve"> PAGEREF _Toc244069515 \h </w:instrText>
+          <w:instrText xml:space="preserve"> PAGEREF _Toc244157800 \h </w:instrText>
         </w:r>
         <w:r>
           <w:rPr>
@@ -3149,7 +3149,7 @@
           <w:noProof/>
         </w:rPr>
       </w:pPr>
-      <w:hyperlink w:anchor="_Toc244069516" w:history="1">
+      <w:hyperlink w:anchor="_Toc244157801" w:history="1">
         <w:r>
           <w:rPr>
             <w:rStyle w:val="Lienhypertexte"/>
@@ -3176,7 +3176,7 @@
             <w:noProof/>
             <w:webHidden/>
           </w:rPr>
-          <w:instrText xml:space="preserve"> PAGEREF _Toc244069516 \h </w:instrText>
+          <w:instrText xml:space="preserve"> PAGEREF _Toc244157801 \h </w:instrText>
         </w:r>
         <w:r>
           <w:rPr>
@@ -3233,7 +3233,7 @@
       <w:pPr>
         <w:pStyle w:val="Titre1"/>
       </w:pPr>
-      <w:bookmarkStart w:id="1" w:name="_Toc244069474"/>
+      <w:bookmarkStart w:id="1" w:name="_Toc244157759"/>
       <w:r>
         <w:t>Présentation</w:t>
       </w:r>
@@ -3292,7 +3292,7 @@
       <w:pPr>
         <w:pStyle w:val="Titre2"/>
       </w:pPr>
-      <w:bookmarkStart w:id="2" w:name="_Toc244069475"/>
+      <w:bookmarkStart w:id="2" w:name="_Toc244157760"/>
       <w:r>
         <w:t>Chaîne de calcul</w:t>
       </w:r>
@@ -3702,7 +3702,7 @@
       <w:pPr>
         <w:pStyle w:val="Titre2"/>
       </w:pPr>
-      <w:bookmarkStart w:id="3" w:name="_Toc244069476"/>
+      <w:bookmarkStart w:id="3" w:name="_Toc244157761"/>
       <w:r>
         <w:t>Ce que Meca3D calcule</w:t>
       </w:r>
@@ -3862,7 +3862,7 @@
       <w:pPr>
         <w:pStyle w:val="Titre2"/>
       </w:pPr>
-      <w:bookmarkStart w:id="4" w:name="_Toc244069477"/>
+      <w:bookmarkStart w:id="4" w:name="_Toc244157762"/>
       <w:r>
         <w:t>Public et contexte d'usage</w:t>
       </w:r>
@@ -3976,7 +3976,7 @@
       <w:pPr>
         <w:pStyle w:val="Titre1"/>
       </w:pPr>
-      <w:bookmarkStart w:id="5" w:name="_Toc244069478"/>
+      <w:bookmarkStart w:id="5" w:name="_Toc244157763"/>
       <w:r>
         <w:t>Installation</w:t>
       </w:r>
@@ -3986,7 +3986,7 @@
       <w:pPr>
         <w:pStyle w:val="Titre2"/>
       </w:pPr>
-      <w:bookmarkStart w:id="6" w:name="_Toc244069479"/>
+      <w:bookmarkStart w:id="6" w:name="_Toc244157764"/>
       <w:r>
         <w:t>Prérequis</w:t>
       </w:r>
@@ -4251,7 +4251,7 @@
       <w:pPr>
         <w:pStyle w:val="Titre2"/>
       </w:pPr>
-      <w:bookmarkStart w:id="7" w:name="_Toc244069480"/>
+      <w:bookmarkStart w:id="7" w:name="_Toc244157765"/>
       <w:r>
         <w:t>Installer l'exécutable</w:t>
       </w:r>
@@ -4505,7 +4505,7 @@
       <w:pPr>
         <w:pStyle w:val="Titre2"/>
       </w:pPr>
-      <w:bookmarkStart w:id="8" w:name="_Toc244069481"/>
+      <w:bookmarkStart w:id="8" w:name="_Toc244157766"/>
       <w:r>
         <w:t>Préparer SolidCraft</w:t>
       </w:r>
@@ -4738,7 +4738,7 @@
       <w:pPr>
         <w:pStyle w:val="Titre2"/>
       </w:pPr>
-      <w:bookmarkStart w:id="9" w:name="_Toc244069482"/>
+      <w:bookmarkStart w:id="9" w:name="_Toc244157767"/>
       <w:r>
         <w:t>Installation depuis les sources (enseignants, développeurs)</w:t>
       </w:r>
@@ -4838,7 +4838,7 @@
           <w:noProof/>
         </w:rPr>
         <w:drawing>
-          <wp:inline distT="0" distB="0" distL="0" distR="0" wp14:anchorId="59BCD264" wp14:editId="3BE02C88">
+          <wp:inline distT="0" distB="0" distL="0" distR="0" wp14:anchorId="6F68A823" wp14:editId="1D072919">
             <wp:extent cx="5976000" cy="50800"/>
             <wp:effectExtent l="0" t="0" r="0" b="0"/>
             <wp:docPr id="2" name="Picture 2"/>
@@ -4894,7 +4894,7 @@
       <w:pPr>
         <w:pStyle w:val="Titre1"/>
       </w:pPr>
-      <w:bookmarkStart w:id="10" w:name="_Toc244069483"/>
+      <w:bookmarkStart w:id="10" w:name="_Toc244157768"/>
       <w:r>
         <w:t>Prise en main en cinq minutes</w:t>
       </w:r>
@@ -4950,20 +4950,21 @@
         <w:rPr>
           <w:rFonts w:cs="Aptos"/>
         </w:rPr>
-        <w:t xml:space="preserve">Lancer Meca3D. S'il propose de lancer SolidCraft, répondre </w:t>
+        <w:t xml:space="preserve">Lancer Meca3D. Il démarre SolidCraft (s'il demande où se trouve </w:t>
+      </w:r>
+      <w:r>
+        <w:rPr>
+          <w:rFonts w:ascii="Cascadia Mono" w:eastAsia="Cascadia Mono" w:hAnsi="Cascadia Mono" w:cs="Cascadia Mono"/>
+          <w:color w:val="1B3A6B"/>
+          <w:sz w:val="19"/>
+        </w:rPr>
+        <w:t>solidcraft.exe</w:t>
       </w:r>
       <w:r>
         <w:rPr>
           <w:rFonts w:cs="Aptos"/>
-          <w:b/>
-        </w:rPr>
-        <w:t>Non</w:t>
-      </w:r>
-      <w:r>
-        <w:rPr>
-          <w:rFonts w:cs="Aptos"/>
-        </w:rPr>
-        <w:t xml:space="preserve"> pour cet essai.</w:t>
+        </w:rPr>
+        <w:t>, on peut annuler pour cet essai).</w:t>
       </w:r>
     </w:p>
     <w:p>
@@ -5015,7 +5016,7 @@
         <w:rPr>
           <w:rFonts w:cs="Aptos"/>
         </w:rPr>
-        <w:t xml:space="preserve">. Meca3D propose d'ouvrir la maquette dans SolidCraft : répondre </w:t>
+        <w:t xml:space="preserve">. Si SolidCraft est ouvert, la maquette s'y charge ; sinon, répondre </w:t>
       </w:r>
       <w:r>
         <w:rPr>
@@ -5028,7 +5029,7 @@
         <w:rPr>
           <w:rFonts w:cs="Aptos"/>
         </w:rPr>
-        <w:t xml:space="preserve"> ici aussi.</w:t>
+        <w:t xml:space="preserve"> à la proposition de le lancer.</w:t>
       </w:r>
     </w:p>
     <w:p>
@@ -5282,7 +5283,7 @@
           <w:noProof/>
         </w:rPr>
         <w:drawing>
-          <wp:inline distT="0" distB="0" distL="0" distR="0" wp14:anchorId="22192DF5" wp14:editId="3B04CD98">
+          <wp:inline distT="0" distB="0" distL="0" distR="0" wp14:anchorId="36C06A97" wp14:editId="0EC5F9C7">
             <wp:extent cx="5976000" cy="3548250"/>
             <wp:effectExtent l="0" t="0" r="0" b="0"/>
             <wp:docPr id="3" name="Picture 3"/>
@@ -5342,7 +5343,7 @@
           <w:noProof/>
         </w:rPr>
         <w:drawing>
-          <wp:inline distT="0" distB="0" distL="0" distR="0" wp14:anchorId="425025E6" wp14:editId="17CAAEB1">
+          <wp:inline distT="0" distB="0" distL="0" distR="0" wp14:anchorId="5C0BEF61" wp14:editId="50EB3CE5">
             <wp:extent cx="5976000" cy="3548250"/>
             <wp:effectExtent l="0" t="0" r="0" b="0"/>
             <wp:docPr id="4" name="Picture 4"/>
@@ -5400,7 +5401,7 @@
           <w:noProof/>
         </w:rPr>
         <w:drawing>
-          <wp:inline distT="0" distB="0" distL="0" distR="0" wp14:anchorId="559C7060" wp14:editId="6D8FF5EE">
+          <wp:inline distT="0" distB="0" distL="0" distR="0" wp14:anchorId="6B8C032B" wp14:editId="75626AA0">
             <wp:extent cx="5976000" cy="50800"/>
             <wp:effectExtent l="0" t="0" r="0" b="0"/>
             <wp:docPr id="5" name="Picture 5"/>
@@ -5456,7 +5457,7 @@
       <w:pPr>
         <w:pStyle w:val="Titre1"/>
       </w:pPr>
-      <w:bookmarkStart w:id="11" w:name="_Toc244069484"/>
+      <w:bookmarkStart w:id="11" w:name="_Toc244157769"/>
       <w:r>
         <w:t>L'interface</w:t>
       </w:r>
@@ -5804,7 +5805,7 @@
       <w:pPr>
         <w:pStyle w:val="Titre2"/>
       </w:pPr>
-      <w:bookmarkStart w:id="12" w:name="_Toc244069485"/>
+      <w:bookmarkStart w:id="12" w:name="_Toc244157770"/>
       <w:r>
         <w:t>L'arbre de l'étude</w:t>
       </w:r>
@@ -6109,7 +6110,7 @@
       <w:pPr>
         <w:pStyle w:val="Titre2"/>
       </w:pPr>
-      <w:bookmarkStart w:id="13" w:name="_Toc244069486"/>
+      <w:bookmarkStart w:id="13" w:name="_Toc244157771"/>
       <w:r>
         <w:t>Les menus</w:t>
       </w:r>
@@ -6221,7 +6222,7 @@
                 <w:rFonts w:cs="Aptos"/>
                 <w:sz w:val="20"/>
               </w:rPr>
-              <w:t>Nouvelle étude, Ouvrir une étude…, Enregistrer, Enregistrer sous…, Exporter les résultats en CSV…, Quitter</w:t>
+              <w:t>Nouvelle étude, Ouvrir une étude…, Études récentes, Enregistrer, Enregistrer sous…, Exporter les résultats en CSV…, Quitter</w:t>
             </w:r>
           </w:p>
         </w:tc>
@@ -6262,7 +6263,7 @@
                 <w:rFonts w:cs="Aptos"/>
                 <w:sz w:val="20"/>
               </w:rPr>
-              <w:t>Lancer SolidCraft, Ouvrir une maquette…, Connecter, Importer la maquette, Emplacement de SolidCraft…</w:t>
+              <w:t>Démarrer SolidCraft, Ouvrir une maquette…, Maquettes récentes, Connecter, Importer la maquette, Emplacement de SolidCraft…</w:t>
             </w:r>
           </w:p>
         </w:tc>
@@ -6359,7 +6360,7 @@
       <w:pPr>
         <w:pStyle w:val="Titre2"/>
       </w:pPr>
-      <w:bookmarkStart w:id="14" w:name="_Toc244069487"/>
+      <w:bookmarkStart w:id="14" w:name="_Toc244157772"/>
       <w:r>
         <w:t>Le journal</w:t>
       </w:r>
@@ -6395,7 +6396,7 @@
           <w:noProof/>
         </w:rPr>
         <w:drawing>
-          <wp:inline distT="0" distB="0" distL="0" distR="0" wp14:anchorId="46DA8A3F" wp14:editId="48F6642F">
+          <wp:inline distT="0" distB="0" distL="0" distR="0" wp14:anchorId="5BA16C71" wp14:editId="5ACA0FAE">
             <wp:extent cx="5976000" cy="50800"/>
             <wp:effectExtent l="0" t="0" r="0" b="0"/>
             <wp:docPr id="6" name="Picture 6"/>
@@ -6451,7 +6452,7 @@
       <w:pPr>
         <w:pStyle w:val="Titre1"/>
       </w:pPr>
-      <w:bookmarkStart w:id="15" w:name="_Toc244069488"/>
+      <w:bookmarkStart w:id="15" w:name="_Toc244157773"/>
       <w:r>
         <w:t>Conduire une étude complète</w:t>
       </w:r>
@@ -6469,7 +6470,7 @@
       <w:pPr>
         <w:pStyle w:val="Titre2"/>
       </w:pPr>
-      <w:bookmarkStart w:id="16" w:name="_Toc244069489"/>
+      <w:bookmarkStart w:id="16" w:name="_Toc244157774"/>
       <w:r>
         <w:t>5.1 Préparer la maquette dans SolidCraft</w:t>
       </w:r>
@@ -6658,7 +6659,7 @@
       <w:pPr>
         <w:pStyle w:val="Titre2"/>
       </w:pPr>
-      <w:bookmarkStart w:id="17" w:name="_Toc244069490"/>
+      <w:bookmarkStart w:id="17" w:name="_Toc244157775"/>
       <w:r>
         <w:t>5.2 Lancement, ouverture de la maquette et import</w:t>
       </w:r>
@@ -6669,14 +6670,14 @@
         <w:rPr>
           <w:rFonts w:cs="Aptos"/>
         </w:rPr>
-        <w:t xml:space="preserve">Au démarrage, Meca3D se connecte à SolidCraft s'il est déjà ouvert ; sinon, il propose de le lancer. </w:t>
+        <w:t xml:space="preserve">Au démarrage, Meca3D se connecte à SolidCraft s'il est déjà ouvert ; sinon, il le démarre. </w:t>
       </w:r>
       <w:r>
         <w:rPr>
           <w:rFonts w:cs="Aptos"/>
           <w:b/>
         </w:rPr>
-        <w:t>SolidCraft → Lancer SolidCraft</w:t>
+        <w:t>SolidCraft → Démarrer SolidCraft</w:t>
       </w:r>
       <w:r>
         <w:rPr>
@@ -6724,7 +6725,33 @@
         <w:rPr>
           <w:rFonts w:cs="Aptos"/>
         </w:rPr>
-        <w:t xml:space="preserve"> dans SolidCraft. Ouvrir la maquette par Meca3D a un avantage : Meca3D en retient le fichier, et l'étude importée le mémorise. À la réouverture de l'étude, Meca3D rouvre alors la maquette dans SolidCraft, en lançant SolidCraft au besoin. Le fichier est enregistré relativement au dossier de l'étude : un dossier contenant l'étude et sa maquette se copie d'un poste à l'autre sans réglage. Une étude dont la maquette est introuvable la cherche à côté du </w:t>
+        <w:t xml:space="preserve"> dans SolidCraft. </w:t>
+      </w:r>
+      <w:r>
+        <w:rPr>
+          <w:rFonts w:cs="Aptos"/>
+          <w:b/>
+        </w:rPr>
+        <w:t>Fichier → Études récentes</w:t>
+      </w:r>
+      <w:r>
+        <w:rPr>
+          <w:rFonts w:cs="Aptos"/>
+        </w:rPr>
+        <w:t xml:space="preserve"> et </w:t>
+      </w:r>
+      <w:r>
+        <w:rPr>
+          <w:rFonts w:cs="Aptos"/>
+          <w:b/>
+        </w:rPr>
+        <w:t>SolidCraft → Maquettes récentes</w:t>
+      </w:r>
+      <w:r>
+        <w:rPr>
+          <w:rFonts w:cs="Aptos"/>
+        </w:rPr>
+        <w:t xml:space="preserve"> rouvrent l'un des dix derniers fichiers utilisés. Ouvrir la maquette par Meca3D a un avantage : Meca3D en retient le fichier, et l'étude importée le mémorise. À la réouverture de l'étude, Meca3D rouvre alors la maquette dans SolidCraft, en lançant SolidCraft au besoin. Le fichier est enregistré relativement au dossier de l'étude : un dossier contenant l'étude et sa maquette se copie d'un poste à l'autre sans réglage. Une étude dont la maquette est introuvable la cherche à côté du </w:t>
       </w:r>
       <w:r>
         <w:rPr>
@@ -6868,7 +6895,7 @@
       <w:pPr>
         <w:pStyle w:val="Titre2"/>
       </w:pPr>
-      <w:bookmarkStart w:id="18" w:name="_Toc244069491"/>
+      <w:bookmarkStart w:id="18" w:name="_Toc244157776"/>
       <w:r>
         <w:t>5.3 Choisir et valider les liaisons</w:t>
       </w:r>
@@ -8072,7 +8099,7 @@
           <w:noProof/>
         </w:rPr>
         <w:drawing>
-          <wp:inline distT="0" distB="0" distL="0" distR="0" wp14:anchorId="2F6E3BFD" wp14:editId="33001561">
+          <wp:inline distT="0" distB="0" distL="0" distR="0" wp14:anchorId="14C85DE1" wp14:editId="65C64825">
             <wp:extent cx="5976000" cy="3548250"/>
             <wp:effectExtent l="0" t="0" r="0" b="0"/>
             <wp:docPr id="7" name="Picture 7"/>
@@ -8298,7 +8325,7 @@
       <w:pPr>
         <w:pStyle w:val="Titre2"/>
       </w:pPr>
-      <w:bookmarkStart w:id="19" w:name="_Toc244069492"/>
+      <w:bookmarkStart w:id="19" w:name="_Toc244157777"/>
       <w:r>
         <w:t>5.4 Graphe, mobilité et hyperstatisme</w:t>
       </w:r>
@@ -8370,7 +8397,7 @@
           <w:noProof/>
         </w:rPr>
         <w:drawing>
-          <wp:inline distT="0" distB="0" distL="0" distR="0" wp14:anchorId="2540F41F" wp14:editId="47E2007C">
+          <wp:inline distT="0" distB="0" distL="0" distR="0" wp14:anchorId="02CA9141" wp14:editId="30332DFA">
             <wp:extent cx="5976000" cy="3548250"/>
             <wp:effectExtent l="0" t="0" r="0" b="0"/>
             <wp:docPr id="8" name="Picture 8"/>
@@ -8574,7 +8601,7 @@
       <w:pPr>
         <w:pStyle w:val="Titre2"/>
       </w:pPr>
-      <w:bookmarkStart w:id="20" w:name="_Toc244069493"/>
+      <w:bookmarkStart w:id="20" w:name="_Toc244157778"/>
       <w:r>
         <w:t>5.5 Lois d'entrée (pilotes)</w:t>
       </w:r>
@@ -8969,7 +8996,7 @@
           <w:noProof/>
         </w:rPr>
         <w:drawing>
-          <wp:inline distT="0" distB="0" distL="0" distR="0" wp14:anchorId="443969DE" wp14:editId="699F34CD">
+          <wp:inline distT="0" distB="0" distL="0" distR="0" wp14:anchorId="36778E9D" wp14:editId="23A6EFC2">
             <wp:extent cx="5976000" cy="3548250"/>
             <wp:effectExtent l="0" t="0" r="0" b="0"/>
             <wp:docPr id="9" name="Picture 9"/>
@@ -9022,7 +9049,7 @@
       <w:pPr>
         <w:pStyle w:val="Titre2"/>
       </w:pPr>
-      <w:bookmarkStart w:id="21" w:name="_Toc244069494"/>
+      <w:bookmarkStart w:id="21" w:name="_Toc244157779"/>
       <w:r>
         <w:t>5.6 Pesanteur, actions et ressorts</w:t>
       </w:r>
@@ -9160,7 +9187,7 @@
       <w:pPr>
         <w:pStyle w:val="Titre2"/>
       </w:pPr>
-      <w:bookmarkStart w:id="22" w:name="_Toc244069495"/>
+      <w:bookmarkStart w:id="22" w:name="_Toc244157780"/>
       <w:r>
         <w:t>5.7 Capteurs</w:t>
       </w:r>
@@ -9400,7 +9427,7 @@
           <w:noProof/>
         </w:rPr>
         <w:drawing>
-          <wp:inline distT="0" distB="0" distL="0" distR="0" wp14:anchorId="1BB97D6F" wp14:editId="360DC073">
+          <wp:inline distT="0" distB="0" distL="0" distR="0" wp14:anchorId="5648AD55" wp14:editId="3D2E7723">
             <wp:extent cx="5976000" cy="3548250"/>
             <wp:effectExtent l="0" t="0" r="0" b="0"/>
             <wp:docPr id="10" name="Picture 10"/>
@@ -9453,7 +9480,7 @@
       <w:pPr>
         <w:pStyle w:val="Titre2"/>
       </w:pPr>
-      <w:bookmarkStart w:id="23" w:name="_Toc244069496"/>
+      <w:bookmarkStart w:id="23" w:name="_Toc244157781"/>
       <w:r>
         <w:t>5.8 Simuler</w:t>
       </w:r>
@@ -9765,7 +9792,7 @@
       <w:pPr>
         <w:pStyle w:val="Titre2"/>
       </w:pPr>
-      <w:bookmarkStart w:id="24" w:name="_Toc244069497"/>
+      <w:bookmarkStart w:id="24" w:name="_Toc244157782"/>
       <w:r>
         <w:t>5.9 Exploiter les résultats</w:t>
       </w:r>
@@ -9811,7 +9838,7 @@
           <w:noProof/>
         </w:rPr>
         <w:drawing>
-          <wp:inline distT="0" distB="0" distL="0" distR="0" wp14:anchorId="489CCD4D" wp14:editId="427CCE6D">
+          <wp:inline distT="0" distB="0" distL="0" distR="0" wp14:anchorId="3A9D4AB7" wp14:editId="3F480F85">
             <wp:extent cx="5976000" cy="3548250"/>
             <wp:effectExtent l="0" t="0" r="0" b="0"/>
             <wp:docPr id="11" name="Picture 11"/>
@@ -9900,7 +9927,7 @@
           <w:noProof/>
         </w:rPr>
         <w:drawing>
-          <wp:inline distT="0" distB="0" distL="0" distR="0" wp14:anchorId="49080211" wp14:editId="5344112E">
+          <wp:inline distT="0" distB="0" distL="0" distR="0" wp14:anchorId="4A882E44" wp14:editId="6563D572">
             <wp:extent cx="5976000" cy="3548250"/>
             <wp:effectExtent l="0" t="0" r="0" b="0"/>
             <wp:docPr id="12" name="Picture 12"/>
@@ -10068,7 +10095,7 @@
           <w:noProof/>
         </w:rPr>
         <w:drawing>
-          <wp:inline distT="0" distB="0" distL="0" distR="0" wp14:anchorId="7553E4BB" wp14:editId="2E7ABDAA">
+          <wp:inline distT="0" distB="0" distL="0" distR="0" wp14:anchorId="42006216" wp14:editId="23BFC082">
             <wp:extent cx="5976000" cy="3548250"/>
             <wp:effectExtent l="0" t="0" r="0" b="0"/>
             <wp:docPr id="13" name="Picture 13"/>
@@ -10121,7 +10148,7 @@
       <w:pPr>
         <w:pStyle w:val="Titre2"/>
       </w:pPr>
-      <w:bookmarkStart w:id="25" w:name="_Toc244069498"/>
+      <w:bookmarkStart w:id="25" w:name="_Toc244157783"/>
       <w:r>
         <w:t>5.10 Enregistrer l'étude</w:t>
       </w:r>
@@ -10165,7 +10192,7 @@
           <w:noProof/>
         </w:rPr>
         <w:drawing>
-          <wp:inline distT="0" distB="0" distL="0" distR="0" wp14:anchorId="35CAF39B" wp14:editId="45F05AC6">
+          <wp:inline distT="0" distB="0" distL="0" distR="0" wp14:anchorId="0E48FEE4" wp14:editId="21672521">
             <wp:extent cx="5976000" cy="50800"/>
             <wp:effectExtent l="0" t="0" r="0" b="0"/>
             <wp:docPr id="14" name="Picture 14"/>
@@ -10221,7 +10248,7 @@
       <w:pPr>
         <w:pStyle w:val="Titre1"/>
       </w:pPr>
-      <w:bookmarkStart w:id="26" w:name="_Toc244069499"/>
+      <w:bookmarkStart w:id="26" w:name="_Toc244157784"/>
       <w:r>
         <w:t>Les exemples fournis</w:t>
       </w:r>
@@ -10889,7 +10916,7 @@
       <w:pPr>
         <w:pStyle w:val="Titre2"/>
       </w:pPr>
-      <w:bookmarkStart w:id="27" w:name="_Toc244069500"/>
+      <w:bookmarkStart w:id="27" w:name="_Toc244157785"/>
       <w:r>
         <w:t>Bielle-manivelle</w:t>
       </w:r>
@@ -10915,7 +10942,7 @@
       <w:pPr>
         <w:pStyle w:val="Titre2"/>
       </w:pPr>
-      <w:bookmarkStart w:id="28" w:name="_Toc244069501"/>
+      <w:bookmarkStart w:id="28" w:name="_Toc244157786"/>
       <w:r>
         <w:t>Pendule simple</w:t>
       </w:r>
@@ -10933,7 +10960,7 @@
       <w:pPr>
         <w:pStyle w:val="Titre2"/>
       </w:pPr>
-      <w:bookmarkStart w:id="29" w:name="_Toc244069502"/>
+      <w:bookmarkStart w:id="29" w:name="_Toc244157787"/>
       <w:r>
         <w:t>Pendule double</w:t>
       </w:r>
@@ -10951,7 +10978,7 @@
       <w:pPr>
         <w:pStyle w:val="Titre2"/>
       </w:pPr>
-      <w:bookmarkStart w:id="30" w:name="_Toc244069503"/>
+      <w:bookmarkStart w:id="30" w:name="_Toc244157788"/>
       <w:r>
         <w:t>Réducteur à engrenage</w:t>
       </w:r>
@@ -10968,7 +10995,7 @@
           <w:noProof/>
         </w:rPr>
         <w:drawing>
-          <wp:inline distT="0" distB="0" distL="0" distR="0" wp14:anchorId="30D73320" wp14:editId="4AD11A42">
+          <wp:inline distT="0" distB="0" distL="0" distR="0" wp14:anchorId="0D083497" wp14:editId="0ED630EB">
             <wp:extent cx="5976000" cy="3548250"/>
             <wp:effectExtent l="0" t="0" r="0" b="0"/>
             <wp:docPr id="15" name="Picture 15"/>
@@ -11029,7 +11056,7 @@
       <w:pPr>
         <w:pStyle w:val="Titre2"/>
       </w:pPr>
-      <w:bookmarkStart w:id="31" w:name="_Toc244069504"/>
+      <w:bookmarkStart w:id="31" w:name="_Toc244157789"/>
       <w:r>
         <w:t>Système vis-écrou</w:t>
       </w:r>
@@ -11052,7 +11079,7 @@
           <w:noProof/>
         </w:rPr>
         <w:drawing>
-          <wp:inline distT="0" distB="0" distL="0" distR="0" wp14:anchorId="52E92254" wp14:editId="54D6CDE0">
+          <wp:inline distT="0" distB="0" distL="0" distR="0" wp14:anchorId="4A1F535B" wp14:editId="2ECD9570">
             <wp:extent cx="5976000" cy="50800"/>
             <wp:effectExtent l="0" t="0" r="0" b="0"/>
             <wp:docPr id="16" name="Picture 16"/>
@@ -11108,7 +11135,7 @@
       <w:pPr>
         <w:pStyle w:val="Titre1"/>
       </w:pPr>
-      <w:bookmarkStart w:id="32" w:name="_Toc244069505"/>
+      <w:bookmarkStart w:id="32" w:name="_Toc244157790"/>
       <w:r>
         <w:t>Conventions</w:t>
       </w:r>
@@ -11535,7 +11562,7 @@
           <w:noProof/>
         </w:rPr>
         <w:drawing>
-          <wp:inline distT="0" distB="0" distL="0" distR="0" wp14:anchorId="4FA4F0A7" wp14:editId="05B10E30">
+          <wp:inline distT="0" distB="0" distL="0" distR="0" wp14:anchorId="1FEAB930" wp14:editId="0ACF3591">
             <wp:extent cx="5976000" cy="50800"/>
             <wp:effectExtent l="0" t="0" r="0" b="0"/>
             <wp:docPr id="17" name="Picture 17"/>
@@ -11591,7 +11618,7 @@
       <w:pPr>
         <w:pStyle w:val="Titre1"/>
       </w:pPr>
-      <w:bookmarkStart w:id="33" w:name="_Toc244069506"/>
+      <w:bookmarkStart w:id="33" w:name="_Toc244157791"/>
       <w:r>
         <w:t>Usage enseignant</w:t>
       </w:r>
@@ -11831,7 +11858,7 @@
       <w:pPr>
         <w:pStyle w:val="Titre2"/>
       </w:pPr>
-      <w:bookmarkStart w:id="34" w:name="_Toc244069507"/>
+      <w:bookmarkStart w:id="34" w:name="_Toc244157792"/>
       <w:r>
         <w:t>Pistes pédagogiques</w:t>
       </w:r>
@@ -11971,7 +11998,7 @@
           <w:noProof/>
         </w:rPr>
         <w:drawing>
-          <wp:inline distT="0" distB="0" distL="0" distR="0" wp14:anchorId="747A00E8" wp14:editId="0781AA56">
+          <wp:inline distT="0" distB="0" distL="0" distR="0" wp14:anchorId="4A46A7F5" wp14:editId="13A64942">
             <wp:extent cx="5976000" cy="50800"/>
             <wp:effectExtent l="0" t="0" r="0" b="0"/>
             <wp:docPr id="18" name="Picture 18"/>
@@ -12027,7 +12054,7 @@
       <w:pPr>
         <w:pStyle w:val="Titre1"/>
       </w:pPr>
-      <w:bookmarkStart w:id="35" w:name="_Toc244069508"/>
+      <w:bookmarkStart w:id="35" w:name="_Toc244157793"/>
       <w:r>
         <w:t>Ligne de commande</w:t>
       </w:r>
@@ -12339,7 +12366,7 @@
           <w:noProof/>
         </w:rPr>
         <w:drawing>
-          <wp:inline distT="0" distB="0" distL="0" distR="0" wp14:anchorId="14706802" wp14:editId="3752C222">
+          <wp:inline distT="0" distB="0" distL="0" distR="0" wp14:anchorId="6D5527FD" wp14:editId="76EC0BE5">
             <wp:extent cx="5976000" cy="50800"/>
             <wp:effectExtent l="0" t="0" r="0" b="0"/>
             <wp:docPr id="19" name="Picture 19"/>
@@ -12395,7 +12422,7 @@
       <w:pPr>
         <w:pStyle w:val="Titre1"/>
       </w:pPr>
-      <w:bookmarkStart w:id="36" w:name="_Toc244069509"/>
+      <w:bookmarkStart w:id="36" w:name="_Toc244157794"/>
       <w:r>
         <w:t>Messages et dépannage</w:t>
       </w:r>
@@ -12507,7 +12534,7 @@
                 <w:rFonts w:cs="Aptos"/>
                 <w:sz w:val="20"/>
               </w:rPr>
-              <w:t xml:space="preserve">SolidCraft → Lancer SolidCraft. S'il a été ouvert à la main avec un port imposé, vérifier </w:t>
+              <w:t xml:space="preserve">SolidCraft → Démarrer SolidCraft. S'il a été ouvert à la main avec un port imposé, vérifier </w:t>
             </w:r>
             <w:r>
               <w:rPr>
@@ -13141,7 +13168,7 @@
           <w:noProof/>
         </w:rPr>
         <w:drawing>
-          <wp:inline distT="0" distB="0" distL="0" distR="0" wp14:anchorId="7CEE6F09" wp14:editId="6226A08E">
+          <wp:inline distT="0" distB="0" distL="0" distR="0" wp14:anchorId="58913B1D" wp14:editId="5695A92A">
             <wp:extent cx="5976000" cy="50800"/>
             <wp:effectExtent l="0" t="0" r="0" b="0"/>
             <wp:docPr id="20" name="Picture 20"/>
@@ -13197,7 +13224,7 @@
       <w:pPr>
         <w:pStyle w:val="Titre1"/>
       </w:pPr>
-      <w:bookmarkStart w:id="37" w:name="_Toc244069510"/>
+      <w:bookmarkStart w:id="37" w:name="_Toc244157795"/>
       <w:r>
         <w:t>Limites de la version 0.1.0</w:t>
       </w:r>
@@ -13207,7 +13234,7 @@
       <w:pPr>
         <w:pStyle w:val="Titre2"/>
       </w:pPr>
-      <w:bookmarkStart w:id="38" w:name="_Toc244069511"/>
+      <w:bookmarkStart w:id="38" w:name="_Toc244157796"/>
       <w:r>
         <w:t>Hors périmètre</w:t>
       </w:r>
@@ -13289,7 +13316,7 @@
       <w:pPr>
         <w:pStyle w:val="Titre2"/>
       </w:pPr>
-      <w:bookmarkStart w:id="39" w:name="_Toc244069512"/>
+      <w:bookmarkStart w:id="39" w:name="_Toc244157797"/>
       <w:r>
         <w:t>Réglages</w:t>
       </w:r>
@@ -13321,7 +13348,7 @@
       <w:pPr>
         <w:pStyle w:val="Titre2"/>
       </w:pPr>
-      <w:bookmarkStart w:id="40" w:name="_Toc244069513"/>
+      <w:bookmarkStart w:id="40" w:name="_Toc244157798"/>
       <w:r>
         <w:t>Distribution</w:t>
       </w:r>
@@ -13360,7 +13387,7 @@
           <w:noProof/>
         </w:rPr>
         <w:drawing>
-          <wp:inline distT="0" distB="0" distL="0" distR="0" wp14:anchorId="7EEA6430" wp14:editId="01128844">
+          <wp:inline distT="0" distB="0" distL="0" distR="0" wp14:anchorId="4687A419" wp14:editId="5CAF25E0">
             <wp:extent cx="5976000" cy="50800"/>
             <wp:effectExtent l="0" t="0" r="0" b="0"/>
             <wp:docPr id="21" name="Picture 21"/>
@@ -13416,7 +13443,7 @@
       <w:pPr>
         <w:pStyle w:val="Titre1"/>
       </w:pPr>
-      <w:bookmarkStart w:id="41" w:name="_Toc244069514"/>
+      <w:bookmarkStart w:id="41" w:name="_Toc244157799"/>
       <w:r>
         <w:t>Annexe A — Glossaire</w:t>
       </w:r>
@@ -13969,7 +13996,7 @@
       <w:pPr>
         <w:pStyle w:val="Titre1"/>
       </w:pPr>
-      <w:bookmarkStart w:id="42" w:name="_Toc244069515"/>
+      <w:bookmarkStart w:id="42" w:name="_Toc244157800"/>
       <w:r>
         <w:t>Annexe B — Le fichier d'étude</w:t>
       </w:r>
@@ -14878,7 +14905,7 @@
       <w:pPr>
         <w:pStyle w:val="Titre1"/>
       </w:pPr>
-      <w:bookmarkStart w:id="43" w:name="_Toc244069516"/>
+      <w:bookmarkStart w:id="43" w:name="_Toc244157801"/>
       <w:r>
         <w:t>Annexe C — Références et licence</w:t>
       </w:r>
@@ -15002,7 +15029,7 @@
           <w:noProof/>
         </w:rPr>
         <w:drawing>
-          <wp:inline distT="0" distB="0" distL="0" distR="0" wp14:anchorId="3F0251E0" wp14:editId="570BC88E">
+          <wp:inline distT="0" distB="0" distL="0" distR="0" wp14:anchorId="464CF790" wp14:editId="11C22C74">
             <wp:extent cx="5976000" cy="50800"/>
             <wp:effectExtent l="0" t="0" r="0" b="0"/>
             <wp:docPr id="22" name="Picture 22"/>
@@ -15269,10 +15296,10 @@
               <w:noProof/>
             </w:rPr>
             <w:drawing>
-              <wp:inline distT="0" distB="0" distL="0" distR="0" wp14:anchorId="797CCA3C" wp14:editId="43676851">
+              <wp:inline distT="0" distB="0" distL="0" distR="0" wp14:anchorId="07D8B708" wp14:editId="1FF26C19">
                 <wp:extent cx="1512000" cy="432000"/>
                 <wp:effectExtent l="0" t="0" r="0" b="0"/>
-                <wp:docPr id="1728730870" name="Picture 1"/>
+                <wp:docPr id="1392935125" name="Picture 1"/>
                 <wp:cNvGraphicFramePr>
                   <a:graphicFrameLocks xmlns:a="http://schemas.openxmlformats.org/drawingml/2006/main" noChangeAspect="1"/>
                 </wp:cNvGraphicFramePr>
@@ -15520,31 +15547,31 @@
       </w:rPr>
     </w:lvl>
   </w:abstractNum>
-  <w:num w:numId="1" w16cid:durableId="1357542213">
+  <w:num w:numId="1" w16cid:durableId="753085197">
     <w:abstractNumId w:val="8"/>
   </w:num>
-  <w:num w:numId="2" w16cid:durableId="376053060">
+  <w:num w:numId="2" w16cid:durableId="1280456839">
     <w:abstractNumId w:val="6"/>
   </w:num>
-  <w:num w:numId="3" w16cid:durableId="1356535769">
+  <w:num w:numId="3" w16cid:durableId="611785807">
     <w:abstractNumId w:val="5"/>
   </w:num>
-  <w:num w:numId="4" w16cid:durableId="1500343710">
+  <w:num w:numId="4" w16cid:durableId="944196543">
     <w:abstractNumId w:val="4"/>
   </w:num>
-  <w:num w:numId="5" w16cid:durableId="1085230123">
+  <w:num w:numId="5" w16cid:durableId="1597864073">
     <w:abstractNumId w:val="7"/>
   </w:num>
-  <w:num w:numId="6" w16cid:durableId="1061053929">
+  <w:num w:numId="6" w16cid:durableId="31808454">
     <w:abstractNumId w:val="3"/>
   </w:num>
-  <w:num w:numId="7" w16cid:durableId="1373728209">
+  <w:num w:numId="7" w16cid:durableId="564685469">
     <w:abstractNumId w:val="2"/>
   </w:num>
-  <w:num w:numId="8" w16cid:durableId="1679045156">
+  <w:num w:numId="8" w16cid:durableId="648872016">
     <w:abstractNumId w:val="1"/>
   </w:num>
-  <w:num w:numId="9" w16cid:durableId="1134716835">
+  <w:num w:numId="9" w16cid:durableId="1284069763">
     <w:abstractNumId w:val="0"/>
   </w:num>
 </w:numbering>
@@ -26936,7 +26963,7 @@
     <w:autoRedefine/>
     <w:uiPriority w:val="39"/>
     <w:unhideWhenUsed/>
-    <w:rsid w:val="007827AD"/>
+    <w:rsid w:val="00C339AF"/>
     <w:pPr>
       <w:spacing w:after="100"/>
     </w:pPr>
@@ -26948,7 +26975,7 @@
     <w:autoRedefine/>
     <w:uiPriority w:val="39"/>
     <w:unhideWhenUsed/>
-    <w:rsid w:val="007827AD"/>
+    <w:rsid w:val="00C339AF"/>
     <w:pPr>
       <w:spacing w:after="100"/>
       <w:ind w:left="220"/>
@@ -26959,7 +26986,7 @@
     <w:basedOn w:val="Policepardfaut"/>
     <w:uiPriority w:val="99"/>
     <w:unhideWhenUsed/>
-    <w:rsid w:val="007827AD"/>
+    <w:rsid w:val="00C339AF"/>
     <w:rPr>
       <w:color w:val="0000FF" w:themeColor="hyperlink"/>
       <w:u w:val="single"/>

</xml_diff>